<commit_message>
Atualização do readme 16/12/25
</commit_message>
<xml_diff>
--- a/Network_Validation/Documentação de testes.docx
+++ b/Network_Validation/Documentação de testes.docx
@@ -59,23 +59,21 @@
           <w:b/>
           <w:bCs/>
         </w:rPr>
-        <w:t xml:space="preserve">alidação inicial da Vision </w:t>
-      </w:r>
-      <w:proofErr w:type="spellStart"/>
-      <w:r>
-        <w:rPr>
-          <w:b/>
-          <w:bCs/>
-        </w:rPr>
-        <w:t>Transformer</w:t>
-      </w:r>
-      <w:proofErr w:type="spellEnd"/>
+        <w:t>alidação inicial da Vision Transformer</w:t>
+      </w:r>
       <w:r>
         <w:rPr>
           <w:b/>
           <w:bCs/>
         </w:rPr>
         <w:t xml:space="preserve"> (Falha)</w:t>
+      </w:r>
+      <w:r>
+        <w:rPr>
+          <w:b/>
+          <w:bCs/>
+        </w:rPr>
+        <w:t xml:space="preserve"> – 16/12/2025</w:t>
       </w:r>
       <w:r>
         <w:rPr>
@@ -129,31 +127,7 @@
         <w:jc w:val="both"/>
       </w:pPr>
       <w:r>
-        <w:t xml:space="preserve">Foram feitas modificações para implementar puramente a Vision </w:t>
-      </w:r>
-      <w:proofErr w:type="spellStart"/>
-      <w:r>
-        <w:t>Transformer</w:t>
-      </w:r>
-      <w:proofErr w:type="spellEnd"/>
-      <w:r>
-        <w:t xml:space="preserve"> (retirando qualquer </w:t>
-      </w:r>
-      <w:proofErr w:type="spellStart"/>
-      <w:r>
-        <w:t>resquíscio</w:t>
-      </w:r>
-      <w:proofErr w:type="spellEnd"/>
-      <w:r>
-        <w:t xml:space="preserve"> de outras arquiteturas), contudo, a estrutura do modelo foi mantida inalterada (inclusive para manter compatibilidade com os pesos </w:t>
-      </w:r>
-      <w:proofErr w:type="spellStart"/>
-      <w:r>
-        <w:t>pré</w:t>
-      </w:r>
-      <w:proofErr w:type="spellEnd"/>
-      <w:r>
-        <w:t>-treinados).</w:t>
+        <w:t>Foram feitas modificações para implementar puramente a Vision Transformer (retirando qualquer resquíscio de outras arquiteturas), contudo, a estrutura do modelo foi mantida inalterada (inclusive para manter compatibilidade com os pesos pré-treinados).</w:t>
       </w:r>
     </w:p>
     <w:p>
@@ -166,15 +140,7 @@
         <w:jc w:val="both"/>
       </w:pPr>
       <w:r>
-        <w:t xml:space="preserve">Pesos </w:t>
-      </w:r>
-      <w:proofErr w:type="spellStart"/>
-      <w:r>
-        <w:t>pré</w:t>
-      </w:r>
-      <w:proofErr w:type="spellEnd"/>
-      <w:r>
-        <w:t xml:space="preserve">-treinados com a ImageNet-21K também foram retirados do repositório oficial: </w:t>
+        <w:t xml:space="preserve">Pesos pré-treinados com a ImageNet-21K também foram retirados do repositório oficial: </w:t>
       </w:r>
       <w:hyperlink r:id="rId6" w:history="1">
         <w:r>
@@ -217,32 +183,19 @@
           <w:b/>
           <w:bCs/>
         </w:rPr>
-        <w:t>Parâmetros de treinamento de fine-</w:t>
-      </w:r>
-      <w:proofErr w:type="spellStart"/>
-      <w:r>
-        <w:rPr>
-          <w:b/>
-          <w:bCs/>
-        </w:rPr>
-        <w:t>tunning</w:t>
-      </w:r>
-      <w:proofErr w:type="spellEnd"/>
-      <w:r>
-        <w:rPr>
-          <w:b/>
-          <w:bCs/>
-        </w:rPr>
-        <w:t>:</w:t>
-      </w:r>
-    </w:p>
-    <w:p>
-      <w:pPr>
-        <w:pStyle w:val="PargrafodaLista"/>
-        <w:ind w:left="1440"/>
-        <w:jc w:val="both"/>
-      </w:pPr>
-      <w:r>
+        <w:t>Parâmetros de treinamento de fine-tunning:</w:t>
+      </w:r>
+    </w:p>
+    <w:p>
+      <w:pPr>
+        <w:pStyle w:val="PargrafodaLista"/>
+        <w:ind w:left="1440"/>
+        <w:jc w:val="both"/>
+      </w:pPr>
+      <w:r>
+        <w:rPr>
+          <w:noProof/>
+        </w:rPr>
         <w:drawing>
           <wp:inline distT="0" distB="0" distL="0" distR="0" wp14:anchorId="2C8C8990" wp14:editId="4EEEDEA8">
             <wp:extent cx="3677920" cy="2758440"/>
@@ -336,792 +289,272 @@
         <w:jc w:val="both"/>
       </w:pPr>
       <w:r>
-        <w:t xml:space="preserve">[004000/10000] </w:t>
-      </w:r>
-      <w:proofErr w:type="spellStart"/>
-      <w:r>
-        <w:t>loss</w:t>
-      </w:r>
-      <w:proofErr w:type="spellEnd"/>
-      <w:r>
-        <w:t xml:space="preserve">=2.1354, </w:t>
-      </w:r>
-      <w:proofErr w:type="spellStart"/>
-      <w:r>
-        <w:t>acc</w:t>
-      </w:r>
-      <w:proofErr w:type="spellEnd"/>
-      <w:r>
-        <w:t>=0.5625</w:t>
-      </w:r>
-    </w:p>
-    <w:p>
-      <w:pPr>
-        <w:pStyle w:val="PargrafodaLista"/>
-        <w:ind w:left="1440"/>
-        <w:jc w:val="both"/>
-      </w:pPr>
-      <w:r>
-        <w:t xml:space="preserve">[004100/10000] </w:t>
-      </w:r>
-      <w:proofErr w:type="spellStart"/>
-      <w:r>
-        <w:t>loss</w:t>
-      </w:r>
-      <w:proofErr w:type="spellEnd"/>
-      <w:r>
-        <w:t xml:space="preserve">=1.7008, </w:t>
-      </w:r>
-      <w:proofErr w:type="spellStart"/>
-      <w:r>
-        <w:t>acc</w:t>
-      </w:r>
-      <w:proofErr w:type="spellEnd"/>
-      <w:r>
-        <w:t>=0.6250</w:t>
-      </w:r>
-    </w:p>
-    <w:p>
-      <w:pPr>
-        <w:pStyle w:val="PargrafodaLista"/>
-        <w:ind w:left="1440"/>
-        <w:jc w:val="both"/>
-      </w:pPr>
-      <w:r>
-        <w:t xml:space="preserve">[004200/10000] </w:t>
-      </w:r>
-      <w:proofErr w:type="spellStart"/>
-      <w:r>
-        <w:t>loss</w:t>
-      </w:r>
-      <w:proofErr w:type="spellEnd"/>
-      <w:r>
-        <w:t xml:space="preserve">=1.7804, </w:t>
-      </w:r>
-      <w:proofErr w:type="spellStart"/>
-      <w:r>
-        <w:t>acc</w:t>
-      </w:r>
-      <w:proofErr w:type="spellEnd"/>
-      <w:r>
-        <w:t>=0.6250</w:t>
-      </w:r>
-    </w:p>
-    <w:p>
-      <w:pPr>
-        <w:pStyle w:val="PargrafodaLista"/>
-        <w:ind w:left="1440"/>
-        <w:jc w:val="both"/>
-      </w:pPr>
-      <w:r>
-        <w:t xml:space="preserve">[004300/10000] </w:t>
-      </w:r>
-      <w:proofErr w:type="spellStart"/>
-      <w:r>
-        <w:t>loss</w:t>
-      </w:r>
-      <w:proofErr w:type="spellEnd"/>
-      <w:r>
-        <w:t xml:space="preserve">=2.0371, </w:t>
-      </w:r>
-      <w:proofErr w:type="spellStart"/>
-      <w:r>
-        <w:t>acc</w:t>
-      </w:r>
-      <w:proofErr w:type="spellEnd"/>
-      <w:r>
-        <w:t>=0.5000</w:t>
-      </w:r>
-    </w:p>
-    <w:p>
-      <w:pPr>
-        <w:pStyle w:val="PargrafodaLista"/>
-        <w:ind w:left="1440"/>
-        <w:jc w:val="both"/>
-      </w:pPr>
-      <w:r>
-        <w:t xml:space="preserve">[004400/10000] </w:t>
-      </w:r>
-      <w:proofErr w:type="spellStart"/>
-      <w:r>
-        <w:t>loss</w:t>
-      </w:r>
-      <w:proofErr w:type="spellEnd"/>
-      <w:r>
-        <w:t xml:space="preserve">=1.8406, </w:t>
-      </w:r>
-      <w:proofErr w:type="spellStart"/>
-      <w:r>
-        <w:t>acc</w:t>
-      </w:r>
-      <w:proofErr w:type="spellEnd"/>
-      <w:r>
-        <w:t>=0.5625</w:t>
-      </w:r>
-    </w:p>
-    <w:p>
-      <w:pPr>
-        <w:pStyle w:val="PargrafodaLista"/>
-        <w:ind w:left="1440"/>
-        <w:jc w:val="both"/>
-      </w:pPr>
-      <w:r>
-        <w:t xml:space="preserve">[004500/10000] </w:t>
-      </w:r>
-      <w:proofErr w:type="spellStart"/>
-      <w:r>
-        <w:t>loss</w:t>
-      </w:r>
-      <w:proofErr w:type="spellEnd"/>
-      <w:r>
-        <w:t xml:space="preserve">=2.4649, </w:t>
-      </w:r>
-      <w:proofErr w:type="spellStart"/>
-      <w:r>
-        <w:t>acc</w:t>
-      </w:r>
-      <w:proofErr w:type="spellEnd"/>
-      <w:r>
-        <w:t>=0.4375</w:t>
-      </w:r>
-    </w:p>
-    <w:p>
-      <w:pPr>
-        <w:pStyle w:val="PargrafodaLista"/>
-        <w:ind w:left="1440"/>
-        <w:jc w:val="both"/>
-      </w:pPr>
-      <w:r>
-        <w:t xml:space="preserve">[004600/10000] </w:t>
-      </w:r>
-      <w:proofErr w:type="spellStart"/>
-      <w:r>
-        <w:t>loss</w:t>
-      </w:r>
-      <w:proofErr w:type="spellEnd"/>
-      <w:r>
-        <w:t xml:space="preserve">=1.9976, </w:t>
-      </w:r>
-      <w:proofErr w:type="spellStart"/>
-      <w:r>
-        <w:t>acc</w:t>
-      </w:r>
-      <w:proofErr w:type="spellEnd"/>
-      <w:r>
-        <w:t>=0.5625</w:t>
-      </w:r>
-    </w:p>
-    <w:p>
-      <w:pPr>
-        <w:pStyle w:val="PargrafodaLista"/>
-        <w:ind w:left="1440"/>
-        <w:jc w:val="both"/>
-      </w:pPr>
-      <w:r>
-        <w:t xml:space="preserve">[004700/10000] </w:t>
-      </w:r>
-      <w:proofErr w:type="spellStart"/>
-      <w:r>
-        <w:t>loss</w:t>
-      </w:r>
-      <w:proofErr w:type="spellEnd"/>
-      <w:r>
-        <w:t xml:space="preserve">=1.6713, </w:t>
-      </w:r>
-      <w:proofErr w:type="spellStart"/>
-      <w:r>
-        <w:t>acc</w:t>
-      </w:r>
-      <w:proofErr w:type="spellEnd"/>
-      <w:r>
-        <w:t>=0.5625</w:t>
-      </w:r>
-    </w:p>
-    <w:p>
-      <w:pPr>
-        <w:pStyle w:val="PargrafodaLista"/>
-        <w:ind w:left="1440"/>
-        <w:jc w:val="both"/>
-      </w:pPr>
-      <w:r>
-        <w:t xml:space="preserve">[004800/10000] </w:t>
-      </w:r>
-      <w:proofErr w:type="spellStart"/>
-      <w:r>
-        <w:t>loss</w:t>
-      </w:r>
-      <w:proofErr w:type="spellEnd"/>
-      <w:r>
-        <w:t xml:space="preserve">=1.9858, </w:t>
-      </w:r>
-      <w:proofErr w:type="spellStart"/>
-      <w:r>
-        <w:t>acc</w:t>
-      </w:r>
-      <w:proofErr w:type="spellEnd"/>
-      <w:r>
-        <w:t>=0.5625</w:t>
-      </w:r>
-    </w:p>
-    <w:p>
-      <w:pPr>
-        <w:pStyle w:val="PargrafodaLista"/>
-        <w:ind w:left="1440"/>
-        <w:jc w:val="both"/>
-      </w:pPr>
-      <w:r>
-        <w:t xml:space="preserve">[004900/10000] </w:t>
-      </w:r>
-      <w:proofErr w:type="spellStart"/>
-      <w:r>
-        <w:t>loss</w:t>
-      </w:r>
-      <w:proofErr w:type="spellEnd"/>
-      <w:r>
-        <w:t xml:space="preserve">=0.6557, </w:t>
-      </w:r>
-      <w:proofErr w:type="spellStart"/>
-      <w:r>
-        <w:t>acc</w:t>
-      </w:r>
-      <w:proofErr w:type="spellEnd"/>
-      <w:r>
-        <w:t>=0.8750</w:t>
-      </w:r>
-    </w:p>
-    <w:p>
-      <w:pPr>
-        <w:pStyle w:val="PargrafodaLista"/>
-        <w:ind w:left="1440"/>
-        <w:jc w:val="both"/>
-      </w:pPr>
-      <w:r>
-        <w:t xml:space="preserve">[005000/10000] </w:t>
-      </w:r>
-      <w:proofErr w:type="spellStart"/>
-      <w:r>
-        <w:t>loss</w:t>
-      </w:r>
-      <w:proofErr w:type="spellEnd"/>
-      <w:r>
-        <w:t xml:space="preserve">=1.9197, </w:t>
-      </w:r>
-      <w:proofErr w:type="spellStart"/>
-      <w:r>
-        <w:t>acc</w:t>
-      </w:r>
-      <w:proofErr w:type="spellEnd"/>
-      <w:r>
-        <w:t>=0.4375</w:t>
-      </w:r>
-    </w:p>
-    <w:p>
-      <w:pPr>
-        <w:pStyle w:val="PargrafodaLista"/>
-        <w:ind w:left="1440"/>
-        <w:jc w:val="both"/>
-      </w:pPr>
-    </w:p>
-    <w:p>
-      <w:pPr>
-        <w:pStyle w:val="PargrafodaLista"/>
-        <w:ind w:left="1440"/>
-        <w:jc w:val="both"/>
-      </w:pPr>
-    </w:p>
-    <w:p>
-      <w:pPr>
-        <w:pStyle w:val="PargrafodaLista"/>
-        <w:ind w:left="1440"/>
-        <w:jc w:val="both"/>
-      </w:pPr>
-    </w:p>
-    <w:p>
-      <w:pPr>
-        <w:pStyle w:val="PargrafodaLista"/>
-        <w:ind w:left="1440"/>
-        <w:jc w:val="both"/>
-      </w:pPr>
-    </w:p>
-    <w:p>
-      <w:pPr>
-        <w:pStyle w:val="PargrafodaLista"/>
-        <w:ind w:left="1440"/>
-        <w:jc w:val="both"/>
-      </w:pPr>
-      <w:proofErr w:type="spellStart"/>
-      <w:r>
-        <w:t>Traceback</w:t>
-      </w:r>
-      <w:proofErr w:type="spellEnd"/>
-      <w:r>
-        <w:t xml:space="preserve"> (</w:t>
-      </w:r>
-      <w:proofErr w:type="spellStart"/>
-      <w:r>
-        <w:t>most</w:t>
-      </w:r>
-      <w:proofErr w:type="spellEnd"/>
-      <w:r>
-        <w:t xml:space="preserve"> </w:t>
-      </w:r>
-      <w:proofErr w:type="spellStart"/>
-      <w:r>
-        <w:t>recent</w:t>
-      </w:r>
-      <w:proofErr w:type="spellEnd"/>
-      <w:r>
-        <w:t xml:space="preserve"> </w:t>
-      </w:r>
-      <w:proofErr w:type="spellStart"/>
-      <w:r>
-        <w:t>call</w:t>
-      </w:r>
-      <w:proofErr w:type="spellEnd"/>
-      <w:r>
-        <w:t xml:space="preserve"> </w:t>
-      </w:r>
-      <w:proofErr w:type="spellStart"/>
-      <w:r>
-        <w:t>last</w:t>
-      </w:r>
-      <w:proofErr w:type="spellEnd"/>
-      <w:r>
-        <w:t>):</w:t>
-      </w:r>
-    </w:p>
-    <w:p>
-      <w:pPr>
-        <w:pStyle w:val="PargrafodaLista"/>
-        <w:ind w:left="1440"/>
-        <w:jc w:val="both"/>
-      </w:pPr>
-      <w:r>
-        <w:t xml:space="preserve">  File "C:\Users\marci_plgx30x\Desktop\Arquivos\Projetos do Mestrado (</w:t>
-      </w:r>
-      <w:proofErr w:type="spellStart"/>
-      <w:r>
-        <w:t>Git</w:t>
-      </w:r>
-      <w:proofErr w:type="spellEnd"/>
-      <w:r>
-        <w:t>)\Projeto-Classificadores\</w:t>
-      </w:r>
-      <w:proofErr w:type="spellStart"/>
-      <w:r>
-        <w:t>Network_Validation</w:t>
-      </w:r>
-      <w:proofErr w:type="spellEnd"/>
-      <w:r>
-        <w:t xml:space="preserve">\VISION TRANSFORMER\ViT_MainTest.py", </w:t>
-      </w:r>
-      <w:proofErr w:type="spellStart"/>
-      <w:r>
-        <w:t>line</w:t>
-      </w:r>
-      <w:proofErr w:type="spellEnd"/>
-      <w:r>
-        <w:t xml:space="preserve"> 152, in &lt;module&gt;</w:t>
-      </w:r>
-    </w:p>
-    <w:p>
-      <w:pPr>
-        <w:pStyle w:val="PargrafodaLista"/>
-        <w:ind w:left="1440"/>
-        <w:jc w:val="both"/>
-      </w:pPr>
-      <w:r>
-        <w:t xml:space="preserve">    </w:t>
-      </w:r>
-      <w:proofErr w:type="spellStart"/>
-      <w:r>
-        <w:t>main</w:t>
-      </w:r>
-      <w:proofErr w:type="spellEnd"/>
-      <w:r>
-        <w:t>()</w:t>
-      </w:r>
-    </w:p>
-    <w:p>
-      <w:pPr>
-        <w:pStyle w:val="PargrafodaLista"/>
-        <w:ind w:left="1440"/>
-        <w:jc w:val="both"/>
-      </w:pPr>
-      <w:r>
-        <w:t xml:space="preserve">  File "C:\Users\marci_plgx30x\Desktop\Arquivos\Projetos do Mestrado (</w:t>
-      </w:r>
-      <w:proofErr w:type="spellStart"/>
-      <w:r>
-        <w:t>Git</w:t>
-      </w:r>
-      <w:proofErr w:type="spellEnd"/>
-      <w:r>
-        <w:t>)\Projeto-Classificadores\</w:t>
-      </w:r>
-      <w:proofErr w:type="spellStart"/>
-      <w:r>
-        <w:t>Network_Validation</w:t>
-      </w:r>
-      <w:proofErr w:type="spellEnd"/>
-      <w:r>
-        <w:t xml:space="preserve">\VISION TRANSFORMER\ViT_MainTest.py", </w:t>
-      </w:r>
-      <w:proofErr w:type="spellStart"/>
-      <w:r>
-        <w:t>line</w:t>
-      </w:r>
-      <w:proofErr w:type="spellEnd"/>
-      <w:r>
-        <w:t xml:space="preserve"> 124, in </w:t>
-      </w:r>
-      <w:proofErr w:type="spellStart"/>
-      <w:r>
-        <w:t>main</w:t>
-      </w:r>
-      <w:proofErr w:type="spellEnd"/>
-    </w:p>
-    <w:p>
-      <w:pPr>
-        <w:pStyle w:val="PargrafodaLista"/>
-        <w:ind w:left="1440"/>
-        <w:jc w:val="both"/>
-      </w:pPr>
-      <w:r>
-        <w:t xml:space="preserve">    </w:t>
-      </w:r>
-      <w:proofErr w:type="spellStart"/>
-      <w:r>
-        <w:t>train_vit</w:t>
-      </w:r>
-      <w:proofErr w:type="spellEnd"/>
-      <w:r>
-        <w:t>(</w:t>
-      </w:r>
-    </w:p>
-    <w:p>
-      <w:pPr>
-        <w:pStyle w:val="PargrafodaLista"/>
-        <w:ind w:left="1440"/>
-        <w:jc w:val="both"/>
-      </w:pPr>
-      <w:r>
-        <w:t xml:space="preserve">  File "C:\Users\marci_plgx30x\Desktop\Arquivos\Projetos do Mestrado (</w:t>
-      </w:r>
-      <w:proofErr w:type="spellStart"/>
-      <w:r>
-        <w:t>Git</w:t>
-      </w:r>
-      <w:proofErr w:type="spellEnd"/>
-      <w:r>
-        <w:t>)\Projeto-Classificadores\</w:t>
-      </w:r>
-      <w:proofErr w:type="spellStart"/>
-      <w:r>
-        <w:t>Network_Validation</w:t>
-      </w:r>
-      <w:proofErr w:type="spellEnd"/>
-      <w:r>
-        <w:t xml:space="preserve">\VISION TRANSFORMER\VisionTransformer_trainer.py", </w:t>
-      </w:r>
-      <w:proofErr w:type="spellStart"/>
-      <w:r>
-        <w:t>line</w:t>
-      </w:r>
-      <w:proofErr w:type="spellEnd"/>
-      <w:r>
-        <w:t xml:space="preserve"> 331, in </w:t>
-      </w:r>
-      <w:proofErr w:type="spellStart"/>
-      <w:r>
-        <w:t>train_vit</w:t>
-      </w:r>
-      <w:proofErr w:type="spellEnd"/>
-    </w:p>
-    <w:p>
-      <w:pPr>
-        <w:pStyle w:val="PargrafodaLista"/>
-        <w:ind w:left="1440"/>
-        <w:jc w:val="both"/>
-      </w:pPr>
-      <w:r>
-        <w:t xml:space="preserve">    </w:t>
-      </w:r>
-      <w:proofErr w:type="spellStart"/>
-      <w:r>
-        <w:t>val</w:t>
-      </w:r>
-      <w:proofErr w:type="spellEnd"/>
-      <w:r>
-        <w:t xml:space="preserve"> = </w:t>
-      </w:r>
-      <w:proofErr w:type="spellStart"/>
-      <w:r>
-        <w:t>evaluate_vit</w:t>
-      </w:r>
-      <w:proofErr w:type="spellEnd"/>
-      <w:r>
-        <w:t>(</w:t>
-      </w:r>
-      <w:proofErr w:type="spellStart"/>
-      <w:r>
-        <w:t>state</w:t>
-      </w:r>
-      <w:proofErr w:type="spellEnd"/>
-      <w:r>
-        <w:t xml:space="preserve">, </w:t>
-      </w:r>
-      <w:proofErr w:type="spellStart"/>
-      <w:r>
-        <w:t>val_iter</w:t>
-      </w:r>
-      <w:proofErr w:type="spellEnd"/>
-      <w:r>
-        <w:t>)</w:t>
-      </w:r>
-    </w:p>
-    <w:p>
-      <w:pPr>
-        <w:pStyle w:val="PargrafodaLista"/>
-        <w:ind w:left="1440"/>
-        <w:jc w:val="both"/>
-      </w:pPr>
-      <w:r>
-        <w:t xml:space="preserve">  File "C:\Users\marci_plgx30x\Desktop\Arquivos\Projetos do Mestrado (</w:t>
-      </w:r>
-      <w:proofErr w:type="spellStart"/>
-      <w:r>
-        <w:t>Git</w:t>
-      </w:r>
-      <w:proofErr w:type="spellEnd"/>
-      <w:r>
-        <w:t>)\Projeto-Classificadores\</w:t>
-      </w:r>
-      <w:proofErr w:type="spellStart"/>
-      <w:r>
-        <w:t>Network_Validation</w:t>
-      </w:r>
-      <w:proofErr w:type="spellEnd"/>
-      <w:r>
-        <w:t xml:space="preserve">\VISION TRANSFORMER\VisionTransformer_trainer.py", </w:t>
-      </w:r>
-      <w:proofErr w:type="spellStart"/>
-      <w:r>
-        <w:t>line</w:t>
-      </w:r>
-      <w:proofErr w:type="spellEnd"/>
-      <w:r>
-        <w:t xml:space="preserve"> 390, in </w:t>
-      </w:r>
-      <w:proofErr w:type="spellStart"/>
-      <w:r>
-        <w:t>evaluate_vit</w:t>
-      </w:r>
-      <w:proofErr w:type="spellEnd"/>
-    </w:p>
-    <w:p>
-      <w:pPr>
-        <w:pStyle w:val="PargrafodaLista"/>
-        <w:ind w:left="1440"/>
-        <w:jc w:val="both"/>
-      </w:pPr>
-      <w:r>
-        <w:t xml:space="preserve">    </w:t>
-      </w:r>
-      <w:proofErr w:type="spellStart"/>
-      <w:r>
-        <w:t>val_ds</w:t>
-      </w:r>
-      <w:proofErr w:type="spellEnd"/>
-      <w:r>
-        <w:t xml:space="preserve"> = </w:t>
-      </w:r>
-      <w:proofErr w:type="spellStart"/>
-      <w:r>
-        <w:t>load_tfrecords</w:t>
-      </w:r>
-      <w:proofErr w:type="spellEnd"/>
-      <w:r>
-        <w:t>(</w:t>
-      </w:r>
-    </w:p>
-    <w:p>
-      <w:pPr>
-        <w:pStyle w:val="PargrafodaLista"/>
-        <w:ind w:left="1440"/>
-        <w:jc w:val="both"/>
-      </w:pPr>
-      <w:r>
-        <w:t xml:space="preserve">  File "C:\Users\marci_plgx30x\Desktop\Arquivos\Projetos do Mestrado (Git)\Projeto-Classificadores\Network_Validation\Process_ImageNet.py", </w:t>
-      </w:r>
-      <w:proofErr w:type="spellStart"/>
-      <w:r>
-        <w:t>line</w:t>
-      </w:r>
-      <w:proofErr w:type="spellEnd"/>
-      <w:r>
-        <w:t xml:space="preserve"> 324, in </w:t>
-      </w:r>
-      <w:proofErr w:type="spellStart"/>
-      <w:r>
-        <w:t>load_tfrecords</w:t>
-      </w:r>
-      <w:proofErr w:type="spellEnd"/>
-    </w:p>
-    <w:p>
-      <w:pPr>
-        <w:pStyle w:val="PargrafodaLista"/>
-        <w:ind w:left="1440"/>
-        <w:jc w:val="both"/>
-      </w:pPr>
-      <w:r>
-        <w:t xml:space="preserve">    </w:t>
-      </w:r>
-      <w:proofErr w:type="spellStart"/>
-      <w:r>
-        <w:t>raise</w:t>
-      </w:r>
-      <w:proofErr w:type="spellEnd"/>
-      <w:r>
-        <w:t xml:space="preserve"> </w:t>
-      </w:r>
-      <w:proofErr w:type="spellStart"/>
-      <w:r>
-        <w:t>ValueError</w:t>
-      </w:r>
-      <w:proofErr w:type="spellEnd"/>
-      <w:r>
-        <w:t>(</w:t>
-      </w:r>
-      <w:proofErr w:type="spellStart"/>
-      <w:r>
-        <w:t>f"Nenhum</w:t>
-      </w:r>
-      <w:proofErr w:type="spellEnd"/>
-      <w:r>
-        <w:t xml:space="preserve"> </w:t>
-      </w:r>
-      <w:proofErr w:type="spellStart"/>
-      <w:r>
-        <w:t>TFRecord</w:t>
-      </w:r>
-      <w:proofErr w:type="spellEnd"/>
-      <w:r>
-        <w:t xml:space="preserve"> encontrado em: {</w:t>
-      </w:r>
-      <w:proofErr w:type="spellStart"/>
-      <w:r>
-        <w:t>tfrecord_dir</w:t>
-      </w:r>
-      <w:proofErr w:type="spellEnd"/>
-      <w:r>
-        <w:t>}/{split}")</w:t>
-      </w:r>
-    </w:p>
-    <w:p>
-      <w:pPr>
-        <w:pStyle w:val="PargrafodaLista"/>
-        <w:ind w:left="1440"/>
-        <w:jc w:val="both"/>
-      </w:pPr>
-      <w:proofErr w:type="spellStart"/>
-      <w:r>
-        <w:t>ValueError</w:t>
-      </w:r>
-      <w:proofErr w:type="spellEnd"/>
-      <w:r>
-        <w:t xml:space="preserve">: Nenhum </w:t>
-      </w:r>
-      <w:proofErr w:type="spellStart"/>
-      <w:r>
-        <w:t>TFRecord</w:t>
-      </w:r>
-      <w:proofErr w:type="spellEnd"/>
-      <w:r>
-        <w:t xml:space="preserve"> encontrado em: &lt;</w:t>
-      </w:r>
-      <w:proofErr w:type="spellStart"/>
-      <w:r>
-        <w:t>tensorflow.python.data.ops.iterator_ops.OwnedIterator</w:t>
-      </w:r>
-      <w:proofErr w:type="spellEnd"/>
-      <w:r>
-        <w:t xml:space="preserve"> </w:t>
-      </w:r>
-      <w:proofErr w:type="spellStart"/>
-      <w:r>
-        <w:t>object</w:t>
-      </w:r>
-      <w:proofErr w:type="spellEnd"/>
-      <w:r>
-        <w:t xml:space="preserve"> </w:t>
-      </w:r>
-      <w:proofErr w:type="spellStart"/>
-      <w:r>
-        <w:t>at</w:t>
-      </w:r>
-      <w:proofErr w:type="spellEnd"/>
-      <w:r>
-        <w:t xml:space="preserve"> 0x000001BDCDA64430&gt;/</w:t>
-      </w:r>
-      <w:proofErr w:type="spellStart"/>
-      <w:r>
-        <w:t>validation</w:t>
-      </w:r>
-      <w:proofErr w:type="spellEnd"/>
-    </w:p>
-    <w:p>
-      <w:pPr>
-        <w:pStyle w:val="PargrafodaLista"/>
-        <w:ind w:left="1440"/>
-        <w:jc w:val="both"/>
-      </w:pPr>
-    </w:p>
-    <w:p>
-      <w:pPr>
-        <w:pStyle w:val="PargrafodaLista"/>
-        <w:ind w:left="1440"/>
-        <w:jc w:val="both"/>
-      </w:pPr>
-      <w:proofErr w:type="spellStart"/>
-      <w:r>
-        <w:t>Process</w:t>
-      </w:r>
-      <w:proofErr w:type="spellEnd"/>
-      <w:r>
-        <w:t xml:space="preserve"> </w:t>
-      </w:r>
-      <w:proofErr w:type="spellStart"/>
-      <w:r>
-        <w:t>finished</w:t>
-      </w:r>
-      <w:proofErr w:type="spellEnd"/>
-      <w:r>
-        <w:t xml:space="preserve"> </w:t>
-      </w:r>
-      <w:proofErr w:type="spellStart"/>
-      <w:r>
-        <w:t>with</w:t>
-      </w:r>
-      <w:proofErr w:type="spellEnd"/>
-      <w:r>
-        <w:t xml:space="preserve"> </w:t>
-      </w:r>
-      <w:proofErr w:type="spellStart"/>
-      <w:r>
-        <w:t>exit</w:t>
-      </w:r>
-      <w:proofErr w:type="spellEnd"/>
-      <w:r>
-        <w:t xml:space="preserve"> </w:t>
-      </w:r>
-      <w:proofErr w:type="spellStart"/>
-      <w:r>
-        <w:t>code</w:t>
-      </w:r>
-      <w:proofErr w:type="spellEnd"/>
-      <w:r>
-        <w:t xml:space="preserve"> 1</w:t>
+        <w:t>[004000/10000] loss=2.1354, acc=0.5625</w:t>
+      </w:r>
+    </w:p>
+    <w:p>
+      <w:pPr>
+        <w:pStyle w:val="PargrafodaLista"/>
+        <w:ind w:left="1440"/>
+        <w:jc w:val="both"/>
+      </w:pPr>
+      <w:r>
+        <w:t>[004100/10000] loss=1.7008, acc=0.6250</w:t>
+      </w:r>
+    </w:p>
+    <w:p>
+      <w:pPr>
+        <w:pStyle w:val="PargrafodaLista"/>
+        <w:ind w:left="1440"/>
+        <w:jc w:val="both"/>
+      </w:pPr>
+      <w:r>
+        <w:t>[004200/10000] loss=1.7804, acc=0.6250</w:t>
+      </w:r>
+    </w:p>
+    <w:p>
+      <w:pPr>
+        <w:pStyle w:val="PargrafodaLista"/>
+        <w:ind w:left="1440"/>
+        <w:jc w:val="both"/>
+      </w:pPr>
+      <w:r>
+        <w:t>[004300/10000] loss=2.0371, acc=0.5000</w:t>
+      </w:r>
+    </w:p>
+    <w:p>
+      <w:pPr>
+        <w:pStyle w:val="PargrafodaLista"/>
+        <w:ind w:left="1440"/>
+        <w:jc w:val="both"/>
+      </w:pPr>
+      <w:r>
+        <w:t>[004400/10000] loss=1.8406, acc=0.5625</w:t>
+      </w:r>
+    </w:p>
+    <w:p>
+      <w:pPr>
+        <w:pStyle w:val="PargrafodaLista"/>
+        <w:ind w:left="1440"/>
+        <w:jc w:val="both"/>
+      </w:pPr>
+      <w:r>
+        <w:t>[004500/10000] loss=2.4649, acc=0.4375</w:t>
+      </w:r>
+    </w:p>
+    <w:p>
+      <w:pPr>
+        <w:pStyle w:val="PargrafodaLista"/>
+        <w:ind w:left="1440"/>
+        <w:jc w:val="both"/>
+      </w:pPr>
+      <w:r>
+        <w:t>[004600/10000] loss=1.9976, acc=0.5625</w:t>
+      </w:r>
+    </w:p>
+    <w:p>
+      <w:pPr>
+        <w:pStyle w:val="PargrafodaLista"/>
+        <w:ind w:left="1440"/>
+        <w:jc w:val="both"/>
+      </w:pPr>
+      <w:r>
+        <w:t>[004700/10000] loss=1.6713, acc=0.5625</w:t>
+      </w:r>
+    </w:p>
+    <w:p>
+      <w:pPr>
+        <w:pStyle w:val="PargrafodaLista"/>
+        <w:ind w:left="1440"/>
+        <w:jc w:val="both"/>
+      </w:pPr>
+      <w:r>
+        <w:t>[004800/10000] loss=1.9858, acc=0.5625</w:t>
+      </w:r>
+    </w:p>
+    <w:p>
+      <w:pPr>
+        <w:pStyle w:val="PargrafodaLista"/>
+        <w:ind w:left="1440"/>
+        <w:jc w:val="both"/>
+      </w:pPr>
+      <w:r>
+        <w:t>[004900/10000] loss=0.6557, acc=0.8750</w:t>
+      </w:r>
+    </w:p>
+    <w:p>
+      <w:pPr>
+        <w:pStyle w:val="PargrafodaLista"/>
+        <w:ind w:left="1440"/>
+        <w:jc w:val="both"/>
+      </w:pPr>
+      <w:r>
+        <w:t>[005000/10000] loss=1.9197, acc=0.4375</w:t>
+      </w:r>
+    </w:p>
+    <w:p>
+      <w:pPr>
+        <w:pStyle w:val="PargrafodaLista"/>
+        <w:ind w:left="1440"/>
+        <w:jc w:val="both"/>
+      </w:pPr>
+    </w:p>
+    <w:p>
+      <w:pPr>
+        <w:pStyle w:val="PargrafodaLista"/>
+        <w:ind w:left="1440"/>
+        <w:jc w:val="both"/>
+      </w:pPr>
+    </w:p>
+    <w:p>
+      <w:pPr>
+        <w:pStyle w:val="PargrafodaLista"/>
+        <w:ind w:left="1440"/>
+        <w:jc w:val="both"/>
+      </w:pPr>
+    </w:p>
+    <w:p>
+      <w:pPr>
+        <w:pStyle w:val="PargrafodaLista"/>
+        <w:ind w:left="1440"/>
+        <w:jc w:val="both"/>
+      </w:pPr>
+    </w:p>
+    <w:p>
+      <w:pPr>
+        <w:pStyle w:val="PargrafodaLista"/>
+        <w:ind w:left="1440"/>
+        <w:jc w:val="both"/>
+      </w:pPr>
+      <w:r>
+        <w:t>Traceback (most recent call last):</w:t>
+      </w:r>
+    </w:p>
+    <w:p>
+      <w:pPr>
+        <w:pStyle w:val="PargrafodaLista"/>
+        <w:ind w:left="1440"/>
+        <w:jc w:val="both"/>
+      </w:pPr>
+      <w:r>
+        <w:t xml:space="preserve">  File "C:\Users\marci_plgx30x\Desktop\Arquivos\Projetos do Mestrado (Git)\Projeto-Classificadores\Network_Validation\VISION TRANSFORMER\ViT_MainTest.py", line 152, in &lt;module&gt;</w:t>
+      </w:r>
+    </w:p>
+    <w:p>
+      <w:pPr>
+        <w:pStyle w:val="PargrafodaLista"/>
+        <w:ind w:left="1440"/>
+        <w:jc w:val="both"/>
+      </w:pPr>
+      <w:r>
+        <w:t xml:space="preserve">    main()</w:t>
+      </w:r>
+    </w:p>
+    <w:p>
+      <w:pPr>
+        <w:pStyle w:val="PargrafodaLista"/>
+        <w:ind w:left="1440"/>
+        <w:jc w:val="both"/>
+      </w:pPr>
+      <w:r>
+        <w:t xml:space="preserve">  File "C:\Users\marci_plgx30x\Desktop\Arquivos\Projetos do Mestrado (Git)\Projeto-Classificadores\Network_Validation\VISION TRANSFORMER\ViT_MainTest.py", line 124, in main</w:t>
+      </w:r>
+    </w:p>
+    <w:p>
+      <w:pPr>
+        <w:pStyle w:val="PargrafodaLista"/>
+        <w:ind w:left="1440"/>
+        <w:jc w:val="both"/>
+      </w:pPr>
+      <w:r>
+        <w:t xml:space="preserve">    train_vit(</w:t>
+      </w:r>
+    </w:p>
+    <w:p>
+      <w:pPr>
+        <w:pStyle w:val="PargrafodaLista"/>
+        <w:ind w:left="1440"/>
+        <w:jc w:val="both"/>
+      </w:pPr>
+      <w:r>
+        <w:t xml:space="preserve">  File "C:\Users\marci_plgx30x\Desktop\Arquivos\Projetos do Mestrado (Git)\Projeto-Classificadores\Network_Validation\VISION TRANSFORMER\VisionTransformer_trainer.py", line 331, in train_vit</w:t>
+      </w:r>
+    </w:p>
+    <w:p>
+      <w:pPr>
+        <w:pStyle w:val="PargrafodaLista"/>
+        <w:ind w:left="1440"/>
+        <w:jc w:val="both"/>
+      </w:pPr>
+      <w:r>
+        <w:t xml:space="preserve">    val = evaluate_vit(state, val_iter)</w:t>
+      </w:r>
+    </w:p>
+    <w:p>
+      <w:pPr>
+        <w:pStyle w:val="PargrafodaLista"/>
+        <w:ind w:left="1440"/>
+        <w:jc w:val="both"/>
+      </w:pPr>
+      <w:r>
+        <w:t xml:space="preserve">  File "C:\Users\marci_plgx30x\Desktop\Arquivos\Projetos do Mestrado (Git)\Projeto-Classificadores\Network_Validation\VISION TRANSFORMER\VisionTransformer_trainer.py", line 390, in evaluate_vit</w:t>
+      </w:r>
+    </w:p>
+    <w:p>
+      <w:pPr>
+        <w:pStyle w:val="PargrafodaLista"/>
+        <w:ind w:left="1440"/>
+        <w:jc w:val="both"/>
+      </w:pPr>
+      <w:r>
+        <w:t xml:space="preserve">    val_ds = load_tfrecords(</w:t>
+      </w:r>
+    </w:p>
+    <w:p>
+      <w:pPr>
+        <w:pStyle w:val="PargrafodaLista"/>
+        <w:ind w:left="1440"/>
+        <w:jc w:val="both"/>
+      </w:pPr>
+      <w:r>
+        <w:t xml:space="preserve">  File "C:\Users\marci_plgx30x\Desktop\Arquivos\Projetos do Mestrado (Git)\Projeto-Classificadores\Network_Validation\Process_ImageNet.py", line 324, in load_tfrecords</w:t>
+      </w:r>
+    </w:p>
+    <w:p>
+      <w:pPr>
+        <w:pStyle w:val="PargrafodaLista"/>
+        <w:ind w:left="1440"/>
+        <w:jc w:val="both"/>
+      </w:pPr>
+      <w:r>
+        <w:t xml:space="preserve">    raise ValueError(f"Nenhum TFRecord encontrado em: {tfrecord_dir}/{split}")</w:t>
+      </w:r>
+    </w:p>
+    <w:p>
+      <w:pPr>
+        <w:pStyle w:val="PargrafodaLista"/>
+        <w:ind w:left="1440"/>
+        <w:jc w:val="both"/>
+      </w:pPr>
+      <w:r>
+        <w:t>ValueError: Nenhum TFRecord encontrado em: &lt;tensorflow.python.data.ops.iterator_ops.OwnedIterator object at 0x000001BDCDA64430&gt;/validation</w:t>
+      </w:r>
+    </w:p>
+    <w:p>
+      <w:pPr>
+        <w:pStyle w:val="PargrafodaLista"/>
+        <w:ind w:left="1440"/>
+        <w:jc w:val="both"/>
+      </w:pPr>
+    </w:p>
+    <w:p>
+      <w:pPr>
+        <w:pStyle w:val="PargrafodaLista"/>
+        <w:ind w:left="1440"/>
+        <w:jc w:val="both"/>
+      </w:pPr>
+      <w:r>
+        <w:t>Process finished with exit code 1</w:t>
       </w:r>
     </w:p>
     <w:p>
@@ -1178,21 +611,12 @@
       <w:r>
         <w:t xml:space="preserve">O erro ocorre na função </w:t>
       </w:r>
-      <w:proofErr w:type="spellStart"/>
       <w:r>
         <w:rPr>
           <w:i/>
           <w:iCs/>
         </w:rPr>
-        <w:t>train_vit</w:t>
-      </w:r>
-      <w:proofErr w:type="spellEnd"/>
-      <w:r>
-        <w:rPr>
-          <w:i/>
-          <w:iCs/>
-        </w:rPr>
-        <w:t>()</w:t>
+        <w:t>train_vit()</w:t>
       </w:r>
       <w:r>
         <w:t xml:space="preserve"> do arquivo </w:t>
@@ -1221,15 +645,7 @@
         <w:jc w:val="both"/>
       </w:pPr>
       <w:r>
-        <w:t xml:space="preserve">Avaliação </w:t>
-      </w:r>
-      <w:proofErr w:type="spellStart"/>
-      <w:r>
-        <w:t>standalone</w:t>
-      </w:r>
-      <w:proofErr w:type="spellEnd"/>
-      <w:r>
-        <w:t xml:space="preserve"> (checkpoint + path)</w:t>
+        <w:t>Avaliação standalone (checkpoint + path)</w:t>
       </w:r>
     </w:p>
     <w:p>
@@ -1265,15 +681,7 @@
         <w:jc w:val="both"/>
       </w:pPr>
       <w:r>
-        <w:t>Avaliação durante treino (</w:t>
-      </w:r>
-      <w:proofErr w:type="spellStart"/>
-      <w:r>
-        <w:t>iterator</w:t>
-      </w:r>
-      <w:proofErr w:type="spellEnd"/>
-      <w:r>
-        <w:t>)</w:t>
+        <w:t>Avaliação durante treino (iterator)</w:t>
       </w:r>
     </w:p>
     <w:p>
@@ -1342,6 +750,9 @@
         <w:jc w:val="center"/>
       </w:pPr>
       <w:r>
+        <w:rPr>
+          <w:noProof/>
+        </w:rPr>
         <w:drawing>
           <wp:inline distT="0" distB="0" distL="0" distR="0" wp14:anchorId="1770A0FB" wp14:editId="25EC65AB">
             <wp:extent cx="2750820" cy="574684"/>
@@ -1387,41 +798,11 @@
       </w:pPr>
       <w:r>
         <w:lastRenderedPageBreak/>
-        <w:t xml:space="preserve">A correção deste problema envolve a criação de uma nova função: </w:t>
-      </w:r>
-      <w:proofErr w:type="spellStart"/>
-      <w:r>
-        <w:t>evaluate_vit_from_iterator</w:t>
-      </w:r>
-      <w:proofErr w:type="spellEnd"/>
-      <w:r>
-        <w:t xml:space="preserve">(), a qual </w:t>
-      </w:r>
-      <w:r>
-        <w:t xml:space="preserve">usa o </w:t>
-      </w:r>
-      <w:proofErr w:type="spellStart"/>
-      <w:r>
-        <w:t>dataset</w:t>
-      </w:r>
-      <w:proofErr w:type="spellEnd"/>
-      <w:r>
-        <w:t xml:space="preserve"> já carregado</w:t>
+        <w:t>A correção deste problema envolve a criação de uma nova função: evaluate_vit_from_iterator(), a qual usa o dataset já carregado</w:t>
       </w:r>
       <w:r>
         <w:br/>
-        <w:t xml:space="preserve">Não toca em </w:t>
-      </w:r>
-      <w:proofErr w:type="spellStart"/>
-      <w:r>
-        <w:t>load_tfrecords</w:t>
-      </w:r>
-      <w:proofErr w:type="spellEnd"/>
-      <w:r>
-        <w:t xml:space="preserve"> e não gera</w:t>
-      </w:r>
-      <w:r>
-        <w:t xml:space="preserve"> mais gera o erro do step 5000</w:t>
+        <w:t>Não toca em load_tfrecords e não gera mais gera o erro do step 5000</w:t>
       </w:r>
     </w:p>
     <w:p>
@@ -1506,6 +887,9 @@
         <w:jc w:val="both"/>
       </w:pPr>
       <w:r>
+        <w:rPr>
+          <w:noProof/>
+        </w:rPr>
         <w:drawing>
           <wp:inline distT="0" distB="0" distL="0" distR="0" wp14:anchorId="48A77CCE" wp14:editId="7ACBBF3E">
             <wp:extent cx="5400040" cy="4780280"/>
@@ -1628,6 +1012,9 @@
         <w:pStyle w:val="PargrafodaLista"/>
       </w:pPr>
       <w:r>
+        <w:rPr>
+          <w:noProof/>
+        </w:rPr>
         <w:drawing>
           <wp:inline distT="0" distB="0" distL="0" distR="0" wp14:anchorId="6078A1B2" wp14:editId="696C60C4">
             <wp:extent cx="5400040" cy="4085590"/>
@@ -1694,6 +1081,9 @@
         <w:pStyle w:val="PargrafodaLista"/>
       </w:pPr>
       <w:r>
+        <w:rPr>
+          <w:noProof/>
+        </w:rPr>
         <w:drawing>
           <wp:inline distT="0" distB="0" distL="0" distR="0" wp14:anchorId="278590D6" wp14:editId="1A4CA8C8">
             <wp:extent cx="5400040" cy="2398395"/>
@@ -1796,6 +1186,9 @@
         <w:pStyle w:val="PargrafodaLista"/>
       </w:pPr>
       <w:r>
+        <w:rPr>
+          <w:noProof/>
+        </w:rPr>
         <w:drawing>
           <wp:inline distT="0" distB="0" distL="0" distR="0" wp14:anchorId="6C372AE6" wp14:editId="30A29F83">
             <wp:extent cx="5400040" cy="2922905"/>
@@ -1865,46 +1258,13 @@
         <w:jc w:val="both"/>
       </w:pPr>
       <w:r>
-        <w:t xml:space="preserve">Rodar </w:t>
-      </w:r>
-      <w:proofErr w:type="spellStart"/>
-      <w:r>
-        <w:t>ViT</w:t>
-      </w:r>
-      <w:proofErr w:type="spellEnd"/>
-      <w:r>
-        <w:t xml:space="preserve">-B/16 “fiel ao </w:t>
-      </w:r>
-      <w:proofErr w:type="spellStart"/>
-      <w:r>
-        <w:t>paper</w:t>
-      </w:r>
-      <w:proofErr w:type="spellEnd"/>
-      <w:r>
-        <w:t>” em hardware comum é naturalmente lento.</w:t>
+        <w:t>Rodar ViT-B/16 “fiel ao paper” em hardware comum é naturalmente lento.</w:t>
       </w:r>
       <w:r>
         <w:t xml:space="preserve"> </w:t>
       </w:r>
       <w:r>
-        <w:t xml:space="preserve">O artigo foi feito em </w:t>
-      </w:r>
-      <w:proofErr w:type="spellStart"/>
-      <w:r>
-        <w:t>TPUs</w:t>
-      </w:r>
-      <w:proofErr w:type="spellEnd"/>
-      <w:r>
-        <w:t xml:space="preserve"> v3, com batch gigantesco.</w:t>
-      </w:r>
-      <w:r>
-        <w:t xml:space="preserve"> </w:t>
-      </w:r>
-      <w:r>
-        <w:t>Dito isso, há otimizações seguras que não quebram a fidelidade científica</w:t>
-      </w:r>
-      <w:r>
-        <w:t xml:space="preserve"> para serem implementadas:</w:t>
+        <w:t>O artigo foi feito em TPUs v3, com batch gigantesco. Dito isso, há otimizações seguras que não quebram a fidelidade científica para serem implementadas:</w:t>
       </w:r>
     </w:p>
     <w:p>
@@ -1957,15 +1317,7 @@
         <w:jc w:val="both"/>
       </w:pPr>
       <w:r>
-        <w:t xml:space="preserve">Utilização de </w:t>
-      </w:r>
-      <w:proofErr w:type="spellStart"/>
-      <w:r>
-        <w:t>Mixed-precision</w:t>
-      </w:r>
-      <w:proofErr w:type="spellEnd"/>
-      <w:r>
-        <w:t>, que consiste em</w:t>
+        <w:t>Utilização de Mixed-precision, que consiste em</w:t>
       </w:r>
       <w:r>
         <w:t xml:space="preserve"> treinar a rede usando dois tipos de precisão numérica ao mesmo tempo:</w:t>
@@ -1994,15 +1346,7 @@
         <w:t>FP32 (32-bit)</w:t>
       </w:r>
       <w:r>
-        <w:t xml:space="preserve"> → onde a precisão é crítica (</w:t>
-      </w:r>
-      <w:proofErr w:type="spellStart"/>
-      <w:r>
-        <w:t>ex</w:t>
-      </w:r>
-      <w:proofErr w:type="spellEnd"/>
-      <w:r>
-        <w:t>: atualização dos pesos)</w:t>
+        <w:t xml:space="preserve"> → onde a precisão é crítica (ex: atualização dos pesos)</w:t>
       </w:r>
       <w:r>
         <w:t xml:space="preserve">. Isso resulta em </w:t>
@@ -2043,52 +1387,7 @@
         <w:t xml:space="preserve"> </w:t>
       </w:r>
       <w:r>
-        <w:t xml:space="preserve">Como </w:t>
-      </w:r>
-      <w:r>
-        <w:t>o</w:t>
-      </w:r>
-      <w:r>
-        <w:t xml:space="preserve"> batch é menor que o do </w:t>
-      </w:r>
-      <w:r>
-        <w:t>artigo</w:t>
-      </w:r>
-      <w:r>
-        <w:t>, o LR precisa ser menor.</w:t>
-      </w:r>
-      <w:r>
-        <w:t xml:space="preserve"> A sugestão é que </w:t>
-      </w:r>
-      <w:proofErr w:type="spellStart"/>
-      <w:r>
-        <w:t>base_lr</w:t>
-      </w:r>
-      <w:proofErr w:type="spellEnd"/>
-      <w:r>
-        <w:t xml:space="preserve"> = 3e-4 * (</w:t>
-      </w:r>
-      <w:proofErr w:type="spellStart"/>
-      <w:r>
-        <w:t>batch_size</w:t>
-      </w:r>
-      <w:proofErr w:type="spellEnd"/>
-      <w:r>
-        <w:t xml:space="preserve"> / 4096)</w:t>
-      </w:r>
-      <w:r>
-        <w:t xml:space="preserve">, o que </w:t>
-      </w:r>
-      <w:r>
-        <w:t xml:space="preserve">melhora estabilidade sem trair o </w:t>
-      </w:r>
-      <w:proofErr w:type="spellStart"/>
-      <w:r>
-        <w:t>paper</w:t>
-      </w:r>
-      <w:proofErr w:type="spellEnd"/>
-      <w:r>
-        <w:t>.</w:t>
+        <w:t>Como o batch é menor que o do artigo, o LR precisa ser menor. A sugestão é que base_lr = 3e-4 * (batch_size / 4096), o que melhora estabilidade sem trair o paper.</w:t>
       </w:r>
     </w:p>
     <w:p>
@@ -2128,30 +1427,7 @@
           <w:b/>
           <w:bCs/>
         </w:rPr>
-        <w:t>Correção da v</w:t>
-      </w:r>
-      <w:r>
-        <w:rPr>
-          <w:b/>
-          <w:bCs/>
-        </w:rPr>
-        <w:t xml:space="preserve">alidação inicial da Vision </w:t>
-      </w:r>
-      <w:proofErr w:type="spellStart"/>
-      <w:r>
-        <w:rPr>
-          <w:b/>
-          <w:bCs/>
-        </w:rPr>
-        <w:t>Transformer</w:t>
-      </w:r>
-      <w:proofErr w:type="spellEnd"/>
-      <w:r>
-        <w:rPr>
-          <w:b/>
-          <w:bCs/>
-        </w:rPr>
-        <w:t>:</w:t>
+        <w:t>Correção da validação inicial da Vision Transformer:</w:t>
       </w:r>
     </w:p>
     <w:p>
@@ -2996,6 +2272,7 @@
   <w:style w:type="character" w:default="1" w:styleId="Fontepargpadro">
     <w:name w:val="Default Paragraph Font"/>
     <w:uiPriority w:val="1"/>
+    <w:semiHidden/>
     <w:unhideWhenUsed/>
   </w:style>
   <w:style w:type="table" w:default="1" w:styleId="Tabelanormal">

</xml_diff>

<commit_message>
Atualização da documentação de testes 24/12
</commit_message>
<xml_diff>
--- a/Network_Validation/Documentação de testes.docx
+++ b/Network_Validation/Documentação de testes.docx
@@ -59,8 +59,17 @@
           <w:b/>
           <w:bCs/>
         </w:rPr>
-        <w:t>alidação inicial da Vision Transformer</w:t>
-      </w:r>
+        <w:t xml:space="preserve">alidação inicial da Vision </w:t>
+      </w:r>
+      <w:proofErr w:type="spellStart"/>
+      <w:r>
+        <w:rPr>
+          <w:b/>
+          <w:bCs/>
+        </w:rPr>
+        <w:t>Transformer</w:t>
+      </w:r>
+      <w:proofErr w:type="spellEnd"/>
       <w:r>
         <w:rPr>
           <w:b/>
@@ -73,7 +82,28 @@
           <w:b/>
           <w:bCs/>
         </w:rPr>
-        <w:t xml:space="preserve"> – 16/12/2025</w:t>
+        <w:t xml:space="preserve"> – 1</w:t>
+      </w:r>
+      <w:r>
+        <w:rPr>
+          <w:b/>
+          <w:bCs/>
+        </w:rPr>
+        <w:t>7</w:t>
+      </w:r>
+      <w:r>
+        <w:rPr>
+          <w:b/>
+          <w:bCs/>
+        </w:rPr>
+        <w:t>/12/2025</w:t>
+      </w:r>
+      <w:r>
+        <w:rPr>
+          <w:b/>
+          <w:bCs/>
+        </w:rPr>
+        <w:t xml:space="preserve"> (Data de conclusão)</w:t>
       </w:r>
       <w:r>
         <w:rPr>
@@ -127,7 +157,31 @@
         <w:jc w:val="both"/>
       </w:pPr>
       <w:r>
-        <w:t>Foram feitas modificações para implementar puramente a Vision Transformer (retirando qualquer resquíscio de outras arquiteturas), contudo, a estrutura do modelo foi mantida inalterada (inclusive para manter compatibilidade com os pesos pré-treinados).</w:t>
+        <w:t xml:space="preserve">Foram feitas modificações para implementar puramente a Vision </w:t>
+      </w:r>
+      <w:proofErr w:type="spellStart"/>
+      <w:r>
+        <w:t>Transformer</w:t>
+      </w:r>
+      <w:proofErr w:type="spellEnd"/>
+      <w:r>
+        <w:t xml:space="preserve"> (retirando qualquer </w:t>
+      </w:r>
+      <w:proofErr w:type="spellStart"/>
+      <w:r>
+        <w:t>resquíscio</w:t>
+      </w:r>
+      <w:proofErr w:type="spellEnd"/>
+      <w:r>
+        <w:t xml:space="preserve"> de outras arquiteturas), contudo, a estrutura do modelo foi mantida inalterada (inclusive para manter compatibilidade com os pesos </w:t>
+      </w:r>
+      <w:proofErr w:type="spellStart"/>
+      <w:r>
+        <w:t>pré</w:t>
+      </w:r>
+      <w:proofErr w:type="spellEnd"/>
+      <w:r>
+        <w:t>-treinados).</w:t>
       </w:r>
     </w:p>
     <w:p>
@@ -140,7 +194,15 @@
         <w:jc w:val="both"/>
       </w:pPr>
       <w:r>
-        <w:t xml:space="preserve">Pesos pré-treinados com a ImageNet-21K também foram retirados do repositório oficial: </w:t>
+        <w:t xml:space="preserve">Pesos </w:t>
+      </w:r>
+      <w:proofErr w:type="spellStart"/>
+      <w:r>
+        <w:t>pré</w:t>
+      </w:r>
+      <w:proofErr w:type="spellEnd"/>
+      <w:r>
+        <w:t xml:space="preserve">-treinados com a ImageNet-21K também foram retirados do repositório oficial: </w:t>
       </w:r>
       <w:hyperlink r:id="rId6" w:history="1">
         <w:r>
@@ -183,7 +245,23 @@
           <w:b/>
           <w:bCs/>
         </w:rPr>
-        <w:t>Parâmetros de treinamento de fine-tunning:</w:t>
+        <w:t>Parâmetros de treinamento de fine-</w:t>
+      </w:r>
+      <w:proofErr w:type="spellStart"/>
+      <w:r>
+        <w:rPr>
+          <w:b/>
+          <w:bCs/>
+        </w:rPr>
+        <w:t>tunning</w:t>
+      </w:r>
+      <w:proofErr w:type="spellEnd"/>
+      <w:r>
+        <w:rPr>
+          <w:b/>
+          <w:bCs/>
+        </w:rPr>
+        <w:t>:</w:t>
       </w:r>
     </w:p>
     <w:p>
@@ -289,272 +367,792 @@
         <w:jc w:val="both"/>
       </w:pPr>
       <w:r>
-        <w:t>[004000/10000] loss=2.1354, acc=0.5625</w:t>
-      </w:r>
-    </w:p>
-    <w:p>
-      <w:pPr>
-        <w:pStyle w:val="PargrafodaLista"/>
-        <w:ind w:left="1440"/>
-        <w:jc w:val="both"/>
-      </w:pPr>
-      <w:r>
-        <w:t>[004100/10000] loss=1.7008, acc=0.6250</w:t>
-      </w:r>
-    </w:p>
-    <w:p>
-      <w:pPr>
-        <w:pStyle w:val="PargrafodaLista"/>
-        <w:ind w:left="1440"/>
-        <w:jc w:val="both"/>
-      </w:pPr>
-      <w:r>
-        <w:t>[004200/10000] loss=1.7804, acc=0.6250</w:t>
-      </w:r>
-    </w:p>
-    <w:p>
-      <w:pPr>
-        <w:pStyle w:val="PargrafodaLista"/>
-        <w:ind w:left="1440"/>
-        <w:jc w:val="both"/>
-      </w:pPr>
-      <w:r>
-        <w:t>[004300/10000] loss=2.0371, acc=0.5000</w:t>
-      </w:r>
-    </w:p>
-    <w:p>
-      <w:pPr>
-        <w:pStyle w:val="PargrafodaLista"/>
-        <w:ind w:left="1440"/>
-        <w:jc w:val="both"/>
-      </w:pPr>
-      <w:r>
-        <w:t>[004400/10000] loss=1.8406, acc=0.5625</w:t>
-      </w:r>
-    </w:p>
-    <w:p>
-      <w:pPr>
-        <w:pStyle w:val="PargrafodaLista"/>
-        <w:ind w:left="1440"/>
-        <w:jc w:val="both"/>
-      </w:pPr>
-      <w:r>
-        <w:t>[004500/10000] loss=2.4649, acc=0.4375</w:t>
-      </w:r>
-    </w:p>
-    <w:p>
-      <w:pPr>
-        <w:pStyle w:val="PargrafodaLista"/>
-        <w:ind w:left="1440"/>
-        <w:jc w:val="both"/>
-      </w:pPr>
-      <w:r>
-        <w:t>[004600/10000] loss=1.9976, acc=0.5625</w:t>
-      </w:r>
-    </w:p>
-    <w:p>
-      <w:pPr>
-        <w:pStyle w:val="PargrafodaLista"/>
-        <w:ind w:left="1440"/>
-        <w:jc w:val="both"/>
-      </w:pPr>
-      <w:r>
-        <w:t>[004700/10000] loss=1.6713, acc=0.5625</w:t>
-      </w:r>
-    </w:p>
-    <w:p>
-      <w:pPr>
-        <w:pStyle w:val="PargrafodaLista"/>
-        <w:ind w:left="1440"/>
-        <w:jc w:val="both"/>
-      </w:pPr>
-      <w:r>
-        <w:t>[004800/10000] loss=1.9858, acc=0.5625</w:t>
-      </w:r>
-    </w:p>
-    <w:p>
-      <w:pPr>
-        <w:pStyle w:val="PargrafodaLista"/>
-        <w:ind w:left="1440"/>
-        <w:jc w:val="both"/>
-      </w:pPr>
-      <w:r>
-        <w:t>[004900/10000] loss=0.6557, acc=0.8750</w:t>
-      </w:r>
-    </w:p>
-    <w:p>
-      <w:pPr>
-        <w:pStyle w:val="PargrafodaLista"/>
-        <w:ind w:left="1440"/>
-        <w:jc w:val="both"/>
-      </w:pPr>
-      <w:r>
-        <w:t>[005000/10000] loss=1.9197, acc=0.4375</w:t>
-      </w:r>
-    </w:p>
-    <w:p>
-      <w:pPr>
-        <w:pStyle w:val="PargrafodaLista"/>
-        <w:ind w:left="1440"/>
-        <w:jc w:val="both"/>
-      </w:pPr>
-    </w:p>
-    <w:p>
-      <w:pPr>
-        <w:pStyle w:val="PargrafodaLista"/>
-        <w:ind w:left="1440"/>
-        <w:jc w:val="both"/>
-      </w:pPr>
-    </w:p>
-    <w:p>
-      <w:pPr>
-        <w:pStyle w:val="PargrafodaLista"/>
-        <w:ind w:left="1440"/>
-        <w:jc w:val="both"/>
-      </w:pPr>
-    </w:p>
-    <w:p>
-      <w:pPr>
-        <w:pStyle w:val="PargrafodaLista"/>
-        <w:ind w:left="1440"/>
-        <w:jc w:val="both"/>
-      </w:pPr>
-    </w:p>
-    <w:p>
-      <w:pPr>
-        <w:pStyle w:val="PargrafodaLista"/>
-        <w:ind w:left="1440"/>
-        <w:jc w:val="both"/>
-      </w:pPr>
-      <w:r>
-        <w:t>Traceback (most recent call last):</w:t>
-      </w:r>
-    </w:p>
-    <w:p>
-      <w:pPr>
-        <w:pStyle w:val="PargrafodaLista"/>
-        <w:ind w:left="1440"/>
-        <w:jc w:val="both"/>
-      </w:pPr>
-      <w:r>
-        <w:t xml:space="preserve">  File "C:\Users\marci_plgx30x\Desktop\Arquivos\Projetos do Mestrado (Git)\Projeto-Classificadores\Network_Validation\VISION TRANSFORMER\ViT_MainTest.py", line 152, in &lt;module&gt;</w:t>
-      </w:r>
-    </w:p>
-    <w:p>
-      <w:pPr>
-        <w:pStyle w:val="PargrafodaLista"/>
-        <w:ind w:left="1440"/>
-        <w:jc w:val="both"/>
-      </w:pPr>
-      <w:r>
-        <w:t xml:space="preserve">    main()</w:t>
-      </w:r>
-    </w:p>
-    <w:p>
-      <w:pPr>
-        <w:pStyle w:val="PargrafodaLista"/>
-        <w:ind w:left="1440"/>
-        <w:jc w:val="both"/>
-      </w:pPr>
-      <w:r>
-        <w:t xml:space="preserve">  File "C:\Users\marci_plgx30x\Desktop\Arquivos\Projetos do Mestrado (Git)\Projeto-Classificadores\Network_Validation\VISION TRANSFORMER\ViT_MainTest.py", line 124, in main</w:t>
-      </w:r>
-    </w:p>
-    <w:p>
-      <w:pPr>
-        <w:pStyle w:val="PargrafodaLista"/>
-        <w:ind w:left="1440"/>
-        <w:jc w:val="both"/>
-      </w:pPr>
-      <w:r>
-        <w:t xml:space="preserve">    train_vit(</w:t>
-      </w:r>
-    </w:p>
-    <w:p>
-      <w:pPr>
-        <w:pStyle w:val="PargrafodaLista"/>
-        <w:ind w:left="1440"/>
-        <w:jc w:val="both"/>
-      </w:pPr>
-      <w:r>
-        <w:t xml:space="preserve">  File "C:\Users\marci_plgx30x\Desktop\Arquivos\Projetos do Mestrado (Git)\Projeto-Classificadores\Network_Validation\VISION TRANSFORMER\VisionTransformer_trainer.py", line 331, in train_vit</w:t>
-      </w:r>
-    </w:p>
-    <w:p>
-      <w:pPr>
-        <w:pStyle w:val="PargrafodaLista"/>
-        <w:ind w:left="1440"/>
-        <w:jc w:val="both"/>
-      </w:pPr>
-      <w:r>
-        <w:t xml:space="preserve">    val = evaluate_vit(state, val_iter)</w:t>
-      </w:r>
-    </w:p>
-    <w:p>
-      <w:pPr>
-        <w:pStyle w:val="PargrafodaLista"/>
-        <w:ind w:left="1440"/>
-        <w:jc w:val="both"/>
-      </w:pPr>
-      <w:r>
-        <w:t xml:space="preserve">  File "C:\Users\marci_plgx30x\Desktop\Arquivos\Projetos do Mestrado (Git)\Projeto-Classificadores\Network_Validation\VISION TRANSFORMER\VisionTransformer_trainer.py", line 390, in evaluate_vit</w:t>
-      </w:r>
-    </w:p>
-    <w:p>
-      <w:pPr>
-        <w:pStyle w:val="PargrafodaLista"/>
-        <w:ind w:left="1440"/>
-        <w:jc w:val="both"/>
-      </w:pPr>
-      <w:r>
-        <w:t xml:space="preserve">    val_ds = load_tfrecords(</w:t>
-      </w:r>
-    </w:p>
-    <w:p>
-      <w:pPr>
-        <w:pStyle w:val="PargrafodaLista"/>
-        <w:ind w:left="1440"/>
-        <w:jc w:val="both"/>
-      </w:pPr>
-      <w:r>
-        <w:t xml:space="preserve">  File "C:\Users\marci_plgx30x\Desktop\Arquivos\Projetos do Mestrado (Git)\Projeto-Classificadores\Network_Validation\Process_ImageNet.py", line 324, in load_tfrecords</w:t>
-      </w:r>
-    </w:p>
-    <w:p>
-      <w:pPr>
-        <w:pStyle w:val="PargrafodaLista"/>
-        <w:ind w:left="1440"/>
-        <w:jc w:val="both"/>
-      </w:pPr>
-      <w:r>
-        <w:t xml:space="preserve">    raise ValueError(f"Nenhum TFRecord encontrado em: {tfrecord_dir}/{split}")</w:t>
-      </w:r>
-    </w:p>
-    <w:p>
-      <w:pPr>
-        <w:pStyle w:val="PargrafodaLista"/>
-        <w:ind w:left="1440"/>
-        <w:jc w:val="both"/>
-      </w:pPr>
-      <w:r>
-        <w:t>ValueError: Nenhum TFRecord encontrado em: &lt;tensorflow.python.data.ops.iterator_ops.OwnedIterator object at 0x000001BDCDA64430&gt;/validation</w:t>
-      </w:r>
-    </w:p>
-    <w:p>
-      <w:pPr>
-        <w:pStyle w:val="PargrafodaLista"/>
-        <w:ind w:left="1440"/>
-        <w:jc w:val="both"/>
-      </w:pPr>
-    </w:p>
-    <w:p>
-      <w:pPr>
-        <w:pStyle w:val="PargrafodaLista"/>
-        <w:ind w:left="1440"/>
-        <w:jc w:val="both"/>
-      </w:pPr>
-      <w:r>
-        <w:t>Process finished with exit code 1</w:t>
+        <w:t xml:space="preserve">[004000/10000] </w:t>
+      </w:r>
+      <w:proofErr w:type="spellStart"/>
+      <w:r>
+        <w:t>loss</w:t>
+      </w:r>
+      <w:proofErr w:type="spellEnd"/>
+      <w:r>
+        <w:t xml:space="preserve">=2.1354, </w:t>
+      </w:r>
+      <w:proofErr w:type="spellStart"/>
+      <w:r>
+        <w:t>acc</w:t>
+      </w:r>
+      <w:proofErr w:type="spellEnd"/>
+      <w:r>
+        <w:t>=0.5625</w:t>
+      </w:r>
+    </w:p>
+    <w:p>
+      <w:pPr>
+        <w:pStyle w:val="PargrafodaLista"/>
+        <w:ind w:left="1440"/>
+        <w:jc w:val="both"/>
+      </w:pPr>
+      <w:r>
+        <w:t xml:space="preserve">[004100/10000] </w:t>
+      </w:r>
+      <w:proofErr w:type="spellStart"/>
+      <w:r>
+        <w:t>loss</w:t>
+      </w:r>
+      <w:proofErr w:type="spellEnd"/>
+      <w:r>
+        <w:t xml:space="preserve">=1.7008, </w:t>
+      </w:r>
+      <w:proofErr w:type="spellStart"/>
+      <w:r>
+        <w:t>acc</w:t>
+      </w:r>
+      <w:proofErr w:type="spellEnd"/>
+      <w:r>
+        <w:t>=0.6250</w:t>
+      </w:r>
+    </w:p>
+    <w:p>
+      <w:pPr>
+        <w:pStyle w:val="PargrafodaLista"/>
+        <w:ind w:left="1440"/>
+        <w:jc w:val="both"/>
+      </w:pPr>
+      <w:r>
+        <w:t xml:space="preserve">[004200/10000] </w:t>
+      </w:r>
+      <w:proofErr w:type="spellStart"/>
+      <w:r>
+        <w:t>loss</w:t>
+      </w:r>
+      <w:proofErr w:type="spellEnd"/>
+      <w:r>
+        <w:t xml:space="preserve">=1.7804, </w:t>
+      </w:r>
+      <w:proofErr w:type="spellStart"/>
+      <w:r>
+        <w:t>acc</w:t>
+      </w:r>
+      <w:proofErr w:type="spellEnd"/>
+      <w:r>
+        <w:t>=0.6250</w:t>
+      </w:r>
+    </w:p>
+    <w:p>
+      <w:pPr>
+        <w:pStyle w:val="PargrafodaLista"/>
+        <w:ind w:left="1440"/>
+        <w:jc w:val="both"/>
+      </w:pPr>
+      <w:r>
+        <w:t xml:space="preserve">[004300/10000] </w:t>
+      </w:r>
+      <w:proofErr w:type="spellStart"/>
+      <w:r>
+        <w:t>loss</w:t>
+      </w:r>
+      <w:proofErr w:type="spellEnd"/>
+      <w:r>
+        <w:t xml:space="preserve">=2.0371, </w:t>
+      </w:r>
+      <w:proofErr w:type="spellStart"/>
+      <w:r>
+        <w:t>acc</w:t>
+      </w:r>
+      <w:proofErr w:type="spellEnd"/>
+      <w:r>
+        <w:t>=0.5000</w:t>
+      </w:r>
+    </w:p>
+    <w:p>
+      <w:pPr>
+        <w:pStyle w:val="PargrafodaLista"/>
+        <w:ind w:left="1440"/>
+        <w:jc w:val="both"/>
+      </w:pPr>
+      <w:r>
+        <w:t xml:space="preserve">[004400/10000] </w:t>
+      </w:r>
+      <w:proofErr w:type="spellStart"/>
+      <w:r>
+        <w:t>loss</w:t>
+      </w:r>
+      <w:proofErr w:type="spellEnd"/>
+      <w:r>
+        <w:t xml:space="preserve">=1.8406, </w:t>
+      </w:r>
+      <w:proofErr w:type="spellStart"/>
+      <w:r>
+        <w:t>acc</w:t>
+      </w:r>
+      <w:proofErr w:type="spellEnd"/>
+      <w:r>
+        <w:t>=0.5625</w:t>
+      </w:r>
+    </w:p>
+    <w:p>
+      <w:pPr>
+        <w:pStyle w:val="PargrafodaLista"/>
+        <w:ind w:left="1440"/>
+        <w:jc w:val="both"/>
+      </w:pPr>
+      <w:r>
+        <w:t xml:space="preserve">[004500/10000] </w:t>
+      </w:r>
+      <w:proofErr w:type="spellStart"/>
+      <w:r>
+        <w:t>loss</w:t>
+      </w:r>
+      <w:proofErr w:type="spellEnd"/>
+      <w:r>
+        <w:t xml:space="preserve">=2.4649, </w:t>
+      </w:r>
+      <w:proofErr w:type="spellStart"/>
+      <w:r>
+        <w:t>acc</w:t>
+      </w:r>
+      <w:proofErr w:type="spellEnd"/>
+      <w:r>
+        <w:t>=0.4375</w:t>
+      </w:r>
+    </w:p>
+    <w:p>
+      <w:pPr>
+        <w:pStyle w:val="PargrafodaLista"/>
+        <w:ind w:left="1440"/>
+        <w:jc w:val="both"/>
+      </w:pPr>
+      <w:r>
+        <w:t xml:space="preserve">[004600/10000] </w:t>
+      </w:r>
+      <w:proofErr w:type="spellStart"/>
+      <w:r>
+        <w:t>loss</w:t>
+      </w:r>
+      <w:proofErr w:type="spellEnd"/>
+      <w:r>
+        <w:t xml:space="preserve">=1.9976, </w:t>
+      </w:r>
+      <w:proofErr w:type="spellStart"/>
+      <w:r>
+        <w:t>acc</w:t>
+      </w:r>
+      <w:proofErr w:type="spellEnd"/>
+      <w:r>
+        <w:t>=0.5625</w:t>
+      </w:r>
+    </w:p>
+    <w:p>
+      <w:pPr>
+        <w:pStyle w:val="PargrafodaLista"/>
+        <w:ind w:left="1440"/>
+        <w:jc w:val="both"/>
+      </w:pPr>
+      <w:r>
+        <w:t xml:space="preserve">[004700/10000] </w:t>
+      </w:r>
+      <w:proofErr w:type="spellStart"/>
+      <w:r>
+        <w:t>loss</w:t>
+      </w:r>
+      <w:proofErr w:type="spellEnd"/>
+      <w:r>
+        <w:t xml:space="preserve">=1.6713, </w:t>
+      </w:r>
+      <w:proofErr w:type="spellStart"/>
+      <w:r>
+        <w:t>acc</w:t>
+      </w:r>
+      <w:proofErr w:type="spellEnd"/>
+      <w:r>
+        <w:t>=0.5625</w:t>
+      </w:r>
+    </w:p>
+    <w:p>
+      <w:pPr>
+        <w:pStyle w:val="PargrafodaLista"/>
+        <w:ind w:left="1440"/>
+        <w:jc w:val="both"/>
+      </w:pPr>
+      <w:r>
+        <w:t xml:space="preserve">[004800/10000] </w:t>
+      </w:r>
+      <w:proofErr w:type="spellStart"/>
+      <w:r>
+        <w:t>loss</w:t>
+      </w:r>
+      <w:proofErr w:type="spellEnd"/>
+      <w:r>
+        <w:t xml:space="preserve">=1.9858, </w:t>
+      </w:r>
+      <w:proofErr w:type="spellStart"/>
+      <w:r>
+        <w:t>acc</w:t>
+      </w:r>
+      <w:proofErr w:type="spellEnd"/>
+      <w:r>
+        <w:t>=0.5625</w:t>
+      </w:r>
+    </w:p>
+    <w:p>
+      <w:pPr>
+        <w:pStyle w:val="PargrafodaLista"/>
+        <w:ind w:left="1440"/>
+        <w:jc w:val="both"/>
+      </w:pPr>
+      <w:r>
+        <w:t xml:space="preserve">[004900/10000] </w:t>
+      </w:r>
+      <w:proofErr w:type="spellStart"/>
+      <w:r>
+        <w:t>loss</w:t>
+      </w:r>
+      <w:proofErr w:type="spellEnd"/>
+      <w:r>
+        <w:t xml:space="preserve">=0.6557, </w:t>
+      </w:r>
+      <w:proofErr w:type="spellStart"/>
+      <w:r>
+        <w:t>acc</w:t>
+      </w:r>
+      <w:proofErr w:type="spellEnd"/>
+      <w:r>
+        <w:t>=0.8750</w:t>
+      </w:r>
+    </w:p>
+    <w:p>
+      <w:pPr>
+        <w:pStyle w:val="PargrafodaLista"/>
+        <w:ind w:left="1440"/>
+        <w:jc w:val="both"/>
+      </w:pPr>
+      <w:r>
+        <w:t xml:space="preserve">[005000/10000] </w:t>
+      </w:r>
+      <w:proofErr w:type="spellStart"/>
+      <w:r>
+        <w:t>loss</w:t>
+      </w:r>
+      <w:proofErr w:type="spellEnd"/>
+      <w:r>
+        <w:t xml:space="preserve">=1.9197, </w:t>
+      </w:r>
+      <w:proofErr w:type="spellStart"/>
+      <w:r>
+        <w:t>acc</w:t>
+      </w:r>
+      <w:proofErr w:type="spellEnd"/>
+      <w:r>
+        <w:t>=0.4375</w:t>
+      </w:r>
+    </w:p>
+    <w:p>
+      <w:pPr>
+        <w:pStyle w:val="PargrafodaLista"/>
+        <w:ind w:left="1440"/>
+        <w:jc w:val="both"/>
+      </w:pPr>
+    </w:p>
+    <w:p>
+      <w:pPr>
+        <w:pStyle w:val="PargrafodaLista"/>
+        <w:ind w:left="1440"/>
+        <w:jc w:val="both"/>
+      </w:pPr>
+    </w:p>
+    <w:p>
+      <w:pPr>
+        <w:pStyle w:val="PargrafodaLista"/>
+        <w:ind w:left="1440"/>
+        <w:jc w:val="both"/>
+      </w:pPr>
+    </w:p>
+    <w:p>
+      <w:pPr>
+        <w:pStyle w:val="PargrafodaLista"/>
+        <w:ind w:left="1440"/>
+        <w:jc w:val="both"/>
+      </w:pPr>
+    </w:p>
+    <w:p>
+      <w:pPr>
+        <w:pStyle w:val="PargrafodaLista"/>
+        <w:ind w:left="1440"/>
+        <w:jc w:val="both"/>
+      </w:pPr>
+      <w:proofErr w:type="spellStart"/>
+      <w:r>
+        <w:t>Traceback</w:t>
+      </w:r>
+      <w:proofErr w:type="spellEnd"/>
+      <w:r>
+        <w:t xml:space="preserve"> (</w:t>
+      </w:r>
+      <w:proofErr w:type="spellStart"/>
+      <w:r>
+        <w:t>most</w:t>
+      </w:r>
+      <w:proofErr w:type="spellEnd"/>
+      <w:r>
+        <w:t xml:space="preserve"> </w:t>
+      </w:r>
+      <w:proofErr w:type="spellStart"/>
+      <w:r>
+        <w:t>recent</w:t>
+      </w:r>
+      <w:proofErr w:type="spellEnd"/>
+      <w:r>
+        <w:t xml:space="preserve"> </w:t>
+      </w:r>
+      <w:proofErr w:type="spellStart"/>
+      <w:r>
+        <w:t>call</w:t>
+      </w:r>
+      <w:proofErr w:type="spellEnd"/>
+      <w:r>
+        <w:t xml:space="preserve"> </w:t>
+      </w:r>
+      <w:proofErr w:type="spellStart"/>
+      <w:r>
+        <w:t>last</w:t>
+      </w:r>
+      <w:proofErr w:type="spellEnd"/>
+      <w:r>
+        <w:t>):</w:t>
+      </w:r>
+    </w:p>
+    <w:p>
+      <w:pPr>
+        <w:pStyle w:val="PargrafodaLista"/>
+        <w:ind w:left="1440"/>
+        <w:jc w:val="both"/>
+      </w:pPr>
+      <w:r>
+        <w:t xml:space="preserve">  File "C:\Users\marci_plgx30x\Desktop\Arquivos\Projetos do Mestrado (</w:t>
+      </w:r>
+      <w:proofErr w:type="spellStart"/>
+      <w:r>
+        <w:t>Git</w:t>
+      </w:r>
+      <w:proofErr w:type="spellEnd"/>
+      <w:r>
+        <w:t>)\Projeto-Classificadores\</w:t>
+      </w:r>
+      <w:proofErr w:type="spellStart"/>
+      <w:r>
+        <w:t>Network_Validation</w:t>
+      </w:r>
+      <w:proofErr w:type="spellEnd"/>
+      <w:r>
+        <w:t xml:space="preserve">\VISION TRANSFORMER\ViT_MainTest.py", </w:t>
+      </w:r>
+      <w:proofErr w:type="spellStart"/>
+      <w:r>
+        <w:t>line</w:t>
+      </w:r>
+      <w:proofErr w:type="spellEnd"/>
+      <w:r>
+        <w:t xml:space="preserve"> 152, in &lt;module&gt;</w:t>
+      </w:r>
+    </w:p>
+    <w:p>
+      <w:pPr>
+        <w:pStyle w:val="PargrafodaLista"/>
+        <w:ind w:left="1440"/>
+        <w:jc w:val="both"/>
+      </w:pPr>
+      <w:r>
+        <w:t xml:space="preserve">    </w:t>
+      </w:r>
+      <w:proofErr w:type="spellStart"/>
+      <w:r>
+        <w:t>main</w:t>
+      </w:r>
+      <w:proofErr w:type="spellEnd"/>
+      <w:r>
+        <w:t>()</w:t>
+      </w:r>
+    </w:p>
+    <w:p>
+      <w:pPr>
+        <w:pStyle w:val="PargrafodaLista"/>
+        <w:ind w:left="1440"/>
+        <w:jc w:val="both"/>
+      </w:pPr>
+      <w:r>
+        <w:t xml:space="preserve">  File "C:\Users\marci_plgx30x\Desktop\Arquivos\Projetos do Mestrado (</w:t>
+      </w:r>
+      <w:proofErr w:type="spellStart"/>
+      <w:r>
+        <w:t>Git</w:t>
+      </w:r>
+      <w:proofErr w:type="spellEnd"/>
+      <w:r>
+        <w:t>)\Projeto-Classificadores\</w:t>
+      </w:r>
+      <w:proofErr w:type="spellStart"/>
+      <w:r>
+        <w:t>Network_Validation</w:t>
+      </w:r>
+      <w:proofErr w:type="spellEnd"/>
+      <w:r>
+        <w:t xml:space="preserve">\VISION TRANSFORMER\ViT_MainTest.py", </w:t>
+      </w:r>
+      <w:proofErr w:type="spellStart"/>
+      <w:r>
+        <w:t>line</w:t>
+      </w:r>
+      <w:proofErr w:type="spellEnd"/>
+      <w:r>
+        <w:t xml:space="preserve"> 124, in </w:t>
+      </w:r>
+      <w:proofErr w:type="spellStart"/>
+      <w:r>
+        <w:t>main</w:t>
+      </w:r>
+      <w:proofErr w:type="spellEnd"/>
+    </w:p>
+    <w:p>
+      <w:pPr>
+        <w:pStyle w:val="PargrafodaLista"/>
+        <w:ind w:left="1440"/>
+        <w:jc w:val="both"/>
+      </w:pPr>
+      <w:r>
+        <w:t xml:space="preserve">    </w:t>
+      </w:r>
+      <w:proofErr w:type="spellStart"/>
+      <w:r>
+        <w:t>train_vit</w:t>
+      </w:r>
+      <w:proofErr w:type="spellEnd"/>
+      <w:r>
+        <w:t>(</w:t>
+      </w:r>
+    </w:p>
+    <w:p>
+      <w:pPr>
+        <w:pStyle w:val="PargrafodaLista"/>
+        <w:ind w:left="1440"/>
+        <w:jc w:val="both"/>
+      </w:pPr>
+      <w:r>
+        <w:t xml:space="preserve">  File "C:\Users\marci_plgx30x\Desktop\Arquivos\Projetos do Mestrado (</w:t>
+      </w:r>
+      <w:proofErr w:type="spellStart"/>
+      <w:r>
+        <w:t>Git</w:t>
+      </w:r>
+      <w:proofErr w:type="spellEnd"/>
+      <w:r>
+        <w:t>)\Projeto-Classificadores\</w:t>
+      </w:r>
+      <w:proofErr w:type="spellStart"/>
+      <w:r>
+        <w:t>Network_Validation</w:t>
+      </w:r>
+      <w:proofErr w:type="spellEnd"/>
+      <w:r>
+        <w:t xml:space="preserve">\VISION TRANSFORMER\VisionTransformer_trainer.py", </w:t>
+      </w:r>
+      <w:proofErr w:type="spellStart"/>
+      <w:r>
+        <w:t>line</w:t>
+      </w:r>
+      <w:proofErr w:type="spellEnd"/>
+      <w:r>
+        <w:t xml:space="preserve"> 331, in </w:t>
+      </w:r>
+      <w:proofErr w:type="spellStart"/>
+      <w:r>
+        <w:t>train_vit</w:t>
+      </w:r>
+      <w:proofErr w:type="spellEnd"/>
+    </w:p>
+    <w:p>
+      <w:pPr>
+        <w:pStyle w:val="PargrafodaLista"/>
+        <w:ind w:left="1440"/>
+        <w:jc w:val="both"/>
+      </w:pPr>
+      <w:r>
+        <w:t xml:space="preserve">    </w:t>
+      </w:r>
+      <w:proofErr w:type="spellStart"/>
+      <w:r>
+        <w:t>val</w:t>
+      </w:r>
+      <w:proofErr w:type="spellEnd"/>
+      <w:r>
+        <w:t xml:space="preserve"> = </w:t>
+      </w:r>
+      <w:proofErr w:type="spellStart"/>
+      <w:r>
+        <w:t>evaluate_vit</w:t>
+      </w:r>
+      <w:proofErr w:type="spellEnd"/>
+      <w:r>
+        <w:t>(</w:t>
+      </w:r>
+      <w:proofErr w:type="spellStart"/>
+      <w:r>
+        <w:t>state</w:t>
+      </w:r>
+      <w:proofErr w:type="spellEnd"/>
+      <w:r>
+        <w:t xml:space="preserve">, </w:t>
+      </w:r>
+      <w:proofErr w:type="spellStart"/>
+      <w:r>
+        <w:t>val_iter</w:t>
+      </w:r>
+      <w:proofErr w:type="spellEnd"/>
+      <w:r>
+        <w:t>)</w:t>
+      </w:r>
+    </w:p>
+    <w:p>
+      <w:pPr>
+        <w:pStyle w:val="PargrafodaLista"/>
+        <w:ind w:left="1440"/>
+        <w:jc w:val="both"/>
+      </w:pPr>
+      <w:r>
+        <w:t xml:space="preserve">  File "C:\Users\marci_plgx30x\Desktop\Arquivos\Projetos do Mestrado (</w:t>
+      </w:r>
+      <w:proofErr w:type="spellStart"/>
+      <w:r>
+        <w:t>Git</w:t>
+      </w:r>
+      <w:proofErr w:type="spellEnd"/>
+      <w:r>
+        <w:t>)\Projeto-Classificadores\</w:t>
+      </w:r>
+      <w:proofErr w:type="spellStart"/>
+      <w:r>
+        <w:t>Network_Validation</w:t>
+      </w:r>
+      <w:proofErr w:type="spellEnd"/>
+      <w:r>
+        <w:t xml:space="preserve">\VISION TRANSFORMER\VisionTransformer_trainer.py", </w:t>
+      </w:r>
+      <w:proofErr w:type="spellStart"/>
+      <w:r>
+        <w:t>line</w:t>
+      </w:r>
+      <w:proofErr w:type="spellEnd"/>
+      <w:r>
+        <w:t xml:space="preserve"> 390, in </w:t>
+      </w:r>
+      <w:proofErr w:type="spellStart"/>
+      <w:r>
+        <w:t>evaluate_vit</w:t>
+      </w:r>
+      <w:proofErr w:type="spellEnd"/>
+    </w:p>
+    <w:p>
+      <w:pPr>
+        <w:pStyle w:val="PargrafodaLista"/>
+        <w:ind w:left="1440"/>
+        <w:jc w:val="both"/>
+      </w:pPr>
+      <w:r>
+        <w:t xml:space="preserve">    </w:t>
+      </w:r>
+      <w:proofErr w:type="spellStart"/>
+      <w:r>
+        <w:t>val_ds</w:t>
+      </w:r>
+      <w:proofErr w:type="spellEnd"/>
+      <w:r>
+        <w:t xml:space="preserve"> = </w:t>
+      </w:r>
+      <w:proofErr w:type="spellStart"/>
+      <w:r>
+        <w:t>load_tfrecords</w:t>
+      </w:r>
+      <w:proofErr w:type="spellEnd"/>
+      <w:r>
+        <w:t>(</w:t>
+      </w:r>
+    </w:p>
+    <w:p>
+      <w:pPr>
+        <w:pStyle w:val="PargrafodaLista"/>
+        <w:ind w:left="1440"/>
+        <w:jc w:val="both"/>
+      </w:pPr>
+      <w:r>
+        <w:t xml:space="preserve">  File "C:\Users\marci_plgx30x\Desktop\Arquivos\Projetos do Mestrado (Git)\Projeto-Classificadores\Network_Validation\Process_ImageNet.py", </w:t>
+      </w:r>
+      <w:proofErr w:type="spellStart"/>
+      <w:r>
+        <w:t>line</w:t>
+      </w:r>
+      <w:proofErr w:type="spellEnd"/>
+      <w:r>
+        <w:t xml:space="preserve"> 324, in </w:t>
+      </w:r>
+      <w:proofErr w:type="spellStart"/>
+      <w:r>
+        <w:t>load_tfrecords</w:t>
+      </w:r>
+      <w:proofErr w:type="spellEnd"/>
+    </w:p>
+    <w:p>
+      <w:pPr>
+        <w:pStyle w:val="PargrafodaLista"/>
+        <w:ind w:left="1440"/>
+        <w:jc w:val="both"/>
+      </w:pPr>
+      <w:r>
+        <w:t xml:space="preserve">    </w:t>
+      </w:r>
+      <w:proofErr w:type="spellStart"/>
+      <w:r>
+        <w:t>raise</w:t>
+      </w:r>
+      <w:proofErr w:type="spellEnd"/>
+      <w:r>
+        <w:t xml:space="preserve"> </w:t>
+      </w:r>
+      <w:proofErr w:type="spellStart"/>
+      <w:r>
+        <w:t>ValueError</w:t>
+      </w:r>
+      <w:proofErr w:type="spellEnd"/>
+      <w:r>
+        <w:t>(</w:t>
+      </w:r>
+      <w:proofErr w:type="spellStart"/>
+      <w:r>
+        <w:t>f"Nenhum</w:t>
+      </w:r>
+      <w:proofErr w:type="spellEnd"/>
+      <w:r>
+        <w:t xml:space="preserve"> </w:t>
+      </w:r>
+      <w:proofErr w:type="spellStart"/>
+      <w:r>
+        <w:t>TFRecord</w:t>
+      </w:r>
+      <w:proofErr w:type="spellEnd"/>
+      <w:r>
+        <w:t xml:space="preserve"> encontrado em: {</w:t>
+      </w:r>
+      <w:proofErr w:type="spellStart"/>
+      <w:r>
+        <w:t>tfrecord_dir</w:t>
+      </w:r>
+      <w:proofErr w:type="spellEnd"/>
+      <w:r>
+        <w:t>}/{split}")</w:t>
+      </w:r>
+    </w:p>
+    <w:p>
+      <w:pPr>
+        <w:pStyle w:val="PargrafodaLista"/>
+        <w:ind w:left="1440"/>
+        <w:jc w:val="both"/>
+      </w:pPr>
+      <w:proofErr w:type="spellStart"/>
+      <w:r>
+        <w:t>ValueError</w:t>
+      </w:r>
+      <w:proofErr w:type="spellEnd"/>
+      <w:r>
+        <w:t xml:space="preserve">: Nenhum </w:t>
+      </w:r>
+      <w:proofErr w:type="spellStart"/>
+      <w:r>
+        <w:t>TFRecord</w:t>
+      </w:r>
+      <w:proofErr w:type="spellEnd"/>
+      <w:r>
+        <w:t xml:space="preserve"> encontrado em: &lt;</w:t>
+      </w:r>
+      <w:proofErr w:type="spellStart"/>
+      <w:r>
+        <w:t>tensorflow.python.data.ops.iterator_ops.OwnedIterator</w:t>
+      </w:r>
+      <w:proofErr w:type="spellEnd"/>
+      <w:r>
+        <w:t xml:space="preserve"> </w:t>
+      </w:r>
+      <w:proofErr w:type="spellStart"/>
+      <w:r>
+        <w:t>object</w:t>
+      </w:r>
+      <w:proofErr w:type="spellEnd"/>
+      <w:r>
+        <w:t xml:space="preserve"> </w:t>
+      </w:r>
+      <w:proofErr w:type="spellStart"/>
+      <w:r>
+        <w:t>at</w:t>
+      </w:r>
+      <w:proofErr w:type="spellEnd"/>
+      <w:r>
+        <w:t xml:space="preserve"> 0x000001BDCDA64430&gt;/</w:t>
+      </w:r>
+      <w:proofErr w:type="spellStart"/>
+      <w:r>
+        <w:t>validation</w:t>
+      </w:r>
+      <w:proofErr w:type="spellEnd"/>
+    </w:p>
+    <w:p>
+      <w:pPr>
+        <w:pStyle w:val="PargrafodaLista"/>
+        <w:ind w:left="1440"/>
+        <w:jc w:val="both"/>
+      </w:pPr>
+    </w:p>
+    <w:p>
+      <w:pPr>
+        <w:pStyle w:val="PargrafodaLista"/>
+        <w:ind w:left="1440"/>
+        <w:jc w:val="both"/>
+      </w:pPr>
+      <w:proofErr w:type="spellStart"/>
+      <w:r>
+        <w:t>Process</w:t>
+      </w:r>
+      <w:proofErr w:type="spellEnd"/>
+      <w:r>
+        <w:t xml:space="preserve"> </w:t>
+      </w:r>
+      <w:proofErr w:type="spellStart"/>
+      <w:r>
+        <w:t>finished</w:t>
+      </w:r>
+      <w:proofErr w:type="spellEnd"/>
+      <w:r>
+        <w:t xml:space="preserve"> </w:t>
+      </w:r>
+      <w:proofErr w:type="spellStart"/>
+      <w:r>
+        <w:t>with</w:t>
+      </w:r>
+      <w:proofErr w:type="spellEnd"/>
+      <w:r>
+        <w:t xml:space="preserve"> </w:t>
+      </w:r>
+      <w:proofErr w:type="spellStart"/>
+      <w:r>
+        <w:t>exit</w:t>
+      </w:r>
+      <w:proofErr w:type="spellEnd"/>
+      <w:r>
+        <w:t xml:space="preserve"> </w:t>
+      </w:r>
+      <w:proofErr w:type="spellStart"/>
+      <w:r>
+        <w:t>code</w:t>
+      </w:r>
+      <w:proofErr w:type="spellEnd"/>
+      <w:r>
+        <w:t xml:space="preserve"> 1</w:t>
       </w:r>
     </w:p>
     <w:p>
@@ -611,12 +1209,21 @@
       <w:r>
         <w:t xml:space="preserve">O erro ocorre na função </w:t>
       </w:r>
+      <w:proofErr w:type="spellStart"/>
       <w:r>
         <w:rPr>
           <w:i/>
           <w:iCs/>
         </w:rPr>
-        <w:t>train_vit()</w:t>
+        <w:t>train_vit</w:t>
+      </w:r>
+      <w:proofErr w:type="spellEnd"/>
+      <w:r>
+        <w:rPr>
+          <w:i/>
+          <w:iCs/>
+        </w:rPr>
+        <w:t>()</w:t>
       </w:r>
       <w:r>
         <w:t xml:space="preserve"> do arquivo </w:t>
@@ -645,7 +1252,15 @@
         <w:jc w:val="both"/>
       </w:pPr>
       <w:r>
-        <w:t>Avaliação standalone (checkpoint + path)</w:t>
+        <w:t xml:space="preserve">Avaliação </w:t>
+      </w:r>
+      <w:proofErr w:type="spellStart"/>
+      <w:r>
+        <w:t>standalone</w:t>
+      </w:r>
+      <w:proofErr w:type="spellEnd"/>
+      <w:r>
+        <w:t xml:space="preserve"> (checkpoint + path)</w:t>
       </w:r>
     </w:p>
     <w:p>
@@ -681,7 +1296,15 @@
         <w:jc w:val="both"/>
       </w:pPr>
       <w:r>
-        <w:t>Avaliação durante treino (iterator)</w:t>
+        <w:t>Avaliação durante treino (</w:t>
+      </w:r>
+      <w:proofErr w:type="spellStart"/>
+      <w:r>
+        <w:t>iterator</w:t>
+      </w:r>
+      <w:proofErr w:type="spellEnd"/>
+      <w:r>
+        <w:t>)</w:t>
       </w:r>
     </w:p>
     <w:p>
@@ -753,6 +1376,7 @@
         <w:rPr>
           <w:noProof/>
         </w:rPr>
+        <w:lastRenderedPageBreak/>
         <w:drawing>
           <wp:inline distT="0" distB="0" distL="0" distR="0" wp14:anchorId="1770A0FB" wp14:editId="25EC65AB">
             <wp:extent cx="2750820" cy="574684"/>
@@ -794,15 +1418,45 @@
       <w:pPr>
         <w:pStyle w:val="PargrafodaLista"/>
         <w:ind w:left="1440"/>
-        <w:jc w:val="both"/>
-      </w:pPr>
-      <w:r>
-        <w:lastRenderedPageBreak/>
-        <w:t>A correção deste problema envolve a criação de uma nova função: evaluate_vit_from_iterator(), a qual usa o dataset já carregado</w:t>
+        <w:jc w:val="center"/>
+      </w:pPr>
+    </w:p>
+    <w:p>
+      <w:pPr>
+        <w:pStyle w:val="PargrafodaLista"/>
+        <w:ind w:left="1440"/>
+        <w:jc w:val="both"/>
+      </w:pPr>
+      <w:r>
+        <w:t xml:space="preserve">A correção deste problema envolve a criação de uma nova função: </w:t>
+      </w:r>
+      <w:proofErr w:type="spellStart"/>
+      <w:r>
+        <w:t>evaluate_vit_from_iterator</w:t>
+      </w:r>
+      <w:proofErr w:type="spellEnd"/>
+      <w:r>
+        <w:t xml:space="preserve">(), a qual usa o </w:t>
+      </w:r>
+      <w:proofErr w:type="spellStart"/>
+      <w:r>
+        <w:t>dataset</w:t>
+      </w:r>
+      <w:proofErr w:type="spellEnd"/>
+      <w:r>
+        <w:t xml:space="preserve"> já carregado</w:t>
       </w:r>
       <w:r>
         <w:br/>
-        <w:t>Não toca em load_tfrecords e não gera mais gera o erro do step 5000</w:t>
+        <w:t xml:space="preserve">Não toca em </w:t>
+      </w:r>
+      <w:proofErr w:type="spellStart"/>
+      <w:r>
+        <w:t>load_tfrecords</w:t>
+      </w:r>
+      <w:proofErr w:type="spellEnd"/>
+      <w:r>
+        <w:t xml:space="preserve"> e não gera mais gera o erro do step 5000</w:t>
       </w:r>
     </w:p>
     <w:p>
@@ -864,12 +1518,14 @@
         <w:ind w:left="1440"/>
         <w:jc w:val="both"/>
         <w:rPr>
-          <w:color w:val="EE0000"/>
-        </w:rPr>
-      </w:pPr>
-      <w:r>
-        <w:rPr>
-          <w:color w:val="EE0000"/>
+          <w:b/>
+          <w:bCs/>
+        </w:rPr>
+      </w:pPr>
+      <w:r>
+        <w:rPr>
+          <w:b/>
+          <w:bCs/>
         </w:rPr>
         <w:t>EXPLICAÇÃO DOS VALORES DE ACURÁCIA</w:t>
       </w:r>
@@ -965,40 +1621,33 @@
     </w:p>
     <w:p>
       <w:pPr>
-        <w:pStyle w:val="PargrafodaLista"/>
-        <w:jc w:val="both"/>
-      </w:pPr>
-    </w:p>
-    <w:p>
-      <w:pPr>
-        <w:pStyle w:val="PargrafodaLista"/>
-        <w:jc w:val="both"/>
-      </w:pPr>
-    </w:p>
-    <w:p>
-      <w:pPr>
-        <w:jc w:val="both"/>
-      </w:pPr>
-    </w:p>
-    <w:p>
-      <w:pPr>
-        <w:pStyle w:val="PargrafodaLista"/>
-        <w:jc w:val="both"/>
-      </w:pPr>
-    </w:p>
-    <w:p>
-      <w:pPr>
-        <w:pStyle w:val="PargrafodaLista"/>
-        <w:jc w:val="both"/>
-        <w:rPr>
-          <w:color w:val="EE0000"/>
-        </w:rPr>
-      </w:pPr>
-      <w:r>
-        <w:rPr>
-          <w:color w:val="EE0000"/>
-        </w:rPr>
-        <w:lastRenderedPageBreak/>
+        <w:jc w:val="both"/>
+      </w:pPr>
+    </w:p>
+    <w:p>
+      <w:pPr>
+        <w:pStyle w:val="PargrafodaLista"/>
+        <w:jc w:val="both"/>
+        <w:rPr>
+          <w:b/>
+          <w:bCs/>
+        </w:rPr>
+      </w:pPr>
+    </w:p>
+    <w:p>
+      <w:pPr>
+        <w:pStyle w:val="PargrafodaLista"/>
+        <w:jc w:val="both"/>
+        <w:rPr>
+          <w:b/>
+          <w:bCs/>
+        </w:rPr>
+      </w:pPr>
+      <w:r>
+        <w:rPr>
+          <w:b/>
+          <w:bCs/>
+        </w:rPr>
         <w:t>RELAÇÃO DO PRÉ-TREINO COM OS VALORES OBTIDOS</w:t>
       </w:r>
     </w:p>
@@ -1061,12 +1710,15 @@
       <w:pPr>
         <w:pStyle w:val="PargrafodaLista"/>
         <w:rPr>
+          <w:b/>
+          <w:bCs/>
           <w:color w:val="EE0000"/>
         </w:rPr>
       </w:pPr>
       <w:r>
         <w:rPr>
-          <w:color w:val="EE0000"/>
+          <w:b/>
+          <w:bCs/>
         </w:rPr>
         <w:t>CLASSIFICADOR REINICIADO</w:t>
       </w:r>
@@ -1159,20 +1811,25 @@
     <w:p>
       <w:pPr>
         <w:pStyle w:val="PargrafodaLista"/>
-      </w:pPr>
-    </w:p>
-    <w:p>
-      <w:pPr>
-        <w:pStyle w:val="PargrafodaLista"/>
-        <w:rPr>
-          <w:color w:val="EE0000"/>
-        </w:rPr>
-      </w:pPr>
-      <w:r>
-        <w:rPr>
-          <w:color w:val="EE0000"/>
-        </w:rPr>
-        <w:lastRenderedPageBreak/>
+        <w:rPr>
+          <w:b/>
+          <w:bCs/>
+        </w:rPr>
+      </w:pPr>
+    </w:p>
+    <w:p>
+      <w:pPr>
+        <w:pStyle w:val="PargrafodaLista"/>
+        <w:rPr>
+          <w:b/>
+          <w:bCs/>
+        </w:rPr>
+      </w:pPr>
+      <w:r>
+        <w:rPr>
+          <w:b/>
+          <w:bCs/>
+        </w:rPr>
         <w:t>VALORES ESPERADOS:</w:t>
       </w:r>
     </w:p>
@@ -1258,13 +1915,37 @@
         <w:jc w:val="both"/>
       </w:pPr>
       <w:r>
-        <w:t>Rodar ViT-B/16 “fiel ao paper” em hardware comum é naturalmente lento.</w:t>
+        <w:t xml:space="preserve">Rodar </w:t>
+      </w:r>
+      <w:proofErr w:type="spellStart"/>
+      <w:r>
+        <w:t>ViT</w:t>
+      </w:r>
+      <w:proofErr w:type="spellEnd"/>
+      <w:r>
+        <w:t xml:space="preserve">-B/16 “fiel ao </w:t>
+      </w:r>
+      <w:proofErr w:type="spellStart"/>
+      <w:r>
+        <w:t>paper</w:t>
+      </w:r>
+      <w:proofErr w:type="spellEnd"/>
+      <w:r>
+        <w:t>” em hardware comum é naturalmente lento.</w:t>
       </w:r>
       <w:r>
         <w:t xml:space="preserve"> </w:t>
       </w:r>
       <w:r>
-        <w:t>O artigo foi feito em TPUs v3, com batch gigantesco. Dito isso, há otimizações seguras que não quebram a fidelidade científica para serem implementadas:</w:t>
+        <w:t xml:space="preserve">O artigo foi feito em </w:t>
+      </w:r>
+      <w:proofErr w:type="spellStart"/>
+      <w:r>
+        <w:t>TPUs</w:t>
+      </w:r>
+      <w:proofErr w:type="spellEnd"/>
+      <w:r>
+        <w:t xml:space="preserve"> v3, com batch gigantesco. Dito isso, há otimizações seguras que não quebram a fidelidade científica para serem implementadas:</w:t>
       </w:r>
     </w:p>
     <w:p>
@@ -1317,7 +1998,15 @@
         <w:jc w:val="both"/>
       </w:pPr>
       <w:r>
-        <w:t>Utilização de Mixed-precision, que consiste em</w:t>
+        <w:t xml:space="preserve">Utilização de </w:t>
+      </w:r>
+      <w:proofErr w:type="spellStart"/>
+      <w:r>
+        <w:t>Mixed-precision</w:t>
+      </w:r>
+      <w:proofErr w:type="spellEnd"/>
+      <w:r>
+        <w:t>, que consiste em</w:t>
       </w:r>
       <w:r>
         <w:t xml:space="preserve"> treinar a rede usando dois tipos de precisão numérica ao mesmo tempo:</w:t>
@@ -1346,7 +2035,15 @@
         <w:t>FP32 (32-bit)</w:t>
       </w:r>
       <w:r>
-        <w:t xml:space="preserve"> → onde a precisão é crítica (ex: atualização dos pesos)</w:t>
+        <w:t xml:space="preserve"> → onde a precisão é crítica (</w:t>
+      </w:r>
+      <w:proofErr w:type="spellStart"/>
+      <w:r>
+        <w:t>ex</w:t>
+      </w:r>
+      <w:proofErr w:type="spellEnd"/>
+      <w:r>
+        <w:t>: atualização dos pesos)</w:t>
       </w:r>
       <w:r>
         <w:t xml:space="preserve">. Isso resulta em </w:t>
@@ -1387,7 +2084,31 @@
         <w:t xml:space="preserve"> </w:t>
       </w:r>
       <w:r>
-        <w:t>Como o batch é menor que o do artigo, o LR precisa ser menor. A sugestão é que base_lr = 3e-4 * (batch_size / 4096), o que melhora estabilidade sem trair o paper.</w:t>
+        <w:t xml:space="preserve">Como o batch é menor que o do artigo, o LR precisa ser menor. A sugestão é que </w:t>
+      </w:r>
+      <w:proofErr w:type="spellStart"/>
+      <w:r>
+        <w:t>base_lr</w:t>
+      </w:r>
+      <w:proofErr w:type="spellEnd"/>
+      <w:r>
+        <w:t xml:space="preserve"> = 3e-4 * (</w:t>
+      </w:r>
+      <w:proofErr w:type="spellStart"/>
+      <w:r>
+        <w:t>batch_size</w:t>
+      </w:r>
+      <w:proofErr w:type="spellEnd"/>
+      <w:r>
+        <w:t xml:space="preserve"> / 4096), o que melhora estabilidade sem trair o </w:t>
+      </w:r>
+      <w:proofErr w:type="spellStart"/>
+      <w:r>
+        <w:t>paper</w:t>
+      </w:r>
+      <w:proofErr w:type="spellEnd"/>
+      <w:r>
+        <w:t>.</w:t>
       </w:r>
     </w:p>
     <w:p>
@@ -1420,14 +2141,1659 @@
           <w:b/>
           <w:bCs/>
         </w:rPr>
-        <w:t xml:space="preserve">EXPERIMENTO B - </w:t>
-      </w:r>
-      <w:r>
-        <w:rPr>
-          <w:b/>
-          <w:bCs/>
-        </w:rPr>
-        <w:t>Correção da validação inicial da Vision Transformer:</w:t>
+        <w:t xml:space="preserve">EXPERIMENTO B </w:t>
+      </w:r>
+      <w:r>
+        <w:rPr>
+          <w:b/>
+          <w:bCs/>
+        </w:rPr>
+        <w:t>–</w:t>
+      </w:r>
+      <w:r>
+        <w:rPr>
+          <w:b/>
+          <w:bCs/>
+        </w:rPr>
+        <w:t xml:space="preserve"> </w:t>
+      </w:r>
+      <w:r>
+        <w:rPr>
+          <w:b/>
+          <w:bCs/>
+        </w:rPr>
+        <w:t xml:space="preserve">Correção da validação inicial da Vision </w:t>
+      </w:r>
+      <w:proofErr w:type="spellStart"/>
+      <w:r>
+        <w:rPr>
+          <w:b/>
+          <w:bCs/>
+        </w:rPr>
+        <w:t>Transformer</w:t>
+      </w:r>
+      <w:proofErr w:type="spellEnd"/>
+      <w:r>
+        <w:rPr>
+          <w:b/>
+          <w:bCs/>
+        </w:rPr>
+        <w:t xml:space="preserve"> e novo treinamento – 24/12/25 (Data de conclusão)</w:t>
+      </w:r>
+      <w:r>
+        <w:rPr>
+          <w:b/>
+          <w:bCs/>
+        </w:rPr>
+        <w:t>:</w:t>
+      </w:r>
+    </w:p>
+    <w:p>
+      <w:pPr>
+        <w:pStyle w:val="PargrafodaLista"/>
+        <w:ind w:left="1440"/>
+        <w:jc w:val="both"/>
+        <w:rPr>
+          <w:b/>
+          <w:bCs/>
+        </w:rPr>
+      </w:pPr>
+    </w:p>
+    <w:p>
+      <w:pPr>
+        <w:pStyle w:val="PargrafodaLista"/>
+        <w:numPr>
+          <w:ilvl w:val="1"/>
+          <w:numId w:val="1"/>
+        </w:numPr>
+        <w:jc w:val="both"/>
+      </w:pPr>
+      <w:r>
+        <w:t xml:space="preserve">O </w:t>
+      </w:r>
+      <w:r>
+        <w:t>seguinte teste</w:t>
+      </w:r>
+      <w:r>
+        <w:t xml:space="preserve"> seguiu o</w:t>
+      </w:r>
+      <w:r>
+        <w:t xml:space="preserve"> mesmo protocolo descrito pelo experimento B, contudo, correções e otimizações foram aplicadas para garantir os melhores resultados possíveis.</w:t>
+      </w:r>
+    </w:p>
+    <w:p>
+      <w:pPr>
+        <w:pStyle w:val="PargrafodaLista"/>
+        <w:numPr>
+          <w:ilvl w:val="1"/>
+          <w:numId w:val="1"/>
+        </w:numPr>
+        <w:jc w:val="both"/>
+      </w:pPr>
+      <w:r>
+        <w:rPr>
+          <w:b/>
+          <w:bCs/>
+        </w:rPr>
+        <w:lastRenderedPageBreak/>
+        <w:t>OBSERVAÇÃO:</w:t>
+      </w:r>
+      <w:r>
+        <w:rPr>
+          <w:b/>
+          <w:bCs/>
+        </w:rPr>
+        <w:t xml:space="preserve"> </w:t>
+      </w:r>
+      <w:r>
+        <w:t xml:space="preserve">Rodar </w:t>
+      </w:r>
+      <w:proofErr w:type="spellStart"/>
+      <w:r>
+        <w:t>ViT</w:t>
+      </w:r>
+      <w:proofErr w:type="spellEnd"/>
+      <w:r>
+        <w:t xml:space="preserve">-B/16 “fiel ao </w:t>
+      </w:r>
+      <w:proofErr w:type="spellStart"/>
+      <w:r>
+        <w:t>paper</w:t>
+      </w:r>
+      <w:proofErr w:type="spellEnd"/>
+      <w:r>
+        <w:t xml:space="preserve">” em hardware comum é naturalmente lento. O artigo foi feito em </w:t>
+      </w:r>
+      <w:proofErr w:type="spellStart"/>
+      <w:r>
+        <w:t>TPUs</w:t>
+      </w:r>
+      <w:proofErr w:type="spellEnd"/>
+      <w:r>
+        <w:t xml:space="preserve"> v3, com batch gigantesco.</w:t>
+      </w:r>
+      <w:r>
+        <w:t xml:space="preserve"> Com isso, a limitação de hardware torna praticamente impossível replicar com exatidão os resultados obtidos. É necessário considerar que o equipamento utilizado para este teste foi:</w:t>
+      </w:r>
+    </w:p>
+    <w:p>
+      <w:pPr>
+        <w:pStyle w:val="PargrafodaLista"/>
+        <w:ind w:left="1440"/>
+        <w:jc w:val="both"/>
+      </w:pPr>
+    </w:p>
+    <w:p>
+      <w:pPr>
+        <w:pStyle w:val="PargrafodaLista"/>
+        <w:ind w:left="1440"/>
+        <w:jc w:val="both"/>
+      </w:pPr>
+      <w:r>
+        <w:t xml:space="preserve">CPU – i7-13620H 10C/26T </w:t>
+      </w:r>
+    </w:p>
+    <w:p>
+      <w:pPr>
+        <w:pStyle w:val="PargrafodaLista"/>
+        <w:ind w:left="1440"/>
+        <w:jc w:val="both"/>
+      </w:pPr>
+      <w:r>
+        <w:t xml:space="preserve">GPU – NVIDIA RTX 4050 Laptop </w:t>
+      </w:r>
+    </w:p>
+    <w:p>
+      <w:pPr>
+        <w:pStyle w:val="PargrafodaLista"/>
+        <w:ind w:left="1440"/>
+        <w:jc w:val="both"/>
+      </w:pPr>
+      <w:r>
+        <w:t>VRAM – 6GB DDR6</w:t>
+      </w:r>
+    </w:p>
+    <w:p>
+      <w:pPr>
+        <w:pStyle w:val="PargrafodaLista"/>
+        <w:ind w:left="1440"/>
+        <w:jc w:val="both"/>
+      </w:pPr>
+      <w:r>
+        <w:t>RAM – 16GB DDR5</w:t>
+      </w:r>
+    </w:p>
+    <w:p>
+      <w:pPr>
+        <w:pStyle w:val="PargrafodaLista"/>
+        <w:ind w:left="1440"/>
+        <w:jc w:val="both"/>
+      </w:pPr>
+      <w:r>
+        <w:t>STORAGE – SSD NVME 480GB</w:t>
+      </w:r>
+    </w:p>
+    <w:p>
+      <w:pPr>
+        <w:pStyle w:val="PargrafodaLista"/>
+        <w:ind w:left="1440"/>
+        <w:jc w:val="both"/>
+      </w:pPr>
+      <w:r>
+        <w:t>S.O – WINDOWS 11</w:t>
+      </w:r>
+    </w:p>
+    <w:p>
+      <w:pPr>
+        <w:pStyle w:val="PargrafodaLista"/>
+        <w:ind w:left="1440"/>
+        <w:jc w:val="both"/>
+      </w:pPr>
+    </w:p>
+    <w:p>
+      <w:pPr>
+        <w:pStyle w:val="PargrafodaLista"/>
+        <w:numPr>
+          <w:ilvl w:val="1"/>
+          <w:numId w:val="1"/>
+        </w:numPr>
+        <w:jc w:val="both"/>
+        <w:rPr>
+          <w:b/>
+          <w:bCs/>
+        </w:rPr>
+      </w:pPr>
+      <w:r>
+        <w:rPr>
+          <w:b/>
+          <w:bCs/>
+        </w:rPr>
+        <w:t>Otimização 1:</w:t>
+      </w:r>
+      <w:r>
+        <w:rPr>
+          <w:b/>
+          <w:bCs/>
+        </w:rPr>
+        <w:t xml:space="preserve"> </w:t>
+      </w:r>
+      <w:r>
+        <w:t>O tamanho do</w:t>
+      </w:r>
+      <w:r>
+        <w:rPr>
+          <w:b/>
+          <w:bCs/>
+        </w:rPr>
+        <w:t xml:space="preserve"> </w:t>
+      </w:r>
+      <w:r>
+        <w:rPr>
+          <w:i/>
+          <w:iCs/>
+        </w:rPr>
+        <w:t>Batch</w:t>
+      </w:r>
+      <w:r>
+        <w:t xml:space="preserve"> foi ampliado para 32 (ao invés de 16 utilizado no teste anterior). Por mais que represente um bom aumento, ainda fica muito abaixo do batch de tamanho efetivo de 4096 utilizado no artigo.</w:t>
+      </w:r>
+    </w:p>
+    <w:p>
+      <w:pPr>
+        <w:pStyle w:val="PargrafodaLista"/>
+        <w:ind w:left="2124"/>
+        <w:jc w:val="both"/>
+      </w:pPr>
+      <w:r>
+        <w:rPr>
+          <w:b/>
+          <w:bCs/>
+        </w:rPr>
+        <w:t xml:space="preserve">OBS: </w:t>
+      </w:r>
+      <w:r>
+        <w:t>Valores mais elevados podem acarretar em OOM, em razão da VRAM disponível</w:t>
+      </w:r>
+    </w:p>
+    <w:p>
+      <w:pPr>
+        <w:pStyle w:val="PargrafodaLista"/>
+        <w:ind w:left="1440"/>
+        <w:jc w:val="both"/>
+      </w:pPr>
+    </w:p>
+    <w:p>
+      <w:pPr>
+        <w:pStyle w:val="PargrafodaLista"/>
+        <w:numPr>
+          <w:ilvl w:val="1"/>
+          <w:numId w:val="1"/>
+        </w:numPr>
+        <w:jc w:val="both"/>
+        <w:rPr>
+          <w:b/>
+          <w:bCs/>
+        </w:rPr>
+      </w:pPr>
+      <w:r>
+        <w:rPr>
+          <w:b/>
+          <w:bCs/>
+        </w:rPr>
+        <w:t xml:space="preserve">Otimização 2: </w:t>
+      </w:r>
+      <w:r>
+        <w:t xml:space="preserve">Utilização de </w:t>
+      </w:r>
+      <w:proofErr w:type="spellStart"/>
+      <w:r>
+        <w:t>Mixed</w:t>
+      </w:r>
+      <w:proofErr w:type="spellEnd"/>
+      <w:r>
+        <w:t xml:space="preserve"> </w:t>
+      </w:r>
+      <w:proofErr w:type="spellStart"/>
+      <w:r>
+        <w:t>Precision</w:t>
+      </w:r>
+      <w:proofErr w:type="spellEnd"/>
+      <w:r>
+        <w:t xml:space="preserve">, consiste em utilizar </w:t>
+      </w:r>
+      <w:r>
+        <w:t>dois tipos de precisão numérica ao mesmo tempo — geralmente 32 bits (float32) e 16 bits (float16)</w:t>
+      </w:r>
+      <w:r>
+        <w:t>. Essa prática garante que:</w:t>
+      </w:r>
+    </w:p>
+    <w:p>
+      <w:pPr>
+        <w:pStyle w:val="PargrafodaLista"/>
+        <w:ind w:left="2124"/>
+        <w:jc w:val="both"/>
+        <w:rPr>
+          <w:b/>
+          <w:bCs/>
+        </w:rPr>
+      </w:pPr>
+      <w:r>
+        <w:rPr>
+          <w:rFonts w:ascii="Segoe UI Emoji" w:hAnsi="Segoe UI Emoji" w:cs="Segoe UI Emoji"/>
+          <w:b/>
+          <w:bCs/>
+        </w:rPr>
+        <w:t>🔹</w:t>
+      </w:r>
+      <w:r>
+        <w:rPr>
+          <w:b/>
+          <w:bCs/>
+        </w:rPr>
+        <w:t xml:space="preserve"> Mai</w:t>
+      </w:r>
+      <w:r>
+        <w:rPr>
+          <w:b/>
+          <w:bCs/>
+        </w:rPr>
+        <w:t>or</w:t>
+      </w:r>
+      <w:r>
+        <w:rPr>
+          <w:b/>
+          <w:bCs/>
+        </w:rPr>
+        <w:t xml:space="preserve"> </w:t>
+      </w:r>
+      <w:r>
+        <w:rPr>
+          <w:b/>
+          <w:bCs/>
+        </w:rPr>
+        <w:t>velocidade</w:t>
+      </w:r>
+      <w:r>
+        <w:rPr>
+          <w:b/>
+          <w:bCs/>
+        </w:rPr>
+        <w:t xml:space="preserve">: </w:t>
+      </w:r>
+      <w:r>
+        <w:t>cálculos em 16 bits são executados mais rapidamente, principalmente em GPUs modernas.</w:t>
+      </w:r>
+    </w:p>
+    <w:p>
+      <w:pPr>
+        <w:pStyle w:val="PargrafodaLista"/>
+        <w:ind w:left="2124"/>
+        <w:jc w:val="both"/>
+        <w:rPr>
+          <w:b/>
+          <w:bCs/>
+        </w:rPr>
+      </w:pPr>
+      <w:r>
+        <w:rPr>
+          <w:rFonts w:ascii="Segoe UI Emoji" w:hAnsi="Segoe UI Emoji" w:cs="Segoe UI Emoji"/>
+          <w:b/>
+          <w:bCs/>
+        </w:rPr>
+        <w:t>🔹</w:t>
+      </w:r>
+      <w:r>
+        <w:rPr>
+          <w:b/>
+          <w:bCs/>
+        </w:rPr>
+        <w:t xml:space="preserve"> Menos memória: </w:t>
+      </w:r>
+      <w:r>
+        <w:t xml:space="preserve">números menores ocupam menos espaço, permitindo treinar modelos maiores ou usar batch </w:t>
+      </w:r>
+      <w:proofErr w:type="spellStart"/>
+      <w:r>
+        <w:t>sizes</w:t>
+      </w:r>
+      <w:proofErr w:type="spellEnd"/>
+      <w:r>
+        <w:t xml:space="preserve"> maiores.</w:t>
+      </w:r>
+    </w:p>
+    <w:p>
+      <w:pPr>
+        <w:pStyle w:val="PargrafodaLista"/>
+        <w:ind w:left="2124"/>
+        <w:jc w:val="both"/>
+      </w:pPr>
+      <w:r>
+        <w:rPr>
+          <w:rFonts w:ascii="Segoe UI Emoji" w:hAnsi="Segoe UI Emoji" w:cs="Segoe UI Emoji"/>
+          <w:b/>
+          <w:bCs/>
+        </w:rPr>
+        <w:t>🔹</w:t>
+      </w:r>
+      <w:r>
+        <w:rPr>
+          <w:b/>
+          <w:bCs/>
+        </w:rPr>
+        <w:t xml:space="preserve"> Mesma qualidade (na prática): </w:t>
+      </w:r>
+      <w:r>
+        <w:t>partes críticas do treinamento continuam em 32 bits para evitar erros numéricos.</w:t>
+      </w:r>
+    </w:p>
+    <w:p>
+      <w:pPr>
+        <w:pStyle w:val="PargrafodaLista"/>
+        <w:ind w:left="2124"/>
+        <w:jc w:val="both"/>
+      </w:pPr>
+    </w:p>
+    <w:p>
+      <w:pPr>
+        <w:pStyle w:val="PargrafodaLista"/>
+        <w:numPr>
+          <w:ilvl w:val="1"/>
+          <w:numId w:val="1"/>
+        </w:numPr>
+        <w:jc w:val="both"/>
+        <w:rPr>
+          <w:b/>
+          <w:bCs/>
+        </w:rPr>
+      </w:pPr>
+      <w:r>
+        <w:rPr>
+          <w:b/>
+          <w:bCs/>
+        </w:rPr>
+        <w:t xml:space="preserve">Otimização </w:t>
+      </w:r>
+      <w:r>
+        <w:rPr>
+          <w:b/>
+          <w:bCs/>
+        </w:rPr>
+        <w:t>3</w:t>
+      </w:r>
+      <w:r>
+        <w:rPr>
+          <w:b/>
+          <w:bCs/>
+        </w:rPr>
+        <w:t xml:space="preserve">: </w:t>
+      </w:r>
+      <w:r>
+        <w:t>learning rate alterada de 0.01 para 2e-4</w:t>
+      </w:r>
+      <w:r>
+        <w:t xml:space="preserve">. Inicialmente é importante compreender que o </w:t>
+      </w:r>
+      <w:proofErr w:type="spellStart"/>
+      <w:r>
+        <w:t>base_lr</w:t>
+      </w:r>
+      <w:proofErr w:type="spellEnd"/>
+      <w:r>
+        <w:t xml:space="preserve"> representa </w:t>
+      </w:r>
+      <w:r>
+        <w:t xml:space="preserve">o valor máximo do learning rate durante o </w:t>
+      </w:r>
+      <w:r>
+        <w:t>pré-treino</w:t>
+      </w:r>
+      <w:r>
+        <w:t>, não o valor constante.</w:t>
+      </w:r>
+      <w:r>
+        <w:t xml:space="preserve"> Sendo</w:t>
+      </w:r>
+      <w:r>
+        <w:t xml:space="preserve"> usado dentro de um </w:t>
+      </w:r>
+      <w:proofErr w:type="spellStart"/>
+      <w:r>
+        <w:t>scheduler</w:t>
+      </w:r>
+      <w:proofErr w:type="spellEnd"/>
+      <w:r>
+        <w:t xml:space="preserve"> (</w:t>
+      </w:r>
+      <w:proofErr w:type="spellStart"/>
+      <w:r>
+        <w:t>warmup</w:t>
+      </w:r>
+      <w:proofErr w:type="spellEnd"/>
+      <w:r>
+        <w:t xml:space="preserve"> + </w:t>
+      </w:r>
+      <w:proofErr w:type="spellStart"/>
+      <w:r>
+        <w:t>cosine</w:t>
+      </w:r>
+      <w:proofErr w:type="spellEnd"/>
+      <w:r>
+        <w:t xml:space="preserve"> </w:t>
+      </w:r>
+      <w:proofErr w:type="spellStart"/>
+      <w:r>
+        <w:t>decay</w:t>
+      </w:r>
+      <w:proofErr w:type="spellEnd"/>
+      <w:r>
+        <w:t>).</w:t>
+      </w:r>
+    </w:p>
+    <w:p>
+      <w:pPr>
+        <w:pStyle w:val="PargrafodaLista"/>
+        <w:ind w:left="2124"/>
+        <w:jc w:val="both"/>
+      </w:pPr>
+      <w:r>
+        <w:rPr>
+          <w:rFonts w:ascii="Segoe UI Emoji" w:hAnsi="Segoe UI Emoji" w:cs="Segoe UI Emoji"/>
+          <w:b/>
+          <w:bCs/>
+        </w:rPr>
+        <w:t>🔹</w:t>
+      </w:r>
+      <w:r>
+        <w:rPr>
+          <w:b/>
+          <w:bCs/>
+        </w:rPr>
+        <w:t xml:space="preserve"> </w:t>
+      </w:r>
+      <w:r>
+        <w:t xml:space="preserve">Para fine </w:t>
+      </w:r>
+      <w:proofErr w:type="spellStart"/>
+      <w:r>
+        <w:t>tunning</w:t>
+      </w:r>
+      <w:proofErr w:type="spellEnd"/>
+      <w:r>
+        <w:t>, o artigo n</w:t>
+      </w:r>
+      <w:r>
+        <w:t>ão fixa um único LR universal, porque ele depende d</w:t>
+      </w:r>
+      <w:r>
+        <w:t xml:space="preserve">o </w:t>
+      </w:r>
+      <w:r>
+        <w:t xml:space="preserve">batch </w:t>
+      </w:r>
+      <w:proofErr w:type="spellStart"/>
+      <w:r>
+        <w:t>size</w:t>
+      </w:r>
+      <w:proofErr w:type="spellEnd"/>
+      <w:r>
+        <w:t xml:space="preserve">, </w:t>
+      </w:r>
+      <w:r>
+        <w:t xml:space="preserve">se o </w:t>
+      </w:r>
+      <w:proofErr w:type="spellStart"/>
+      <w:r>
+        <w:t>backbone</w:t>
+      </w:r>
+      <w:proofErr w:type="spellEnd"/>
+      <w:r>
+        <w:t xml:space="preserve"> é congelado</w:t>
+      </w:r>
+      <w:r>
+        <w:t xml:space="preserve">, </w:t>
+      </w:r>
+      <w:r>
+        <w:t xml:space="preserve">se a </w:t>
+      </w:r>
+      <w:proofErr w:type="spellStart"/>
+      <w:r>
+        <w:t>head</w:t>
+      </w:r>
+      <w:proofErr w:type="spellEnd"/>
+      <w:r>
+        <w:t xml:space="preserve"> é inicializada do zero</w:t>
+      </w:r>
+      <w:r>
+        <w:t xml:space="preserve"> e da </w:t>
+      </w:r>
+      <w:r>
+        <w:t>resolução da imagem</w:t>
+      </w:r>
+      <w:r>
+        <w:t xml:space="preserve">. No teste atual </w:t>
+      </w:r>
+      <w:r>
+        <w:t>0.01 é um LR muito alto</w:t>
+      </w:r>
+      <w:r>
+        <w:t xml:space="preserve">, </w:t>
+      </w:r>
+      <w:r>
+        <w:t>o que leva o</w:t>
+      </w:r>
+      <w:r>
+        <w:t xml:space="preserve"> gradiente</w:t>
+      </w:r>
+      <w:r>
+        <w:t xml:space="preserve"> a</w:t>
+      </w:r>
+      <w:r>
+        <w:t xml:space="preserve"> destr</w:t>
+      </w:r>
+      <w:r>
+        <w:t xml:space="preserve">uir </w:t>
+      </w:r>
+      <w:r>
+        <w:t xml:space="preserve">as features </w:t>
+      </w:r>
+      <w:proofErr w:type="spellStart"/>
+      <w:r>
+        <w:t>pré</w:t>
+      </w:r>
+      <w:proofErr w:type="spellEnd"/>
+      <w:r>
+        <w:t>-treinadas</w:t>
+      </w:r>
+      <w:r>
+        <w:t>, com isso, o</w:t>
+      </w:r>
+      <w:r>
+        <w:t xml:space="preserve"> modelo entra em um regime parecido com treino do zero</w:t>
+      </w:r>
+      <w:r>
+        <w:t>.</w:t>
+      </w:r>
+    </w:p>
+    <w:p>
+      <w:pPr>
+        <w:ind w:left="1416" w:firstLine="708"/>
+        <w:jc w:val="both"/>
+      </w:pPr>
+      <w:r>
+        <w:drawing>
+          <wp:inline distT="0" distB="0" distL="0" distR="0" wp14:anchorId="40E0F526" wp14:editId="4E067381">
+            <wp:extent cx="2916393" cy="1493520"/>
+            <wp:effectExtent l="0" t="0" r="0" b="0"/>
+            <wp:docPr id="1093551988" name="Imagem 1"/>
+            <wp:cNvGraphicFramePr>
+              <a:graphicFrameLocks xmlns:a="http://schemas.openxmlformats.org/drawingml/2006/main" noChangeAspect="1"/>
+            </wp:cNvGraphicFramePr>
+            <a:graphic xmlns:a="http://schemas.openxmlformats.org/drawingml/2006/main">
+              <a:graphicData uri="http://schemas.openxmlformats.org/drawingml/2006/picture">
+                <pic:pic xmlns:pic="http://schemas.openxmlformats.org/drawingml/2006/picture">
+                  <pic:nvPicPr>
+                    <pic:cNvPr id="1093551988" name=""/>
+                    <pic:cNvPicPr/>
+                  </pic:nvPicPr>
+                  <pic:blipFill>
+                    <a:blip r:embed="rId13"/>
+                    <a:stretch>
+                      <a:fillRect/>
+                    </a:stretch>
+                  </pic:blipFill>
+                  <pic:spPr>
+                    <a:xfrm>
+                      <a:off x="0" y="0"/>
+                      <a:ext cx="2923241" cy="1497027"/>
+                    </a:xfrm>
+                    <a:prstGeom prst="rect">
+                      <a:avLst/>
+                    </a:prstGeom>
+                  </pic:spPr>
+                </pic:pic>
+              </a:graphicData>
+            </a:graphic>
+          </wp:inline>
+        </w:drawing>
+      </w:r>
+    </w:p>
+    <w:p>
+      <w:pPr>
+        <w:ind w:left="1416"/>
+        <w:jc w:val="both"/>
+      </w:pPr>
+      <w:r>
+        <w:rPr>
+          <w:b/>
+          <w:bCs/>
+        </w:rPr>
+        <w:lastRenderedPageBreak/>
+        <w:t>OBSERVAÇÃO</w:t>
+      </w:r>
+      <w:r>
+        <w:t xml:space="preserve"> – Uso do </w:t>
+      </w:r>
+      <w:proofErr w:type="spellStart"/>
+      <w:r>
+        <w:t>scheduler</w:t>
+      </w:r>
+      <w:proofErr w:type="spellEnd"/>
+      <w:r>
+        <w:t>:</w:t>
+      </w:r>
+    </w:p>
+    <w:p>
+      <w:pPr>
+        <w:ind w:left="1416"/>
+      </w:pPr>
+      <w:r>
+        <w:drawing>
+          <wp:inline distT="0" distB="0" distL="0" distR="0" wp14:anchorId="1B8B5FD1" wp14:editId="69A9A4EA">
+            <wp:extent cx="3474720" cy="2500622"/>
+            <wp:effectExtent l="0" t="0" r="0" b="0"/>
+            <wp:docPr id="955850465" name="Imagem 1"/>
+            <wp:cNvGraphicFramePr>
+              <a:graphicFrameLocks xmlns:a="http://schemas.openxmlformats.org/drawingml/2006/main" noChangeAspect="1"/>
+            </wp:cNvGraphicFramePr>
+            <a:graphic xmlns:a="http://schemas.openxmlformats.org/drawingml/2006/main">
+              <a:graphicData uri="http://schemas.openxmlformats.org/drawingml/2006/picture">
+                <pic:pic xmlns:pic="http://schemas.openxmlformats.org/drawingml/2006/picture">
+                  <pic:nvPicPr>
+                    <pic:cNvPr id="955850465" name=""/>
+                    <pic:cNvPicPr/>
+                  </pic:nvPicPr>
+                  <pic:blipFill>
+                    <a:blip r:embed="rId14"/>
+                    <a:stretch>
+                      <a:fillRect/>
+                    </a:stretch>
+                  </pic:blipFill>
+                  <pic:spPr>
+                    <a:xfrm>
+                      <a:off x="0" y="0"/>
+                      <a:ext cx="3485065" cy="2508067"/>
+                    </a:xfrm>
+                    <a:prstGeom prst="rect">
+                      <a:avLst/>
+                    </a:prstGeom>
+                  </pic:spPr>
+                </pic:pic>
+              </a:graphicData>
+            </a:graphic>
+          </wp:inline>
+        </w:drawing>
+      </w:r>
+    </w:p>
+    <w:p>
+      <w:pPr>
+        <w:pStyle w:val="PargrafodaLista"/>
+        <w:numPr>
+          <w:ilvl w:val="1"/>
+          <w:numId w:val="1"/>
+        </w:numPr>
+        <w:jc w:val="both"/>
+        <w:rPr>
+          <w:b/>
+          <w:bCs/>
+        </w:rPr>
+      </w:pPr>
+      <w:r>
+        <w:rPr>
+          <w:b/>
+          <w:bCs/>
+        </w:rPr>
+        <w:t>Configuração da Arquitetura:</w:t>
+      </w:r>
+    </w:p>
+    <w:p>
+      <w:pPr>
+        <w:pStyle w:val="PargrafodaLista"/>
+        <w:ind w:left="1440"/>
+        <w:jc w:val="both"/>
+      </w:pPr>
+      <w:r>
+        <w:rPr>
+          <w:b/>
+          <w:bCs/>
+        </w:rPr>
+        <w:t xml:space="preserve">OBS: </w:t>
+      </w:r>
+      <w:r>
+        <w:t>Valores conferidos em código</w:t>
+      </w:r>
+    </w:p>
+    <w:p>
+      <w:pPr>
+        <w:pStyle w:val="PargrafodaLista"/>
+        <w:ind w:left="1440"/>
+        <w:jc w:val="both"/>
+        <w:rPr>
+          <w:b/>
+          <w:bCs/>
+        </w:rPr>
+      </w:pPr>
+      <w:r>
+        <w:rPr>
+          <w:b/>
+          <w:bCs/>
+        </w:rPr>
+        <w:drawing>
+          <wp:inline distT="0" distB="0" distL="0" distR="0" wp14:anchorId="1AC8F651" wp14:editId="28EE306B">
+            <wp:extent cx="3467100" cy="2334225"/>
+            <wp:effectExtent l="0" t="0" r="0" b="9525"/>
+            <wp:docPr id="1246954443" name="Imagem 1"/>
+            <wp:cNvGraphicFramePr>
+              <a:graphicFrameLocks xmlns:a="http://schemas.openxmlformats.org/drawingml/2006/main" noChangeAspect="1"/>
+            </wp:cNvGraphicFramePr>
+            <a:graphic xmlns:a="http://schemas.openxmlformats.org/drawingml/2006/main">
+              <a:graphicData uri="http://schemas.openxmlformats.org/drawingml/2006/picture">
+                <pic:pic xmlns:pic="http://schemas.openxmlformats.org/drawingml/2006/picture">
+                  <pic:nvPicPr>
+                    <pic:cNvPr id="1246954443" name=""/>
+                    <pic:cNvPicPr/>
+                  </pic:nvPicPr>
+                  <pic:blipFill>
+                    <a:blip r:embed="rId15"/>
+                    <a:stretch>
+                      <a:fillRect/>
+                    </a:stretch>
+                  </pic:blipFill>
+                  <pic:spPr>
+                    <a:xfrm>
+                      <a:off x="0" y="0"/>
+                      <a:ext cx="3482843" cy="2344824"/>
+                    </a:xfrm>
+                    <a:prstGeom prst="rect">
+                      <a:avLst/>
+                    </a:prstGeom>
+                  </pic:spPr>
+                </pic:pic>
+              </a:graphicData>
+            </a:graphic>
+          </wp:inline>
+        </w:drawing>
+      </w:r>
+    </w:p>
+    <w:p>
+      <w:pPr>
+        <w:pStyle w:val="PargrafodaLista"/>
+        <w:ind w:left="1440"/>
+        <w:jc w:val="both"/>
+        <w:rPr>
+          <w:b/>
+          <w:bCs/>
+        </w:rPr>
+      </w:pPr>
+    </w:p>
+    <w:p>
+      <w:pPr>
+        <w:pStyle w:val="PargrafodaLista"/>
+        <w:numPr>
+          <w:ilvl w:val="1"/>
+          <w:numId w:val="1"/>
+        </w:numPr>
+        <w:jc w:val="both"/>
+        <w:rPr>
+          <w:b/>
+          <w:bCs/>
+        </w:rPr>
+      </w:pPr>
+      <w:r>
+        <w:rPr>
+          <w:b/>
+          <w:bCs/>
+        </w:rPr>
+        <w:t>Configuração do treinamento (Fine-</w:t>
+      </w:r>
+      <w:proofErr w:type="spellStart"/>
+      <w:r>
+        <w:rPr>
+          <w:b/>
+          <w:bCs/>
+        </w:rPr>
+        <w:t>Tunning</w:t>
+      </w:r>
+      <w:proofErr w:type="spellEnd"/>
+      <w:r>
+        <w:rPr>
+          <w:b/>
+          <w:bCs/>
+        </w:rPr>
+        <w:t>):</w:t>
+      </w:r>
+    </w:p>
+    <w:p>
+      <w:pPr>
+        <w:pStyle w:val="PargrafodaLista"/>
+        <w:ind w:left="1440"/>
+        <w:jc w:val="both"/>
+        <w:rPr>
+          <w:b/>
+          <w:bCs/>
+        </w:rPr>
+      </w:pPr>
+      <w:r>
+        <w:rPr>
+          <w:b/>
+          <w:bCs/>
+        </w:rPr>
+        <w:drawing>
+          <wp:inline distT="0" distB="0" distL="0" distR="0" wp14:anchorId="3010F1A0" wp14:editId="6C5E1A28">
+            <wp:extent cx="3596640" cy="2387046"/>
+            <wp:effectExtent l="0" t="0" r="3810" b="0"/>
+            <wp:docPr id="1804769435" name="Imagem 1"/>
+            <wp:cNvGraphicFramePr>
+              <a:graphicFrameLocks xmlns:a="http://schemas.openxmlformats.org/drawingml/2006/main" noChangeAspect="1"/>
+            </wp:cNvGraphicFramePr>
+            <a:graphic xmlns:a="http://schemas.openxmlformats.org/drawingml/2006/main">
+              <a:graphicData uri="http://schemas.openxmlformats.org/drawingml/2006/picture">
+                <pic:pic xmlns:pic="http://schemas.openxmlformats.org/drawingml/2006/picture">
+                  <pic:nvPicPr>
+                    <pic:cNvPr id="1804769435" name=""/>
+                    <pic:cNvPicPr/>
+                  </pic:nvPicPr>
+                  <pic:blipFill>
+                    <a:blip r:embed="rId16"/>
+                    <a:stretch>
+                      <a:fillRect/>
+                    </a:stretch>
+                  </pic:blipFill>
+                  <pic:spPr>
+                    <a:xfrm>
+                      <a:off x="0" y="0"/>
+                      <a:ext cx="3602795" cy="2391131"/>
+                    </a:xfrm>
+                    <a:prstGeom prst="rect">
+                      <a:avLst/>
+                    </a:prstGeom>
+                  </pic:spPr>
+                </pic:pic>
+              </a:graphicData>
+            </a:graphic>
+          </wp:inline>
+        </w:drawing>
+      </w:r>
+    </w:p>
+    <w:p>
+      <w:pPr>
+        <w:pStyle w:val="PargrafodaLista"/>
+        <w:ind w:left="1440"/>
+        <w:jc w:val="both"/>
+        <w:rPr>
+          <w:b/>
+          <w:bCs/>
+        </w:rPr>
+      </w:pPr>
+    </w:p>
+    <w:p>
+      <w:pPr>
+        <w:pStyle w:val="PargrafodaLista"/>
+        <w:jc w:val="both"/>
+        <w:rPr>
+          <w:b/>
+          <w:bCs/>
+        </w:rPr>
+      </w:pPr>
+    </w:p>
+    <w:p>
+      <w:pPr>
+        <w:pStyle w:val="PargrafodaLista"/>
+        <w:numPr>
+          <w:ilvl w:val="1"/>
+          <w:numId w:val="1"/>
+        </w:numPr>
+        <w:jc w:val="both"/>
+        <w:rPr>
+          <w:b/>
+          <w:bCs/>
+        </w:rPr>
+      </w:pPr>
+      <w:r>
+        <w:rPr>
+          <w:b/>
+          <w:bCs/>
+        </w:rPr>
+        <w:lastRenderedPageBreak/>
+        <w:t>Resultados obtidos e Análise</w:t>
+      </w:r>
+      <w:r>
+        <w:rPr>
+          <w:b/>
+          <w:bCs/>
+        </w:rPr>
+        <w:t xml:space="preserve"> (Ver arquivo ‘logs pycharm.txt’ no diretório </w:t>
+      </w:r>
+      <w:r>
+        <w:rPr>
+          <w:b/>
+          <w:bCs/>
+        </w:rPr>
+        <w:t xml:space="preserve">Treino 2 - 20K - </w:t>
+      </w:r>
+      <w:proofErr w:type="spellStart"/>
+      <w:r>
+        <w:rPr>
+          <w:b/>
+          <w:bCs/>
+        </w:rPr>
+        <w:t>FineTunning</w:t>
+      </w:r>
+      <w:proofErr w:type="spellEnd"/>
+      <w:r>
+        <w:rPr>
+          <w:b/>
+          <w:bCs/>
+        </w:rPr>
+        <w:t>)</w:t>
+      </w:r>
+      <w:r>
+        <w:rPr>
+          <w:b/>
+          <w:bCs/>
+        </w:rPr>
+        <w:t>:</w:t>
+      </w:r>
+    </w:p>
+    <w:p>
+      <w:pPr>
+        <w:ind w:left="1440"/>
+        <w:jc w:val="both"/>
+        <w:rPr>
+          <w:b/>
+          <w:bCs/>
+        </w:rPr>
+      </w:pPr>
+      <w:r>
+        <w:rPr>
+          <w:b/>
+          <w:bCs/>
+        </w:rPr>
+        <w:t>PERDA:</w:t>
+      </w:r>
+    </w:p>
+    <w:p>
+      <w:pPr>
+        <w:pStyle w:val="PargrafodaLista"/>
+        <w:numPr>
+          <w:ilvl w:val="0"/>
+          <w:numId w:val="4"/>
+        </w:numPr>
+        <w:jc w:val="both"/>
+      </w:pPr>
+      <w:r>
+        <w:t>O início do treinamento apresenta</w:t>
+      </w:r>
+      <w:r>
+        <w:t xml:space="preserve"> </w:t>
+      </w:r>
+      <w:proofErr w:type="spellStart"/>
+      <w:r>
+        <w:t>loss</w:t>
+      </w:r>
+      <w:proofErr w:type="spellEnd"/>
+      <w:r>
+        <w:t xml:space="preserve"> ≈ 6.90, que é exatamente o valor esperado para </w:t>
+      </w:r>
+      <w:proofErr w:type="spellStart"/>
+      <w:r>
+        <w:rPr>
+          <w:i/>
+          <w:iCs/>
+        </w:rPr>
+        <w:t>cross-entropy</w:t>
+      </w:r>
+      <w:proofErr w:type="spellEnd"/>
+      <w:r>
+        <w:rPr>
+          <w:i/>
+          <w:iCs/>
+        </w:rPr>
+        <w:t xml:space="preserve"> com 1000</w:t>
+      </w:r>
+      <w:r>
+        <w:t>. A</w:t>
+      </w:r>
+      <w:r>
+        <w:t>o final do treinamento, esse valor reduz para 6.20 o que demonstra um aprendizado efetivo do modelo, mesmo que extremamente lento.</w:t>
+      </w:r>
+    </w:p>
+    <w:p>
+      <w:pPr>
+        <w:pStyle w:val="PargrafodaLista"/>
+        <w:numPr>
+          <w:ilvl w:val="0"/>
+          <w:numId w:val="4"/>
+        </w:numPr>
+        <w:jc w:val="both"/>
+      </w:pPr>
+      <w:r>
+        <w:t xml:space="preserve">Os resultados apresentam uma </w:t>
+      </w:r>
+      <w:r>
+        <w:t xml:space="preserve">curva </w:t>
+      </w:r>
+      <w:proofErr w:type="spellStart"/>
+      <w:r>
+        <w:rPr>
+          <w:b/>
+          <w:bCs/>
+        </w:rPr>
+        <w:t>monotonicamente</w:t>
+      </w:r>
+      <w:proofErr w:type="spellEnd"/>
+      <w:r>
+        <w:rPr>
+          <w:b/>
+          <w:bCs/>
+        </w:rPr>
+        <w:t xml:space="preserve"> decrescente</w:t>
+      </w:r>
+      <w:r>
+        <w:t>, sem explosão</w:t>
+      </w:r>
+      <w:r>
+        <w:t>, o que implica em um</w:t>
+      </w:r>
+      <w:r>
+        <w:t xml:space="preserve"> </w:t>
+      </w:r>
+      <w:r>
+        <w:rPr>
+          <w:b/>
+          <w:bCs/>
+        </w:rPr>
+        <w:t>treinamento estável</w:t>
+      </w:r>
+      <w:r>
+        <w:t>.</w:t>
+      </w:r>
+    </w:p>
+    <w:p>
+      <w:pPr>
+        <w:pStyle w:val="PargrafodaLista"/>
+        <w:ind w:left="1416"/>
+        <w:jc w:val="both"/>
+      </w:pPr>
+      <w:r>
+        <w:drawing>
+          <wp:inline distT="0" distB="0" distL="0" distR="0" wp14:anchorId="3BC545A1" wp14:editId="40BE3285">
+            <wp:extent cx="4503420" cy="2542441"/>
+            <wp:effectExtent l="0" t="0" r="0" b="0"/>
+            <wp:docPr id="2026149223" name="Imagem 1"/>
+            <wp:cNvGraphicFramePr>
+              <a:graphicFrameLocks xmlns:a="http://schemas.openxmlformats.org/drawingml/2006/main" noChangeAspect="1"/>
+            </wp:cNvGraphicFramePr>
+            <a:graphic xmlns:a="http://schemas.openxmlformats.org/drawingml/2006/main">
+              <a:graphicData uri="http://schemas.openxmlformats.org/drawingml/2006/picture">
+                <pic:pic xmlns:pic="http://schemas.openxmlformats.org/drawingml/2006/picture">
+                  <pic:nvPicPr>
+                    <pic:cNvPr id="2026149223" name=""/>
+                    <pic:cNvPicPr/>
+                  </pic:nvPicPr>
+                  <pic:blipFill>
+                    <a:blip r:embed="rId17"/>
+                    <a:stretch>
+                      <a:fillRect/>
+                    </a:stretch>
+                  </pic:blipFill>
+                  <pic:spPr>
+                    <a:xfrm>
+                      <a:off x="0" y="0"/>
+                      <a:ext cx="4512039" cy="2547307"/>
+                    </a:xfrm>
+                    <a:prstGeom prst="rect">
+                      <a:avLst/>
+                    </a:prstGeom>
+                  </pic:spPr>
+                </pic:pic>
+              </a:graphicData>
+            </a:graphic>
+          </wp:inline>
+        </w:drawing>
+      </w:r>
+    </w:p>
+    <w:p>
+      <w:pPr>
+        <w:ind w:left="1416"/>
+        <w:jc w:val="both"/>
+        <w:rPr>
+          <w:b/>
+          <w:bCs/>
+        </w:rPr>
+      </w:pPr>
+      <w:r>
+        <w:rPr>
+          <w:b/>
+          <w:bCs/>
+        </w:rPr>
+        <w:t>ACURÁCIA</w:t>
+      </w:r>
+      <w:r>
+        <w:rPr>
+          <w:b/>
+          <w:bCs/>
+        </w:rPr>
+        <w:t>:</w:t>
+      </w:r>
+    </w:p>
+    <w:p>
+      <w:pPr>
+        <w:pStyle w:val="PargrafodaLista"/>
+        <w:numPr>
+          <w:ilvl w:val="0"/>
+          <w:numId w:val="5"/>
+        </w:numPr>
+        <w:jc w:val="both"/>
+      </w:pPr>
+      <w:r>
+        <w:t>A acurácia</w:t>
+      </w:r>
+      <w:r>
+        <w:t xml:space="preserve"> de treino oscila entre 50% e 90% em batches pequenos.</w:t>
+      </w:r>
+      <w:r>
+        <w:t xml:space="preserve"> </w:t>
+      </w:r>
+      <w:r>
+        <w:t>Isso</w:t>
+      </w:r>
+      <w:r>
+        <w:t xml:space="preserve"> é esperado, uma vez que este valor NÃO representa a</w:t>
+      </w:r>
+      <w:r>
+        <w:t xml:space="preserve"> </w:t>
+      </w:r>
+      <w:r>
+        <w:t>acurácia</w:t>
+      </w:r>
+      <w:r>
+        <w:t xml:space="preserve"> global, </w:t>
+      </w:r>
+      <w:r>
+        <w:t>mas sim a</w:t>
+      </w:r>
+      <w:r>
+        <w:t xml:space="preserve"> ac</w:t>
+      </w:r>
+      <w:r>
+        <w:t>urácia</w:t>
+      </w:r>
+      <w:r>
+        <w:t xml:space="preserve"> por batch.</w:t>
+      </w:r>
+      <w:r>
+        <w:t xml:space="preserve"> </w:t>
+      </w:r>
+      <w:proofErr w:type="spellStart"/>
+      <w:r>
+        <w:t>Accuracy</w:t>
+      </w:r>
+      <w:proofErr w:type="spellEnd"/>
+      <w:r>
+        <w:t xml:space="preserve"> de batch em </w:t>
+      </w:r>
+      <w:proofErr w:type="spellStart"/>
+      <w:r>
+        <w:t>ImageNet</w:t>
+      </w:r>
+      <w:proofErr w:type="spellEnd"/>
+      <w:r>
+        <w:t xml:space="preserve"> </w:t>
+      </w:r>
+      <w:r>
+        <w:t xml:space="preserve">já </w:t>
+      </w:r>
+      <w:r>
+        <w:t>é</w:t>
+      </w:r>
+      <w:r>
+        <w:t xml:space="preserve"> </w:t>
+      </w:r>
+      <w:r>
+        <w:t>extremamente ruidosa</w:t>
+      </w:r>
+      <w:r>
+        <w:t xml:space="preserve"> e um</w:t>
+      </w:r>
+      <w:r>
+        <w:t xml:space="preserve"> batch</w:t>
+      </w:r>
+      <w:r>
+        <w:t xml:space="preserve"> pequeno piora ainda mais este resultado.</w:t>
+      </w:r>
+    </w:p>
+    <w:p>
+      <w:pPr>
+        <w:pStyle w:val="PargrafodaLista"/>
+        <w:numPr>
+          <w:ilvl w:val="0"/>
+          <w:numId w:val="5"/>
+        </w:numPr>
+        <w:jc w:val="both"/>
+      </w:pPr>
+      <w:r>
+        <w:t xml:space="preserve"> </w:t>
+      </w:r>
+      <w:r>
+        <w:t>Podem haver batches com</w:t>
+      </w:r>
+      <w:r>
+        <w:t xml:space="preserve"> classes</w:t>
+      </w:r>
+      <w:r>
+        <w:t xml:space="preserve"> mais</w:t>
+      </w:r>
+      <w:r>
+        <w:t xml:space="preserve"> fáceis </w:t>
+      </w:r>
+      <w:r>
+        <w:t xml:space="preserve">de se aprender e classificar, o que resulta em uma </w:t>
+      </w:r>
+      <w:proofErr w:type="spellStart"/>
+      <w:r>
+        <w:t>acc</w:t>
+      </w:r>
+      <w:proofErr w:type="spellEnd"/>
+      <w:r>
+        <w:t xml:space="preserve"> alta e o</w:t>
+      </w:r>
+      <w:r>
+        <w:t xml:space="preserve">utro batch </w:t>
+      </w:r>
+      <w:r>
+        <w:t>contendo</w:t>
+      </w:r>
+      <w:r>
+        <w:t xml:space="preserve"> classes</w:t>
+      </w:r>
+      <w:r>
+        <w:t xml:space="preserve"> mais</w:t>
+      </w:r>
+      <w:r>
+        <w:t xml:space="preserve"> difíceis</w:t>
+      </w:r>
+      <w:r>
+        <w:t xml:space="preserve"> de operar, resultando em uma</w:t>
+      </w:r>
+      <w:r>
+        <w:t xml:space="preserve"> </w:t>
+      </w:r>
+      <w:proofErr w:type="spellStart"/>
+      <w:r>
+        <w:t>acc</w:t>
+      </w:r>
+      <w:proofErr w:type="spellEnd"/>
+      <w:r>
+        <w:t xml:space="preserve"> baixa</w:t>
+      </w:r>
+      <w:r>
+        <w:t>.</w:t>
+      </w:r>
+    </w:p>
+    <w:p>
+      <w:pPr>
+        <w:pStyle w:val="PargrafodaLista"/>
+        <w:numPr>
+          <w:ilvl w:val="0"/>
+          <w:numId w:val="5"/>
+        </w:numPr>
+        <w:jc w:val="both"/>
+      </w:pPr>
+      <w:r>
+        <w:t xml:space="preserve">Como conclusão, os valores de </w:t>
+      </w:r>
+      <w:r>
+        <w:rPr>
+          <w:b/>
+          <w:bCs/>
+        </w:rPr>
+        <w:t xml:space="preserve">acurácia </w:t>
+      </w:r>
+      <w:r>
+        <w:t xml:space="preserve">apresentados pelo log do </w:t>
+      </w:r>
+      <w:proofErr w:type="spellStart"/>
+      <w:r>
+        <w:t>pycharm</w:t>
+      </w:r>
+      <w:proofErr w:type="spellEnd"/>
+      <w:r>
+        <w:t xml:space="preserve"> não são necessariamente preocupantes.</w:t>
+      </w:r>
+    </w:p>
+    <w:p>
+      <w:pPr>
+        <w:ind w:left="708" w:firstLine="708"/>
+        <w:jc w:val="both"/>
+        <w:rPr>
+          <w:b/>
+          <w:bCs/>
+        </w:rPr>
+      </w:pPr>
+      <w:r>
+        <w:rPr>
+          <w:b/>
+          <w:bCs/>
+        </w:rPr>
+        <w:t>VALIDAÇÃO</w:t>
+      </w:r>
+      <w:r>
+        <w:rPr>
+          <w:b/>
+          <w:bCs/>
+        </w:rPr>
+        <w:t>:</w:t>
+      </w:r>
+    </w:p>
+    <w:p>
+      <w:pPr>
+        <w:pStyle w:val="PargrafodaLista"/>
+        <w:numPr>
+          <w:ilvl w:val="0"/>
+          <w:numId w:val="6"/>
+        </w:numPr>
+        <w:jc w:val="both"/>
+      </w:pPr>
+      <w:r>
+        <w:rPr>
+          <w:b/>
+          <w:bCs/>
+        </w:rPr>
+        <w:t xml:space="preserve">Top-1 = </w:t>
+      </w:r>
+      <w:r>
+        <w:rPr>
+          <w:b/>
+          <w:bCs/>
+        </w:rPr>
+        <w:t>0</w:t>
+      </w:r>
+      <w:r>
+        <w:t xml:space="preserve"> Em todas as etapas.</w:t>
+      </w:r>
+      <w:r>
+        <w:t xml:space="preserve"> </w:t>
+      </w:r>
+      <w:r>
+        <w:t>O batch pequeno explica a instabilidade do treino,</w:t>
+      </w:r>
+      <w:r>
+        <w:t xml:space="preserve"> </w:t>
+      </w:r>
+      <w:r>
+        <w:t>mas não explica</w:t>
+      </w:r>
+      <w:r>
+        <w:t xml:space="preserve"> o valor da validação. O mais provável é que exista algum erro no processo de validação propriamente dito, não no treino como um todo. Testes futuros vão permitir a solução desta incógnita.</w:t>
+      </w:r>
+      <w:r>
+        <w:t xml:space="preserve"> Se este for o caso, não é necessário preocupações por agora.</w:t>
+      </w:r>
+    </w:p>
+    <w:p>
+      <w:pPr>
+        <w:pStyle w:val="PargrafodaLista"/>
+        <w:jc w:val="both"/>
+        <w:rPr>
+          <w:b/>
+          <w:bCs/>
+        </w:rPr>
+      </w:pPr>
+    </w:p>
+    <w:p>
+      <w:pPr>
+        <w:pStyle w:val="PargrafodaLista"/>
+        <w:jc w:val="both"/>
+        <w:rPr>
+          <w:b/>
+          <w:bCs/>
+        </w:rPr>
+      </w:pPr>
+    </w:p>
+    <w:p>
+      <w:pPr>
+        <w:pStyle w:val="PargrafodaLista"/>
+        <w:jc w:val="both"/>
+        <w:rPr>
+          <w:b/>
+          <w:bCs/>
+        </w:rPr>
+      </w:pPr>
+    </w:p>
+    <w:p>
+      <w:pPr>
+        <w:pStyle w:val="PargrafodaLista"/>
+        <w:numPr>
+          <w:ilvl w:val="1"/>
+          <w:numId w:val="1"/>
+        </w:numPr>
+        <w:jc w:val="both"/>
+        <w:rPr>
+          <w:b/>
+          <w:bCs/>
+        </w:rPr>
+      </w:pPr>
+      <w:r>
+        <w:rPr>
+          <w:b/>
+          <w:bCs/>
+        </w:rPr>
+        <w:lastRenderedPageBreak/>
+        <w:t xml:space="preserve">Próximas etapas: </w:t>
+      </w:r>
+      <w:r>
+        <w:t>Não vale a pena</w:t>
+      </w:r>
+      <w:r>
+        <w:rPr>
+          <w:b/>
+          <w:bCs/>
+        </w:rPr>
+        <w:t xml:space="preserve"> </w:t>
+      </w:r>
+      <w:r>
+        <w:t>forçar uma</w:t>
+      </w:r>
+      <w:r>
+        <w:rPr>
+          <w:b/>
+          <w:bCs/>
+        </w:rPr>
+        <w:t xml:space="preserve"> </w:t>
+      </w:r>
+      <w:r>
+        <w:t xml:space="preserve">validação da </w:t>
+      </w:r>
+      <w:r>
+        <w:t>implementação sem que haja o cenário ideal para replicar os resultados. Uma vez que a implementação advém de um repositório confiável e ela foi testada em um ambiente também confiável, é justo assumir a confiabilidade da implementação, principalmente ao considerar o comportamento que a rede apresentou, mesmo em um cenário desfavorável.</w:t>
+      </w:r>
+    </w:p>
+    <w:p>
+      <w:pPr>
+        <w:pStyle w:val="PargrafodaLista"/>
+        <w:numPr>
+          <w:ilvl w:val="0"/>
+          <w:numId w:val="6"/>
+        </w:numPr>
+        <w:jc w:val="both"/>
+        <w:rPr>
+          <w:b/>
+          <w:bCs/>
+        </w:rPr>
+      </w:pPr>
+      <w:r>
+        <w:t>Os próximos testes conduzidos até o dia 20 serão focado</w:t>
+      </w:r>
+      <w:r>
+        <w:t>s</w:t>
+      </w:r>
+      <w:r>
+        <w:t xml:space="preserve"> em aplicar essa arquitetura à nossa base de dados e avaliar </w:t>
+      </w:r>
+      <w:r>
+        <w:t>seu</w:t>
+      </w:r>
+      <w:r>
+        <w:t xml:space="preserve"> comportamento</w:t>
+      </w:r>
+      <w:r>
+        <w:t xml:space="preserve"> em diferentes cenários.</w:t>
+      </w:r>
+    </w:p>
+    <w:p>
+      <w:pPr>
+        <w:pStyle w:val="PargrafodaLista"/>
+        <w:numPr>
+          <w:ilvl w:val="0"/>
+          <w:numId w:val="6"/>
+        </w:numPr>
+        <w:jc w:val="both"/>
+        <w:rPr>
+          <w:b/>
+          <w:bCs/>
+        </w:rPr>
+      </w:pPr>
+      <w:r>
+        <w:t>Podemos conduzir novos testes futuros para validar a rede, mas essa NÃO SERÁ A PRIORIDADE.</w:t>
+      </w:r>
+    </w:p>
+    <w:p>
+      <w:pPr>
+        <w:pStyle w:val="PargrafodaLista"/>
+        <w:numPr>
+          <w:ilvl w:val="0"/>
+          <w:numId w:val="6"/>
+        </w:numPr>
+        <w:jc w:val="both"/>
+        <w:rPr>
+          <w:b/>
+          <w:bCs/>
+        </w:rPr>
+      </w:pPr>
+      <w:r>
+        <w:t>O prazo está relativamente curto e se faz necessário otimizar o protocolo de experimentação para permitir a condução de novos testes e avaliações sem margem para perda de tempo.</w:t>
+      </w:r>
+    </w:p>
+    <w:p>
+      <w:pPr>
+        <w:pStyle w:val="PargrafodaLista"/>
+        <w:numPr>
+          <w:ilvl w:val="0"/>
+          <w:numId w:val="6"/>
+        </w:numPr>
+        <w:jc w:val="both"/>
+        <w:rPr>
+          <w:b/>
+          <w:bCs/>
+        </w:rPr>
+      </w:pPr>
+      <w:r>
+        <w:rPr>
+          <w:b/>
+          <w:bCs/>
+        </w:rPr>
+        <w:t>Futuramente é interessante otimizar e documentar melhor os códigos de validação das arquiteturas implementadas, garantindo um bom funcionamento para aplicações futuras.</w:t>
       </w:r>
     </w:p>
     <w:p>
@@ -1447,6 +3813,48 @@
           <w:ilvl w:val="0"/>
           <w:numId w:val="1"/>
         </w:numPr>
+        <w:rPr>
+          <w:b/>
+          <w:bCs/>
+        </w:rPr>
+      </w:pPr>
+      <w:r>
+        <w:rPr>
+          <w:b/>
+          <w:bCs/>
+        </w:rPr>
+        <w:t xml:space="preserve">EXPERIMENTO </w:t>
+      </w:r>
+      <w:r>
+        <w:rPr>
+          <w:b/>
+          <w:bCs/>
+        </w:rPr>
+        <w:t xml:space="preserve">C: </w:t>
+      </w:r>
+    </w:p>
+    <w:p>
+      <w:pPr>
+        <w:rPr>
+          <w:b/>
+          <w:bCs/>
+        </w:rPr>
+      </w:pPr>
+    </w:p>
+    <w:p>
+      <w:pPr>
+        <w:rPr>
+          <w:b/>
+          <w:bCs/>
+        </w:rPr>
+      </w:pPr>
+    </w:p>
+    <w:p>
+      <w:pPr>
+        <w:rPr>
+          <w:b/>
+          <w:bCs/>
+        </w:rPr>
       </w:pPr>
     </w:p>
     <w:sectPr>
@@ -1462,6 +3870,607 @@
 <file path=word/numbering.xml><?xml version="1.0" encoding="utf-8"?>
 <w:numbering xmlns:wpc="http://schemas.microsoft.com/office/word/2010/wordprocessingCanvas" xmlns:cx="http://schemas.microsoft.com/office/drawing/2014/chartex" xmlns:cx1="http://schemas.microsoft.com/office/drawing/2015/9/8/chartex" xmlns:cx2="http://schemas.microsoft.com/office/drawing/2015/10/21/chartex" xmlns:cx3="http://schemas.microsoft.com/office/drawing/2016/5/9/chartex" xmlns:cx4="http://schemas.microsoft.com/office/drawing/2016/5/10/chartex" xmlns:cx5="http://schemas.microsoft.com/office/drawing/2016/5/11/chartex" xmlns:cx6="http://schemas.microsoft.com/office/drawing/2016/5/12/chartex" xmlns:cx7="http://schemas.microsoft.com/office/drawing/2016/5/13/chartex" xmlns:cx8="http://schemas.microsoft.com/office/drawing/2016/5/14/chartex" xmlns:mc="http://schemas.openxmlformats.org/markup-compatibility/2006" xmlns:aink="http://schemas.microsoft.com/office/drawing/2016/ink" xmlns:am3d="http://schemas.microsoft.com/office/drawing/2017/model3d" xmlns:o="urn:schemas-microsoft-com:office:office" xmlns:oel="http://schemas.microsoft.com/office/2019/extlst" xmlns:r="http://schemas.openxmlformats.org/officeDocument/2006/relationships" xmlns:m="http://schemas.openxmlformats.org/officeDocument/2006/math" xmlns:v="urn:schemas-microsoft-com:vml" xmlns:wp14="http://schemas.microsoft.com/office/word/2010/wordprocessingDrawing" xmlns:wp="http://schemas.openxmlformats.org/drawingml/2006/wordprocessingDrawing" xmlns:w10="urn:schemas-microsoft-com:office:word" xmlns:w="http://schemas.openxmlformats.org/wordprocessingml/2006/main" xmlns:w14="http://schemas.microsoft.com/office/word/2010/wordml" xmlns:w15="http://schemas.microsoft.com/office/word/2012/wordml" xmlns:w16cex="http://schemas.microsoft.com/office/word/2018/wordml/cex" xmlns:w16cid="http://schemas.microsoft.com/office/word/2016/wordml/cid" xmlns:w16="http://schemas.microsoft.com/office/word/2018/wordml" xmlns:w16du="http://schemas.microsoft.com/office/word/2023/wordml/word16du" xmlns:w16sdtdh="http://schemas.microsoft.com/office/word/2020/wordml/sdtdatahash" xmlns:w16sdtfl="http://schemas.microsoft.com/office/word/2024/wordml/sdtformatlock" xmlns:w16se="http://schemas.microsoft.com/office/word/2015/wordml/symex" xmlns:wpg="http://schemas.microsoft.com/office/word/2010/wordprocessingGroup" xmlns:wpi="http://schemas.microsoft.com/office/word/2010/wordprocessingInk" xmlns:wne="http://schemas.microsoft.com/office/word/2006/wordml" xmlns:wps="http://schemas.microsoft.com/office/word/2010/wordprocessingShape" mc:Ignorable="w14 w15 w16se w16cid w16 w16cex w16sdtdh w16sdtfl w16du wp14">
   <w:abstractNum w:abstractNumId="0" w15:restartNumberingAfterBreak="0">
+    <w:nsid w:val="00B72263"/>
+    <w:multiLevelType w:val="hybridMultilevel"/>
+    <w:tmpl w:val="B49E8752"/>
+    <w:lvl w:ilvl="0" w:tplc="04160001">
+      <w:start w:val="1"/>
+      <w:numFmt w:val="bullet"/>
+      <w:lvlText w:val=""/>
+      <w:lvlJc w:val="left"/>
+      <w:pPr>
+        <w:ind w:left="2136" w:hanging="360"/>
+      </w:pPr>
+      <w:rPr>
+        <w:rFonts w:ascii="Symbol" w:hAnsi="Symbol" w:hint="default"/>
+      </w:rPr>
+    </w:lvl>
+    <w:lvl w:ilvl="1" w:tplc="04160003" w:tentative="1">
+      <w:start w:val="1"/>
+      <w:numFmt w:val="bullet"/>
+      <w:lvlText w:val="o"/>
+      <w:lvlJc w:val="left"/>
+      <w:pPr>
+        <w:ind w:left="2856" w:hanging="360"/>
+      </w:pPr>
+      <w:rPr>
+        <w:rFonts w:ascii="Courier New" w:hAnsi="Courier New" w:cs="Courier New" w:hint="default"/>
+      </w:rPr>
+    </w:lvl>
+    <w:lvl w:ilvl="2" w:tplc="04160005" w:tentative="1">
+      <w:start w:val="1"/>
+      <w:numFmt w:val="bullet"/>
+      <w:lvlText w:val=""/>
+      <w:lvlJc w:val="left"/>
+      <w:pPr>
+        <w:ind w:left="3576" w:hanging="360"/>
+      </w:pPr>
+      <w:rPr>
+        <w:rFonts w:ascii="Wingdings" w:hAnsi="Wingdings" w:hint="default"/>
+      </w:rPr>
+    </w:lvl>
+    <w:lvl w:ilvl="3" w:tplc="04160001" w:tentative="1">
+      <w:start w:val="1"/>
+      <w:numFmt w:val="bullet"/>
+      <w:lvlText w:val=""/>
+      <w:lvlJc w:val="left"/>
+      <w:pPr>
+        <w:ind w:left="4296" w:hanging="360"/>
+      </w:pPr>
+      <w:rPr>
+        <w:rFonts w:ascii="Symbol" w:hAnsi="Symbol" w:hint="default"/>
+      </w:rPr>
+    </w:lvl>
+    <w:lvl w:ilvl="4" w:tplc="04160003" w:tentative="1">
+      <w:start w:val="1"/>
+      <w:numFmt w:val="bullet"/>
+      <w:lvlText w:val="o"/>
+      <w:lvlJc w:val="left"/>
+      <w:pPr>
+        <w:ind w:left="5016" w:hanging="360"/>
+      </w:pPr>
+      <w:rPr>
+        <w:rFonts w:ascii="Courier New" w:hAnsi="Courier New" w:cs="Courier New" w:hint="default"/>
+      </w:rPr>
+    </w:lvl>
+    <w:lvl w:ilvl="5" w:tplc="04160005" w:tentative="1">
+      <w:start w:val="1"/>
+      <w:numFmt w:val="bullet"/>
+      <w:lvlText w:val=""/>
+      <w:lvlJc w:val="left"/>
+      <w:pPr>
+        <w:ind w:left="5736" w:hanging="360"/>
+      </w:pPr>
+      <w:rPr>
+        <w:rFonts w:ascii="Wingdings" w:hAnsi="Wingdings" w:hint="default"/>
+      </w:rPr>
+    </w:lvl>
+    <w:lvl w:ilvl="6" w:tplc="04160001" w:tentative="1">
+      <w:start w:val="1"/>
+      <w:numFmt w:val="bullet"/>
+      <w:lvlText w:val=""/>
+      <w:lvlJc w:val="left"/>
+      <w:pPr>
+        <w:ind w:left="6456" w:hanging="360"/>
+      </w:pPr>
+      <w:rPr>
+        <w:rFonts w:ascii="Symbol" w:hAnsi="Symbol" w:hint="default"/>
+      </w:rPr>
+    </w:lvl>
+    <w:lvl w:ilvl="7" w:tplc="04160003" w:tentative="1">
+      <w:start w:val="1"/>
+      <w:numFmt w:val="bullet"/>
+      <w:lvlText w:val="o"/>
+      <w:lvlJc w:val="left"/>
+      <w:pPr>
+        <w:ind w:left="7176" w:hanging="360"/>
+      </w:pPr>
+      <w:rPr>
+        <w:rFonts w:ascii="Courier New" w:hAnsi="Courier New" w:cs="Courier New" w:hint="default"/>
+      </w:rPr>
+    </w:lvl>
+    <w:lvl w:ilvl="8" w:tplc="04160005" w:tentative="1">
+      <w:start w:val="1"/>
+      <w:numFmt w:val="bullet"/>
+      <w:lvlText w:val=""/>
+      <w:lvlJc w:val="left"/>
+      <w:pPr>
+        <w:ind w:left="7896" w:hanging="360"/>
+      </w:pPr>
+      <w:rPr>
+        <w:rFonts w:ascii="Wingdings" w:hAnsi="Wingdings" w:hint="default"/>
+      </w:rPr>
+    </w:lvl>
+  </w:abstractNum>
+  <w:abstractNum w:abstractNumId="1" w15:restartNumberingAfterBreak="0">
+    <w:nsid w:val="011C3BB0"/>
+    <w:multiLevelType w:val="hybridMultilevel"/>
+    <w:tmpl w:val="FC0AB79A"/>
+    <w:lvl w:ilvl="0" w:tplc="04160001">
+      <w:start w:val="1"/>
+      <w:numFmt w:val="bullet"/>
+      <w:lvlText w:val=""/>
+      <w:lvlJc w:val="left"/>
+      <w:pPr>
+        <w:ind w:left="2160" w:hanging="360"/>
+      </w:pPr>
+      <w:rPr>
+        <w:rFonts w:ascii="Symbol" w:hAnsi="Symbol" w:hint="default"/>
+      </w:rPr>
+    </w:lvl>
+    <w:lvl w:ilvl="1" w:tplc="04160003" w:tentative="1">
+      <w:start w:val="1"/>
+      <w:numFmt w:val="bullet"/>
+      <w:lvlText w:val="o"/>
+      <w:lvlJc w:val="left"/>
+      <w:pPr>
+        <w:ind w:left="2880" w:hanging="360"/>
+      </w:pPr>
+      <w:rPr>
+        <w:rFonts w:ascii="Courier New" w:hAnsi="Courier New" w:cs="Courier New" w:hint="default"/>
+      </w:rPr>
+    </w:lvl>
+    <w:lvl w:ilvl="2" w:tplc="04160005" w:tentative="1">
+      <w:start w:val="1"/>
+      <w:numFmt w:val="bullet"/>
+      <w:lvlText w:val=""/>
+      <w:lvlJc w:val="left"/>
+      <w:pPr>
+        <w:ind w:left="3600" w:hanging="360"/>
+      </w:pPr>
+      <w:rPr>
+        <w:rFonts w:ascii="Wingdings" w:hAnsi="Wingdings" w:hint="default"/>
+      </w:rPr>
+    </w:lvl>
+    <w:lvl w:ilvl="3" w:tplc="04160001" w:tentative="1">
+      <w:start w:val="1"/>
+      <w:numFmt w:val="bullet"/>
+      <w:lvlText w:val=""/>
+      <w:lvlJc w:val="left"/>
+      <w:pPr>
+        <w:ind w:left="4320" w:hanging="360"/>
+      </w:pPr>
+      <w:rPr>
+        <w:rFonts w:ascii="Symbol" w:hAnsi="Symbol" w:hint="default"/>
+      </w:rPr>
+    </w:lvl>
+    <w:lvl w:ilvl="4" w:tplc="04160003" w:tentative="1">
+      <w:start w:val="1"/>
+      <w:numFmt w:val="bullet"/>
+      <w:lvlText w:val="o"/>
+      <w:lvlJc w:val="left"/>
+      <w:pPr>
+        <w:ind w:left="5040" w:hanging="360"/>
+      </w:pPr>
+      <w:rPr>
+        <w:rFonts w:ascii="Courier New" w:hAnsi="Courier New" w:cs="Courier New" w:hint="default"/>
+      </w:rPr>
+    </w:lvl>
+    <w:lvl w:ilvl="5" w:tplc="04160005" w:tentative="1">
+      <w:start w:val="1"/>
+      <w:numFmt w:val="bullet"/>
+      <w:lvlText w:val=""/>
+      <w:lvlJc w:val="left"/>
+      <w:pPr>
+        <w:ind w:left="5760" w:hanging="360"/>
+      </w:pPr>
+      <w:rPr>
+        <w:rFonts w:ascii="Wingdings" w:hAnsi="Wingdings" w:hint="default"/>
+      </w:rPr>
+    </w:lvl>
+    <w:lvl w:ilvl="6" w:tplc="04160001" w:tentative="1">
+      <w:start w:val="1"/>
+      <w:numFmt w:val="bullet"/>
+      <w:lvlText w:val=""/>
+      <w:lvlJc w:val="left"/>
+      <w:pPr>
+        <w:ind w:left="6480" w:hanging="360"/>
+      </w:pPr>
+      <w:rPr>
+        <w:rFonts w:ascii="Symbol" w:hAnsi="Symbol" w:hint="default"/>
+      </w:rPr>
+    </w:lvl>
+    <w:lvl w:ilvl="7" w:tplc="04160003" w:tentative="1">
+      <w:start w:val="1"/>
+      <w:numFmt w:val="bullet"/>
+      <w:lvlText w:val="o"/>
+      <w:lvlJc w:val="left"/>
+      <w:pPr>
+        <w:ind w:left="7200" w:hanging="360"/>
+      </w:pPr>
+      <w:rPr>
+        <w:rFonts w:ascii="Courier New" w:hAnsi="Courier New" w:cs="Courier New" w:hint="default"/>
+      </w:rPr>
+    </w:lvl>
+    <w:lvl w:ilvl="8" w:tplc="04160005" w:tentative="1">
+      <w:start w:val="1"/>
+      <w:numFmt w:val="bullet"/>
+      <w:lvlText w:val=""/>
+      <w:lvlJc w:val="left"/>
+      <w:pPr>
+        <w:ind w:left="7920" w:hanging="360"/>
+      </w:pPr>
+      <w:rPr>
+        <w:rFonts w:ascii="Wingdings" w:hAnsi="Wingdings" w:hint="default"/>
+      </w:rPr>
+    </w:lvl>
+  </w:abstractNum>
+  <w:abstractNum w:abstractNumId="2" w15:restartNumberingAfterBreak="0">
+    <w:nsid w:val="16015DE7"/>
+    <w:multiLevelType w:val="multilevel"/>
+    <w:tmpl w:val="5F48E62E"/>
+    <w:lvl w:ilvl="0">
+      <w:start w:val="1"/>
+      <w:numFmt w:val="bullet"/>
+      <w:lvlText w:val=""/>
+      <w:lvlJc w:val="left"/>
+      <w:pPr>
+        <w:tabs>
+          <w:tab w:val="num" w:pos="720"/>
+        </w:tabs>
+        <w:ind w:left="720" w:hanging="360"/>
+      </w:pPr>
+      <w:rPr>
+        <w:rFonts w:ascii="Symbol" w:hAnsi="Symbol" w:hint="default"/>
+        <w:sz w:val="20"/>
+      </w:rPr>
+    </w:lvl>
+    <w:lvl w:ilvl="1" w:tentative="1">
+      <w:start w:val="1"/>
+      <w:numFmt w:val="bullet"/>
+      <w:lvlText w:val="o"/>
+      <w:lvlJc w:val="left"/>
+      <w:pPr>
+        <w:tabs>
+          <w:tab w:val="num" w:pos="1440"/>
+        </w:tabs>
+        <w:ind w:left="1440" w:hanging="360"/>
+      </w:pPr>
+      <w:rPr>
+        <w:rFonts w:ascii="Courier New" w:hAnsi="Courier New" w:hint="default"/>
+        <w:sz w:val="20"/>
+      </w:rPr>
+    </w:lvl>
+    <w:lvl w:ilvl="2" w:tentative="1">
+      <w:start w:val="1"/>
+      <w:numFmt w:val="bullet"/>
+      <w:lvlText w:val=""/>
+      <w:lvlJc w:val="left"/>
+      <w:pPr>
+        <w:tabs>
+          <w:tab w:val="num" w:pos="2160"/>
+        </w:tabs>
+        <w:ind w:left="2160" w:hanging="360"/>
+      </w:pPr>
+      <w:rPr>
+        <w:rFonts w:ascii="Wingdings" w:hAnsi="Wingdings" w:hint="default"/>
+        <w:sz w:val="20"/>
+      </w:rPr>
+    </w:lvl>
+    <w:lvl w:ilvl="3" w:tentative="1">
+      <w:start w:val="1"/>
+      <w:numFmt w:val="bullet"/>
+      <w:lvlText w:val=""/>
+      <w:lvlJc w:val="left"/>
+      <w:pPr>
+        <w:tabs>
+          <w:tab w:val="num" w:pos="2880"/>
+        </w:tabs>
+        <w:ind w:left="2880" w:hanging="360"/>
+      </w:pPr>
+      <w:rPr>
+        <w:rFonts w:ascii="Wingdings" w:hAnsi="Wingdings" w:hint="default"/>
+        <w:sz w:val="20"/>
+      </w:rPr>
+    </w:lvl>
+    <w:lvl w:ilvl="4" w:tentative="1">
+      <w:start w:val="1"/>
+      <w:numFmt w:val="bullet"/>
+      <w:lvlText w:val=""/>
+      <w:lvlJc w:val="left"/>
+      <w:pPr>
+        <w:tabs>
+          <w:tab w:val="num" w:pos="3600"/>
+        </w:tabs>
+        <w:ind w:left="3600" w:hanging="360"/>
+      </w:pPr>
+      <w:rPr>
+        <w:rFonts w:ascii="Wingdings" w:hAnsi="Wingdings" w:hint="default"/>
+        <w:sz w:val="20"/>
+      </w:rPr>
+    </w:lvl>
+    <w:lvl w:ilvl="5" w:tentative="1">
+      <w:start w:val="1"/>
+      <w:numFmt w:val="bullet"/>
+      <w:lvlText w:val=""/>
+      <w:lvlJc w:val="left"/>
+      <w:pPr>
+        <w:tabs>
+          <w:tab w:val="num" w:pos="4320"/>
+        </w:tabs>
+        <w:ind w:left="4320" w:hanging="360"/>
+      </w:pPr>
+      <w:rPr>
+        <w:rFonts w:ascii="Wingdings" w:hAnsi="Wingdings" w:hint="default"/>
+        <w:sz w:val="20"/>
+      </w:rPr>
+    </w:lvl>
+    <w:lvl w:ilvl="6" w:tentative="1">
+      <w:start w:val="1"/>
+      <w:numFmt w:val="bullet"/>
+      <w:lvlText w:val=""/>
+      <w:lvlJc w:val="left"/>
+      <w:pPr>
+        <w:tabs>
+          <w:tab w:val="num" w:pos="5040"/>
+        </w:tabs>
+        <w:ind w:left="5040" w:hanging="360"/>
+      </w:pPr>
+      <w:rPr>
+        <w:rFonts w:ascii="Wingdings" w:hAnsi="Wingdings" w:hint="default"/>
+        <w:sz w:val="20"/>
+      </w:rPr>
+    </w:lvl>
+    <w:lvl w:ilvl="7" w:tentative="1">
+      <w:start w:val="1"/>
+      <w:numFmt w:val="bullet"/>
+      <w:lvlText w:val=""/>
+      <w:lvlJc w:val="left"/>
+      <w:pPr>
+        <w:tabs>
+          <w:tab w:val="num" w:pos="5760"/>
+        </w:tabs>
+        <w:ind w:left="5760" w:hanging="360"/>
+      </w:pPr>
+      <w:rPr>
+        <w:rFonts w:ascii="Wingdings" w:hAnsi="Wingdings" w:hint="default"/>
+        <w:sz w:val="20"/>
+      </w:rPr>
+    </w:lvl>
+    <w:lvl w:ilvl="8" w:tentative="1">
+      <w:start w:val="1"/>
+      <w:numFmt w:val="bullet"/>
+      <w:lvlText w:val=""/>
+      <w:lvlJc w:val="left"/>
+      <w:pPr>
+        <w:tabs>
+          <w:tab w:val="num" w:pos="6480"/>
+        </w:tabs>
+        <w:ind w:left="6480" w:hanging="360"/>
+      </w:pPr>
+      <w:rPr>
+        <w:rFonts w:ascii="Wingdings" w:hAnsi="Wingdings" w:hint="default"/>
+        <w:sz w:val="20"/>
+      </w:rPr>
+    </w:lvl>
+  </w:abstractNum>
+  <w:abstractNum w:abstractNumId="3" w15:restartNumberingAfterBreak="0">
+    <w:nsid w:val="257F3AFD"/>
+    <w:multiLevelType w:val="hybridMultilevel"/>
+    <w:tmpl w:val="1EC031A0"/>
+    <w:lvl w:ilvl="0" w:tplc="04160001">
+      <w:start w:val="1"/>
+      <w:numFmt w:val="bullet"/>
+      <w:lvlText w:val=""/>
+      <w:lvlJc w:val="left"/>
+      <w:pPr>
+        <w:ind w:left="2136" w:hanging="360"/>
+      </w:pPr>
+      <w:rPr>
+        <w:rFonts w:ascii="Symbol" w:hAnsi="Symbol" w:hint="default"/>
+      </w:rPr>
+    </w:lvl>
+    <w:lvl w:ilvl="1" w:tplc="04160003" w:tentative="1">
+      <w:start w:val="1"/>
+      <w:numFmt w:val="bullet"/>
+      <w:lvlText w:val="o"/>
+      <w:lvlJc w:val="left"/>
+      <w:pPr>
+        <w:ind w:left="2856" w:hanging="360"/>
+      </w:pPr>
+      <w:rPr>
+        <w:rFonts w:ascii="Courier New" w:hAnsi="Courier New" w:cs="Courier New" w:hint="default"/>
+      </w:rPr>
+    </w:lvl>
+    <w:lvl w:ilvl="2" w:tplc="04160005" w:tentative="1">
+      <w:start w:val="1"/>
+      <w:numFmt w:val="bullet"/>
+      <w:lvlText w:val=""/>
+      <w:lvlJc w:val="left"/>
+      <w:pPr>
+        <w:ind w:left="3576" w:hanging="360"/>
+      </w:pPr>
+      <w:rPr>
+        <w:rFonts w:ascii="Wingdings" w:hAnsi="Wingdings" w:hint="default"/>
+      </w:rPr>
+    </w:lvl>
+    <w:lvl w:ilvl="3" w:tplc="04160001" w:tentative="1">
+      <w:start w:val="1"/>
+      <w:numFmt w:val="bullet"/>
+      <w:lvlText w:val=""/>
+      <w:lvlJc w:val="left"/>
+      <w:pPr>
+        <w:ind w:left="4296" w:hanging="360"/>
+      </w:pPr>
+      <w:rPr>
+        <w:rFonts w:ascii="Symbol" w:hAnsi="Symbol" w:hint="default"/>
+      </w:rPr>
+    </w:lvl>
+    <w:lvl w:ilvl="4" w:tplc="04160003" w:tentative="1">
+      <w:start w:val="1"/>
+      <w:numFmt w:val="bullet"/>
+      <w:lvlText w:val="o"/>
+      <w:lvlJc w:val="left"/>
+      <w:pPr>
+        <w:ind w:left="5016" w:hanging="360"/>
+      </w:pPr>
+      <w:rPr>
+        <w:rFonts w:ascii="Courier New" w:hAnsi="Courier New" w:cs="Courier New" w:hint="default"/>
+      </w:rPr>
+    </w:lvl>
+    <w:lvl w:ilvl="5" w:tplc="04160005" w:tentative="1">
+      <w:start w:val="1"/>
+      <w:numFmt w:val="bullet"/>
+      <w:lvlText w:val=""/>
+      <w:lvlJc w:val="left"/>
+      <w:pPr>
+        <w:ind w:left="5736" w:hanging="360"/>
+      </w:pPr>
+      <w:rPr>
+        <w:rFonts w:ascii="Wingdings" w:hAnsi="Wingdings" w:hint="default"/>
+      </w:rPr>
+    </w:lvl>
+    <w:lvl w:ilvl="6" w:tplc="04160001" w:tentative="1">
+      <w:start w:val="1"/>
+      <w:numFmt w:val="bullet"/>
+      <w:lvlText w:val=""/>
+      <w:lvlJc w:val="left"/>
+      <w:pPr>
+        <w:ind w:left="6456" w:hanging="360"/>
+      </w:pPr>
+      <w:rPr>
+        <w:rFonts w:ascii="Symbol" w:hAnsi="Symbol" w:hint="default"/>
+      </w:rPr>
+    </w:lvl>
+    <w:lvl w:ilvl="7" w:tplc="04160003" w:tentative="1">
+      <w:start w:val="1"/>
+      <w:numFmt w:val="bullet"/>
+      <w:lvlText w:val="o"/>
+      <w:lvlJc w:val="left"/>
+      <w:pPr>
+        <w:ind w:left="7176" w:hanging="360"/>
+      </w:pPr>
+      <w:rPr>
+        <w:rFonts w:ascii="Courier New" w:hAnsi="Courier New" w:cs="Courier New" w:hint="default"/>
+      </w:rPr>
+    </w:lvl>
+    <w:lvl w:ilvl="8" w:tplc="04160005" w:tentative="1">
+      <w:start w:val="1"/>
+      <w:numFmt w:val="bullet"/>
+      <w:lvlText w:val=""/>
+      <w:lvlJc w:val="left"/>
+      <w:pPr>
+        <w:ind w:left="7896" w:hanging="360"/>
+      </w:pPr>
+      <w:rPr>
+        <w:rFonts w:ascii="Wingdings" w:hAnsi="Wingdings" w:hint="default"/>
+      </w:rPr>
+    </w:lvl>
+  </w:abstractNum>
+  <w:abstractNum w:abstractNumId="4" w15:restartNumberingAfterBreak="0">
+    <w:nsid w:val="47F12BC3"/>
+    <w:multiLevelType w:val="hybridMultilevel"/>
+    <w:tmpl w:val="0FA6ACEE"/>
+    <w:lvl w:ilvl="0" w:tplc="04160001">
+      <w:start w:val="1"/>
+      <w:numFmt w:val="bullet"/>
+      <w:lvlText w:val=""/>
+      <w:lvlJc w:val="left"/>
+      <w:pPr>
+        <w:ind w:left="2160" w:hanging="360"/>
+      </w:pPr>
+      <w:rPr>
+        <w:rFonts w:ascii="Symbol" w:hAnsi="Symbol" w:hint="default"/>
+      </w:rPr>
+    </w:lvl>
+    <w:lvl w:ilvl="1" w:tplc="04160003" w:tentative="1">
+      <w:start w:val="1"/>
+      <w:numFmt w:val="bullet"/>
+      <w:lvlText w:val="o"/>
+      <w:lvlJc w:val="left"/>
+      <w:pPr>
+        <w:ind w:left="2880" w:hanging="360"/>
+      </w:pPr>
+      <w:rPr>
+        <w:rFonts w:ascii="Courier New" w:hAnsi="Courier New" w:cs="Courier New" w:hint="default"/>
+      </w:rPr>
+    </w:lvl>
+    <w:lvl w:ilvl="2" w:tplc="04160005" w:tentative="1">
+      <w:start w:val="1"/>
+      <w:numFmt w:val="bullet"/>
+      <w:lvlText w:val=""/>
+      <w:lvlJc w:val="left"/>
+      <w:pPr>
+        <w:ind w:left="3600" w:hanging="360"/>
+      </w:pPr>
+      <w:rPr>
+        <w:rFonts w:ascii="Wingdings" w:hAnsi="Wingdings" w:hint="default"/>
+      </w:rPr>
+    </w:lvl>
+    <w:lvl w:ilvl="3" w:tplc="04160001" w:tentative="1">
+      <w:start w:val="1"/>
+      <w:numFmt w:val="bullet"/>
+      <w:lvlText w:val=""/>
+      <w:lvlJc w:val="left"/>
+      <w:pPr>
+        <w:ind w:left="4320" w:hanging="360"/>
+      </w:pPr>
+      <w:rPr>
+        <w:rFonts w:ascii="Symbol" w:hAnsi="Symbol" w:hint="default"/>
+      </w:rPr>
+    </w:lvl>
+    <w:lvl w:ilvl="4" w:tplc="04160003" w:tentative="1">
+      <w:start w:val="1"/>
+      <w:numFmt w:val="bullet"/>
+      <w:lvlText w:val="o"/>
+      <w:lvlJc w:val="left"/>
+      <w:pPr>
+        <w:ind w:left="5040" w:hanging="360"/>
+      </w:pPr>
+      <w:rPr>
+        <w:rFonts w:ascii="Courier New" w:hAnsi="Courier New" w:cs="Courier New" w:hint="default"/>
+      </w:rPr>
+    </w:lvl>
+    <w:lvl w:ilvl="5" w:tplc="04160005" w:tentative="1">
+      <w:start w:val="1"/>
+      <w:numFmt w:val="bullet"/>
+      <w:lvlText w:val=""/>
+      <w:lvlJc w:val="left"/>
+      <w:pPr>
+        <w:ind w:left="5760" w:hanging="360"/>
+      </w:pPr>
+      <w:rPr>
+        <w:rFonts w:ascii="Wingdings" w:hAnsi="Wingdings" w:hint="default"/>
+      </w:rPr>
+    </w:lvl>
+    <w:lvl w:ilvl="6" w:tplc="04160001" w:tentative="1">
+      <w:start w:val="1"/>
+      <w:numFmt w:val="bullet"/>
+      <w:lvlText w:val=""/>
+      <w:lvlJc w:val="left"/>
+      <w:pPr>
+        <w:ind w:left="6480" w:hanging="360"/>
+      </w:pPr>
+      <w:rPr>
+        <w:rFonts w:ascii="Symbol" w:hAnsi="Symbol" w:hint="default"/>
+      </w:rPr>
+    </w:lvl>
+    <w:lvl w:ilvl="7" w:tplc="04160003" w:tentative="1">
+      <w:start w:val="1"/>
+      <w:numFmt w:val="bullet"/>
+      <w:lvlText w:val="o"/>
+      <w:lvlJc w:val="left"/>
+      <w:pPr>
+        <w:ind w:left="7200" w:hanging="360"/>
+      </w:pPr>
+      <w:rPr>
+        <w:rFonts w:ascii="Courier New" w:hAnsi="Courier New" w:cs="Courier New" w:hint="default"/>
+      </w:rPr>
+    </w:lvl>
+    <w:lvl w:ilvl="8" w:tplc="04160005" w:tentative="1">
+      <w:start w:val="1"/>
+      <w:numFmt w:val="bullet"/>
+      <w:lvlText w:val=""/>
+      <w:lvlJc w:val="left"/>
+      <w:pPr>
+        <w:ind w:left="7920" w:hanging="360"/>
+      </w:pPr>
+      <w:rPr>
+        <w:rFonts w:ascii="Wingdings" w:hAnsi="Wingdings" w:hint="default"/>
+      </w:rPr>
+    </w:lvl>
+  </w:abstractNum>
+  <w:abstractNum w:abstractNumId="5" w15:restartNumberingAfterBreak="0">
     <w:nsid w:val="5115667A"/>
     <w:multiLevelType w:val="hybridMultilevel"/>
     <w:tmpl w:val="1FEC283C"/>
@@ -1574,10 +4583,10 @@
       </w:rPr>
     </w:lvl>
   </w:abstractNum>
-  <w:abstractNum w:abstractNumId="1" w15:restartNumberingAfterBreak="0">
+  <w:abstractNum w:abstractNumId="6" w15:restartNumberingAfterBreak="0">
     <w:nsid w:val="5796665F"/>
     <w:multiLevelType w:val="hybridMultilevel"/>
-    <w:tmpl w:val="4FA27FDA"/>
+    <w:tmpl w:val="A210AEAC"/>
     <w:lvl w:ilvl="0" w:tplc="0416000F">
       <w:start w:val="1"/>
       <w:numFmt w:val="decimal"/>
@@ -1587,7 +4596,7 @@
         <w:ind w:left="720" w:hanging="360"/>
       </w:pPr>
     </w:lvl>
-    <w:lvl w:ilvl="1" w:tplc="04160019" w:tentative="1">
+    <w:lvl w:ilvl="1" w:tplc="04160019">
       <w:start w:val="1"/>
       <w:numFmt w:val="lowerLetter"/>
       <w:lvlText w:val="%2."/>
@@ -1596,16 +4605,19 @@
         <w:ind w:left="1440" w:hanging="360"/>
       </w:pPr>
     </w:lvl>
-    <w:lvl w:ilvl="2" w:tplc="0416001B" w:tentative="1">
-      <w:start w:val="1"/>
-      <w:numFmt w:val="lowerRoman"/>
-      <w:lvlText w:val="%3."/>
-      <w:lvlJc w:val="right"/>
-      <w:pPr>
-        <w:ind w:left="2160" w:hanging="180"/>
-      </w:pPr>
-    </w:lvl>
-    <w:lvl w:ilvl="3" w:tplc="0416000F" w:tentative="1">
+    <w:lvl w:ilvl="2" w:tplc="04160001">
+      <w:start w:val="1"/>
+      <w:numFmt w:val="bullet"/>
+      <w:lvlText w:val=""/>
+      <w:lvlJc w:val="left"/>
+      <w:pPr>
+        <w:ind w:left="1440" w:hanging="360"/>
+      </w:pPr>
+      <w:rPr>
+        <w:rFonts w:ascii="Symbol" w:hAnsi="Symbol" w:hint="default"/>
+      </w:rPr>
+    </w:lvl>
+    <w:lvl w:ilvl="3" w:tplc="0416000F">
       <w:start w:val="1"/>
       <w:numFmt w:val="decimal"/>
       <w:lvlText w:val="%4."/>
@@ -1660,11 +4672,142 @@
       </w:pPr>
     </w:lvl>
   </w:abstractNum>
+  <w:abstractNum w:abstractNumId="7" w15:restartNumberingAfterBreak="0">
+    <w:nsid w:val="7CB32D06"/>
+    <w:multiLevelType w:val="hybridMultilevel"/>
+    <w:tmpl w:val="06D44BFE"/>
+    <w:lvl w:ilvl="0" w:tplc="04160001">
+      <w:start w:val="1"/>
+      <w:numFmt w:val="bullet"/>
+      <w:lvlText w:val=""/>
+      <w:lvlJc w:val="left"/>
+      <w:pPr>
+        <w:ind w:left="2136" w:hanging="360"/>
+      </w:pPr>
+      <w:rPr>
+        <w:rFonts w:ascii="Symbol" w:hAnsi="Symbol" w:hint="default"/>
+      </w:rPr>
+    </w:lvl>
+    <w:lvl w:ilvl="1" w:tplc="04160003" w:tentative="1">
+      <w:start w:val="1"/>
+      <w:numFmt w:val="bullet"/>
+      <w:lvlText w:val="o"/>
+      <w:lvlJc w:val="left"/>
+      <w:pPr>
+        <w:ind w:left="2856" w:hanging="360"/>
+      </w:pPr>
+      <w:rPr>
+        <w:rFonts w:ascii="Courier New" w:hAnsi="Courier New" w:cs="Courier New" w:hint="default"/>
+      </w:rPr>
+    </w:lvl>
+    <w:lvl w:ilvl="2" w:tplc="04160005" w:tentative="1">
+      <w:start w:val="1"/>
+      <w:numFmt w:val="bullet"/>
+      <w:lvlText w:val=""/>
+      <w:lvlJc w:val="left"/>
+      <w:pPr>
+        <w:ind w:left="3576" w:hanging="360"/>
+      </w:pPr>
+      <w:rPr>
+        <w:rFonts w:ascii="Wingdings" w:hAnsi="Wingdings" w:hint="default"/>
+      </w:rPr>
+    </w:lvl>
+    <w:lvl w:ilvl="3" w:tplc="04160001" w:tentative="1">
+      <w:start w:val="1"/>
+      <w:numFmt w:val="bullet"/>
+      <w:lvlText w:val=""/>
+      <w:lvlJc w:val="left"/>
+      <w:pPr>
+        <w:ind w:left="4296" w:hanging="360"/>
+      </w:pPr>
+      <w:rPr>
+        <w:rFonts w:ascii="Symbol" w:hAnsi="Symbol" w:hint="default"/>
+      </w:rPr>
+    </w:lvl>
+    <w:lvl w:ilvl="4" w:tplc="04160003" w:tentative="1">
+      <w:start w:val="1"/>
+      <w:numFmt w:val="bullet"/>
+      <w:lvlText w:val="o"/>
+      <w:lvlJc w:val="left"/>
+      <w:pPr>
+        <w:ind w:left="5016" w:hanging="360"/>
+      </w:pPr>
+      <w:rPr>
+        <w:rFonts w:ascii="Courier New" w:hAnsi="Courier New" w:cs="Courier New" w:hint="default"/>
+      </w:rPr>
+    </w:lvl>
+    <w:lvl w:ilvl="5" w:tplc="04160005" w:tentative="1">
+      <w:start w:val="1"/>
+      <w:numFmt w:val="bullet"/>
+      <w:lvlText w:val=""/>
+      <w:lvlJc w:val="left"/>
+      <w:pPr>
+        <w:ind w:left="5736" w:hanging="360"/>
+      </w:pPr>
+      <w:rPr>
+        <w:rFonts w:ascii="Wingdings" w:hAnsi="Wingdings" w:hint="default"/>
+      </w:rPr>
+    </w:lvl>
+    <w:lvl w:ilvl="6" w:tplc="04160001" w:tentative="1">
+      <w:start w:val="1"/>
+      <w:numFmt w:val="bullet"/>
+      <w:lvlText w:val=""/>
+      <w:lvlJc w:val="left"/>
+      <w:pPr>
+        <w:ind w:left="6456" w:hanging="360"/>
+      </w:pPr>
+      <w:rPr>
+        <w:rFonts w:ascii="Symbol" w:hAnsi="Symbol" w:hint="default"/>
+      </w:rPr>
+    </w:lvl>
+    <w:lvl w:ilvl="7" w:tplc="04160003" w:tentative="1">
+      <w:start w:val="1"/>
+      <w:numFmt w:val="bullet"/>
+      <w:lvlText w:val="o"/>
+      <w:lvlJc w:val="left"/>
+      <w:pPr>
+        <w:ind w:left="7176" w:hanging="360"/>
+      </w:pPr>
+      <w:rPr>
+        <w:rFonts w:ascii="Courier New" w:hAnsi="Courier New" w:cs="Courier New" w:hint="default"/>
+      </w:rPr>
+    </w:lvl>
+    <w:lvl w:ilvl="8" w:tplc="04160005" w:tentative="1">
+      <w:start w:val="1"/>
+      <w:numFmt w:val="bullet"/>
+      <w:lvlText w:val=""/>
+      <w:lvlJc w:val="left"/>
+      <w:pPr>
+        <w:ind w:left="7896" w:hanging="360"/>
+      </w:pPr>
+      <w:rPr>
+        <w:rFonts w:ascii="Wingdings" w:hAnsi="Wingdings" w:hint="default"/>
+      </w:rPr>
+    </w:lvl>
+  </w:abstractNum>
   <w:num w:numId="1" w16cid:durableId="1615208601">
+    <w:abstractNumId w:val="6"/>
+  </w:num>
+  <w:num w:numId="2" w16cid:durableId="1097402540">
+    <w:abstractNumId w:val="5"/>
+  </w:num>
+  <w:num w:numId="3" w16cid:durableId="170608834">
     <w:abstractNumId w:val="1"/>
   </w:num>
-  <w:num w:numId="2" w16cid:durableId="1097402540">
+  <w:num w:numId="4" w16cid:durableId="1548687179">
+    <w:abstractNumId w:val="4"/>
+  </w:num>
+  <w:num w:numId="5" w16cid:durableId="1836650803">
     <w:abstractNumId w:val="0"/>
+  </w:num>
+  <w:num w:numId="6" w16cid:durableId="543980649">
+    <w:abstractNumId w:val="3"/>
+  </w:num>
+  <w:num w:numId="7" w16cid:durableId="731393186">
+    <w:abstractNumId w:val="7"/>
+  </w:num>
+  <w:num w:numId="8" w16cid:durableId="105393592">
+    <w:abstractNumId w:val="2"/>
   </w:num>
 </w:numbering>
 </file>
@@ -2272,7 +5415,6 @@
   <w:style w:type="character" w:default="1" w:styleId="Fontepargpadro">
     <w:name w:val="Default Paragraph Font"/>
     <w:uiPriority w:val="1"/>
-    <w:semiHidden/>
     <w:unhideWhenUsed/>
   </w:style>
   <w:style w:type="table" w:default="1" w:styleId="Tabelanormal">

</xml_diff>